<commit_message>
Aggiunta sezione 2. HTML
</commit_message>
<xml_diff>
--- a/Workspace/Tec Web.docx
+++ b/Workspace/Tec Web.docx
@@ -385,7 +385,7 @@
           <w:r>
             <w:fldChar w:fldCharType="separate"/>
           </w:r>
-          <w:hyperlink w:anchor="_Toc227592154" w:history="1">
+          <w:hyperlink w:anchor="_Toc227706883" w:history="1">
             <w:r>
               <w:rPr>
                 <w:rStyle w:val="Collegamentoipertestuale"/>
@@ -412,7 +412,7 @@
                 <w:noProof/>
                 <w:webHidden/>
               </w:rPr>
-              <w:instrText xml:space="preserve"> PAGEREF _Toc227592154 \h </w:instrText>
+              <w:instrText xml:space="preserve"> PAGEREF _Toc227706883 \h </w:instrText>
             </w:r>
             <w:r>
               <w:rPr>
@@ -456,7 +456,7 @@
               <w:lang w:eastAsia="ja-JP"/>
             </w:rPr>
           </w:pPr>
-          <w:hyperlink w:anchor="_Toc227592155" w:history="1">
+          <w:hyperlink w:anchor="_Toc227706884" w:history="1">
             <w:r>
               <w:rPr>
                 <w:rStyle w:val="Collegamentoipertestuale"/>
@@ -483,7 +483,7 @@
                 <w:noProof/>
                 <w:webHidden/>
               </w:rPr>
-              <w:instrText xml:space="preserve"> PAGEREF _Toc227592155 \h </w:instrText>
+              <w:instrText xml:space="preserve"> PAGEREF _Toc227706884 \h </w:instrText>
             </w:r>
             <w:r>
               <w:rPr>
@@ -527,7 +527,7 @@
               <w:lang w:eastAsia="ja-JP"/>
             </w:rPr>
           </w:pPr>
-          <w:hyperlink w:anchor="_Toc227592156" w:history="1">
+          <w:hyperlink w:anchor="_Toc227706885" w:history="1">
             <w:r>
               <w:rPr>
                 <w:rStyle w:val="Collegamentoipertestuale"/>
@@ -554,7 +554,7 @@
                 <w:noProof/>
                 <w:webHidden/>
               </w:rPr>
-              <w:instrText xml:space="preserve"> PAGEREF _Toc227592156 \h </w:instrText>
+              <w:instrText xml:space="preserve"> PAGEREF _Toc227706885 \h </w:instrText>
             </w:r>
             <w:r>
               <w:rPr>
@@ -598,7 +598,7 @@
               <w:lang w:eastAsia="ja-JP"/>
             </w:rPr>
           </w:pPr>
-          <w:hyperlink w:anchor="_Toc227592157" w:history="1">
+          <w:hyperlink w:anchor="_Toc227706886" w:history="1">
             <w:r>
               <w:rPr>
                 <w:rStyle w:val="Collegamentoipertestuale"/>
@@ -625,7 +625,7 @@
                 <w:noProof/>
                 <w:webHidden/>
               </w:rPr>
-              <w:instrText xml:space="preserve"> PAGEREF _Toc227592157 \h </w:instrText>
+              <w:instrText xml:space="preserve"> PAGEREF _Toc227706886 \h </w:instrText>
             </w:r>
             <w:r>
               <w:rPr>
@@ -669,7 +669,7 @@
               <w:lang w:eastAsia="ja-JP"/>
             </w:rPr>
           </w:pPr>
-          <w:hyperlink w:anchor="_Toc227592158" w:history="1">
+          <w:hyperlink w:anchor="_Toc227706887" w:history="1">
             <w:r>
               <w:rPr>
                 <w:rStyle w:val="Collegamentoipertestuale"/>
@@ -697,7 +697,7 @@
                 <w:noProof/>
                 <w:webHidden/>
               </w:rPr>
-              <w:instrText xml:space="preserve"> PAGEREF _Toc227592158 \h </w:instrText>
+              <w:instrText xml:space="preserve"> PAGEREF _Toc227706887 \h </w:instrText>
             </w:r>
             <w:r>
               <w:rPr>
@@ -741,7 +741,7 @@
               <w:lang w:eastAsia="ja-JP"/>
             </w:rPr>
           </w:pPr>
-          <w:hyperlink w:anchor="_Toc227592159" w:history="1">
+          <w:hyperlink w:anchor="_Toc227706888" w:history="1">
             <w:r>
               <w:rPr>
                 <w:rStyle w:val="Collegamentoipertestuale"/>
@@ -768,7 +768,7 @@
                 <w:noProof/>
                 <w:webHidden/>
               </w:rPr>
-              <w:instrText xml:space="preserve"> PAGEREF _Toc227592159 \h </w:instrText>
+              <w:instrText xml:space="preserve"> PAGEREF _Toc227706888 \h </w:instrText>
             </w:r>
             <w:r>
               <w:rPr>
@@ -812,7 +812,7 @@
               <w:lang w:eastAsia="ja-JP"/>
             </w:rPr>
           </w:pPr>
-          <w:hyperlink w:anchor="_Toc227592160" w:history="1">
+          <w:hyperlink w:anchor="_Toc227706889" w:history="1">
             <w:r>
               <w:rPr>
                 <w:rStyle w:val="Collegamentoipertestuale"/>
@@ -839,7 +839,7 @@
                 <w:noProof/>
                 <w:webHidden/>
               </w:rPr>
-              <w:instrText xml:space="preserve"> PAGEREF _Toc227592160 \h </w:instrText>
+              <w:instrText xml:space="preserve"> PAGEREF _Toc227706889 \h </w:instrText>
             </w:r>
             <w:r>
               <w:rPr>
@@ -883,7 +883,7 @@
               <w:lang w:eastAsia="ja-JP"/>
             </w:rPr>
           </w:pPr>
-          <w:hyperlink w:anchor="_Toc227592161" w:history="1">
+          <w:hyperlink w:anchor="_Toc227706890" w:history="1">
             <w:r>
               <w:rPr>
                 <w:rStyle w:val="Collegamentoipertestuale"/>
@@ -910,7 +910,7 @@
                 <w:noProof/>
                 <w:webHidden/>
               </w:rPr>
-              <w:instrText xml:space="preserve"> PAGEREF _Toc227592161 \h </w:instrText>
+              <w:instrText xml:space="preserve"> PAGEREF _Toc227706890 \h </w:instrText>
             </w:r>
             <w:r>
               <w:rPr>
@@ -954,12 +954,11 @@
               <w:lang w:eastAsia="ja-JP"/>
             </w:rPr>
           </w:pPr>
-          <w:hyperlink w:anchor="_Toc227592162" w:history="1">
+          <w:hyperlink w:anchor="_Toc227706891" w:history="1">
             <w:r>
               <w:rPr>
                 <w:rStyle w:val="Collegamentoipertestuale"/>
                 <w:noProof/>
-                <w:lang w:val="en-GB"/>
               </w:rPr>
               <w:t>2. HTML (HyperText Markup Language)</w:t>
             </w:r>
@@ -982,7 +981,7 @@
                 <w:noProof/>
                 <w:webHidden/>
               </w:rPr>
-              <w:instrText xml:space="preserve"> PAGEREF _Toc227592162 \h </w:instrText>
+              <w:instrText xml:space="preserve"> PAGEREF _Toc227706891 \h </w:instrText>
             </w:r>
             <w:r>
               <w:rPr>
@@ -1003,6 +1002,77 @@
                 <w:webHidden/>
               </w:rPr>
               <w:t>5</w:t>
+            </w:r>
+            <w:r>
+              <w:rPr>
+                <w:noProof/>
+                <w:webHidden/>
+              </w:rPr>
+              <w:fldChar w:fldCharType="end"/>
+            </w:r>
+          </w:hyperlink>
+        </w:p>
+        <w:p>
+          <w:pPr>
+            <w:pStyle w:val="Sommario2"/>
+            <w:tabs>
+              <w:tab w:val="right" w:leader="dot" w:pos="9628"/>
+            </w:tabs>
+            <w:rPr>
+              <w:rFonts w:eastAsiaTheme="minorEastAsia"/>
+              <w:noProof/>
+              <w:szCs w:val="24"/>
+              <w:lang w:eastAsia="ja-JP"/>
+            </w:rPr>
+          </w:pPr>
+          <w:hyperlink w:anchor="_Toc227706892" w:history="1">
+            <w:r>
+              <w:rPr>
+                <w:rStyle w:val="Collegamentoipertestuale"/>
+                <w:noProof/>
+              </w:rPr>
+              <w:t>2.1 Semantica dei Tag</w:t>
+            </w:r>
+            <w:r>
+              <w:rPr>
+                <w:noProof/>
+                <w:webHidden/>
+              </w:rPr>
+              <w:tab/>
+            </w:r>
+            <w:r>
+              <w:rPr>
+                <w:noProof/>
+                <w:webHidden/>
+              </w:rPr>
+              <w:fldChar w:fldCharType="begin"/>
+            </w:r>
+            <w:r>
+              <w:rPr>
+                <w:noProof/>
+                <w:webHidden/>
+              </w:rPr>
+              <w:instrText xml:space="preserve"> PAGEREF _Toc227706892 \h </w:instrText>
+            </w:r>
+            <w:r>
+              <w:rPr>
+                <w:noProof/>
+                <w:webHidden/>
+              </w:rPr>
+            </w:r>
+            <w:r>
+              <w:rPr>
+                <w:noProof/>
+                <w:webHidden/>
+              </w:rPr>
+              <w:fldChar w:fldCharType="separate"/>
+            </w:r>
+            <w:r>
+              <w:rPr>
+                <w:noProof/>
+                <w:webHidden/>
+              </w:rPr>
+              <w:t>6</w:t>
             </w:r>
             <w:r>
               <w:rPr>
@@ -1035,7 +1105,7 @@
       <w:pPr>
         <w:pStyle w:val="Titolo1"/>
       </w:pPr>
-      <w:bookmarkStart w:id="0" w:name="_Toc227592154"/>
+      <w:bookmarkStart w:id="0" w:name="_Toc227706883"/>
       <w:r>
         <w:lastRenderedPageBreak/>
         <w:t>0. Premessa</w:t>
@@ -1200,7 +1270,7 @@
       <w:pPr>
         <w:pStyle w:val="Titolo2"/>
       </w:pPr>
-      <w:bookmarkStart w:id="1" w:name="_Toc227592155"/>
+      <w:bookmarkStart w:id="1" w:name="_Toc227706884"/>
       <w:r>
         <w:t xml:space="preserve">0.1 </w:t>
       </w:r>
@@ -1391,7 +1461,7 @@
       <w:pPr>
         <w:pStyle w:val="Titolo2"/>
       </w:pPr>
-      <w:bookmarkStart w:id="2" w:name="_Toc227592156"/>
+      <w:bookmarkStart w:id="2" w:name="_Toc227706885"/>
       <w:r>
         <w:t>0.2 Collaboratori</w:t>
       </w:r>
@@ -1406,24 +1476,6 @@
           <w:szCs w:val="20"/>
         </w:rPr>
         <w:t xml:space="preserve">Tale documento è stato scritto dallo studente </w:t>
-      </w:r>
-      <w:r>
-        <w:rPr>
-          <w:rStyle w:val="Riferimentodelicato"/>
-          <w:smallCaps w:val="0"/>
-          <w:color w:val="auto"/>
-          <w:szCs w:val="20"/>
-        </w:rPr>
-        <w:t>Giovanni Adamo</w:t>
-      </w:r>
-      <w:r>
-        <w:rPr>
-          <w:rStyle w:val="Riferimentodelicato"/>
-          <w:smallCaps w:val="0"/>
-          <w:color w:val="auto"/>
-          <w:szCs w:val="20"/>
-        </w:rPr>
-        <w:t>, iscritto al CDL in Informatica presso l’</w:t>
       </w:r>
       <w:r>
         <w:rPr>
@@ -1434,7 +1486,16 @@
           <w:color w:val="auto"/>
           <w:szCs w:val="20"/>
         </w:rPr>
-        <w:t>Università degli Studi di Napoli Federico II.</w:t>
+        <w:t>Giovanni Adamo</w:t>
+      </w:r>
+      <w:r>
+        <w:rPr>
+          <w:rStyle w:val="Riferimentodelicato"/>
+          <w:smallCaps w:val="0"/>
+          <w:color w:val="auto"/>
+          <w:szCs w:val="20"/>
+        </w:rPr>
+        <w:t>, iscritto al CDL in Informatica presso l’</w:t>
       </w:r>
       <w:r>
         <w:rPr>
@@ -1445,6 +1506,17 @@
           <w:color w:val="auto"/>
           <w:szCs w:val="20"/>
         </w:rPr>
+        <w:t>Università degli Studi di Napoli Federico II.</w:t>
+      </w:r>
+      <w:r>
+        <w:rPr>
+          <w:rStyle w:val="Riferimentodelicato"/>
+          <w:i/>
+          <w:iCs/>
+          <w:smallCaps w:val="0"/>
+          <w:color w:val="auto"/>
+          <w:szCs w:val="20"/>
+        </w:rPr>
         <w:t xml:space="preserve"> </w:t>
       </w:r>
       <w:r>
@@ -1459,6 +1531,8 @@
       <w:r>
         <w:rPr>
           <w:rStyle w:val="Riferimentodelicato"/>
+          <w:i/>
+          <w:iCs/>
           <w:smallCaps w:val="0"/>
           <w:color w:val="auto"/>
           <w:szCs w:val="20"/>
@@ -1479,7 +1553,7 @@
       <w:pPr>
         <w:pStyle w:val="Titolo2"/>
       </w:pPr>
-      <w:bookmarkStart w:id="3" w:name="_Toc227592157"/>
+      <w:bookmarkStart w:id="3" w:name="_Toc227706886"/>
       <w:r>
         <w:t>0.</w:t>
       </w:r>
@@ -1622,7 +1696,7 @@
           <w:lang w:val="en-GB"/>
         </w:rPr>
       </w:pPr>
-      <w:bookmarkStart w:id="4" w:name="_Toc227592158"/>
+      <w:bookmarkStart w:id="4" w:name="_Toc227706887"/>
       <w:r>
         <w:rPr>
           <w:lang w:val="en-GB"/>
@@ -1656,10 +1730,12 @@
       <w:tblGrid>
         <w:gridCol w:w="1560"/>
         <w:gridCol w:w="1984"/>
-        <w:gridCol w:w="2874"/>
-        <w:gridCol w:w="3210"/>
+        <w:gridCol w:w="6084"/>
       </w:tblGrid>
       <w:tr>
+        <w:trPr>
+          <w:trHeight w:val="397"/>
+        </w:trPr>
         <w:tc>
           <w:tcPr>
             <w:tcW w:w="1560" w:type="dxa"/>
@@ -1687,7 +1763,6 @@
         <w:tc>
           <w:tcPr>
             <w:tcW w:w="6084" w:type="dxa"/>
-            <w:gridSpan w:val="2"/>
             <w:shd w:val="clear" w:color="auto" w:fill="D9D9D9" w:themeFill="background1" w:themeFillShade="D9"/>
             <w:vAlign w:val="center"/>
           </w:tcPr>
@@ -1724,14 +1799,21 @@
                 <w:i/>
                 <w:iCs/>
               </w:rPr>
-              <w:t>pubblicazione completa</w:t>
+              <w:t>release del documento</w:t>
             </w:r>
             <w:r>
               <w:rPr>
                 <w:i/>
                 <w:iCs/>
               </w:rPr>
-              <w:t xml:space="preserve"> del documento</w:t>
+              <w:t xml:space="preserve"> </w:t>
+            </w:r>
+            <w:r>
+              <w:rPr>
+                <w:i/>
+                <w:iCs/>
+              </w:rPr>
+              <w:t>completo</w:t>
             </w:r>
             <w:r>
               <w:rPr>
@@ -1744,6 +1826,9 @@
         </w:tc>
       </w:tr>
       <w:tr>
+        <w:trPr>
+          <w:trHeight w:val="397"/>
+        </w:trPr>
         <w:tc>
           <w:tcPr>
             <w:tcW w:w="1560" w:type="dxa"/>
@@ -1752,14 +1837,13 @@
         </w:tc>
         <w:tc>
           <w:tcPr>
-            <w:tcW w:w="4858" w:type="dxa"/>
-            <w:gridSpan w:val="2"/>
+            <w:tcW w:w="1984" w:type="dxa"/>
           </w:tcPr>
           <w:p/>
         </w:tc>
         <w:tc>
           <w:tcPr>
-            <w:tcW w:w="3210" w:type="dxa"/>
+            <w:tcW w:w="6084" w:type="dxa"/>
           </w:tcPr>
           <w:p/>
         </w:tc>
@@ -1775,7 +1859,7 @@
       <w:pPr>
         <w:pStyle w:val="Titolo1"/>
       </w:pPr>
-      <w:bookmarkStart w:id="5" w:name="_Toc227592159"/>
+      <w:bookmarkStart w:id="5" w:name="_Toc227706888"/>
       <w:r>
         <w:lastRenderedPageBreak/>
         <w:t>1. Introduzione</w:t>
@@ -2190,7 +2274,7 @@
       <w:pPr>
         <w:pStyle w:val="Titolo2"/>
       </w:pPr>
-      <w:bookmarkStart w:id="6" w:name="_Toc227592160"/>
+      <w:bookmarkStart w:id="6" w:name="_Toc227706889"/>
       <w:r>
         <w:t>1.1 HTTP (HyperText Transfer Protocol)</w:t>
       </w:r>
@@ -2740,7 +2824,7 @@
       <w:pPr>
         <w:pStyle w:val="Titolo2"/>
       </w:pPr>
-      <w:bookmarkStart w:id="7" w:name="_Toc227592161"/>
+      <w:bookmarkStart w:id="7" w:name="_Toc227706890"/>
       <w:r>
         <w:lastRenderedPageBreak/>
         <w:t>1.2 URL (Uniform Resource Locator)</w:t>
@@ -2811,19 +2895,41 @@
         </w:rPr>
       </w:pPr>
       <w:r>
-        <w:t xml:space="preserve">1. Protocollo: specifica il protocollo usato per accedere alla risorsa </w:t>
+        <w:t>1. Protocollo</w:t>
+      </w:r>
+      <w:r>
+        <w:t xml:space="preserve"> (schema): </w:t>
+      </w:r>
+      <w:r>
+        <w:t xml:space="preserve">specifica il protocollo usato per accedere alla risorsa </w:t>
       </w:r>
       <w:r>
         <w:rPr>
           <w:i/>
           <w:iCs/>
         </w:rPr>
-        <w:t>(come HTTP o HTTPS)</w:t>
+        <w:t>(HTTP o HTTPS)</w:t>
       </w:r>
     </w:p>
     <w:p>
       <w:r>
-        <w:t xml:space="preserve">2. Dominio: il nome del dominio del server; le parti del dominio sono lette da destra a sinistra. La prima parte (in questo caso .it) è il </w:t>
+        <w:t>2. Dominio</w:t>
+      </w:r>
+      <w:r>
+        <w:t xml:space="preserve"> (hostname)</w:t>
+      </w:r>
+      <w:r>
+        <w:t>: il nome del dominio del server; le parti del dominio sono lette da destra a sinistra. La prima parte (</w:t>
+      </w:r>
+      <w:r>
+        <w:rPr>
+          <w:i/>
+          <w:iCs/>
+        </w:rPr>
+        <w:t>.it</w:t>
+      </w:r>
+      <w:r>
+        <w:t xml:space="preserve">) è il </w:t>
       </w:r>
       <w:r>
         <w:rPr>
@@ -2873,6 +2979,9 @@
     </w:p>
     <w:p>
       <w:r>
+        <w:t xml:space="preserve">4. </w:t>
+      </w:r>
+      <w:r>
         <w:t>Path: la posizione specifica sul server dove la risorsa è conservata</w:t>
       </w:r>
       <w:r>
@@ -2882,20 +2991,19 @@
     <w:p>
       <w:pPr>
         <w:pStyle w:val="Titolo1"/>
-        <w:rPr>
-          <w:lang w:val="en-GB"/>
-        </w:rPr>
-      </w:pPr>
-      <w:bookmarkStart w:id="8" w:name="_Toc227592162"/>
-      <w:r>
-        <w:rPr>
-          <w:lang w:val="en-GB"/>
-        </w:rPr>
+      </w:pPr>
+      <w:bookmarkStart w:id="8" w:name="_Toc227706891"/>
+      <w:r>
         <w:t>2. HTML (HyperText Markup Language)</w:t>
       </w:r>
       <w:bookmarkEnd w:id="8"/>
     </w:p>
     <w:p>
+      <w:pPr>
+        <w:rPr>
+          <w:noProof/>
+        </w:rPr>
+      </w:pPr>
       <w:r>
         <w:t>HTML è un linguaggio di</w:t>
       </w:r>
@@ -2910,12 +3018,1337 @@
         <w:t>tags</w:t>
       </w:r>
       <w:r>
-        <w:t>, ed utilizzate nel formato &lt;nometag&gt; contenuto &lt;/nometag&gt;.</w:t>
+        <w:t>,</w:t>
+      </w:r>
+      <w:r>
+        <w:t xml:space="preserve"> create mediante l’uso di parentesi angolari nel formato:</w:t>
       </w:r>
     </w:p>
     <w:p>
       <w:r>
+        <w:rPr>
+          <w:noProof/>
+        </w:rPr>
+        <w:drawing>
+          <wp:inline distT="0" distB="0" distL="0" distR="0" wp14:anchorId="2946224C" wp14:editId="4A2C67B5">
+            <wp:extent cx="6120130" cy="362585"/>
+            <wp:effectExtent l="0" t="0" r="0" b="0"/>
+            <wp:docPr id="589034455" name="Immagine 7"/>
+            <wp:cNvGraphicFramePr>
+              <a:graphicFrameLocks xmlns:a="http://schemas.openxmlformats.org/drawingml/2006/main" noChangeAspect="1"/>
+            </wp:cNvGraphicFramePr>
+            <a:graphic xmlns:a="http://schemas.openxmlformats.org/drawingml/2006/main">
+              <a:graphicData uri="http://schemas.openxmlformats.org/drawingml/2006/picture">
+                <pic:pic xmlns:pic="http://schemas.openxmlformats.org/drawingml/2006/picture">
+                  <pic:nvPicPr>
+                    <pic:cNvPr id="589034455" name="Immagine 589034455"/>
+                    <pic:cNvPicPr/>
+                  </pic:nvPicPr>
+                  <pic:blipFill>
+                    <a:blip r:embed="rId13">
+                      <a:extLst>
+                        <a:ext uri="{28A0092B-C50C-407E-A947-70E740481C1C}">
+                          <a14:useLocalDpi xmlns:a14="http://schemas.microsoft.com/office/drawing/2010/main" val="0"/>
+                        </a:ext>
+                      </a:extLst>
+                    </a:blip>
+                    <a:stretch>
+                      <a:fillRect/>
+                    </a:stretch>
+                  </pic:blipFill>
+                  <pic:spPr>
+                    <a:xfrm>
+                      <a:off x="0" y="0"/>
+                      <a:ext cx="6120130" cy="362585"/>
+                    </a:xfrm>
+                    <a:prstGeom prst="rect">
+                      <a:avLst/>
+                    </a:prstGeom>
+                  </pic:spPr>
+                </pic:pic>
+              </a:graphicData>
+            </a:graphic>
+          </wp:inline>
+        </w:drawing>
+      </w:r>
+    </w:p>
+    <w:p>
+      <w:r>
+        <w:t>Gli opening tag possono anche contenere degli attributi key-values, a seconda della tipologia.</w:t>
+      </w:r>
+    </w:p>
+    <w:p>
+      <w:r>
+        <w:rPr>
+          <w:noProof/>
+        </w:rPr>
+        <w:drawing>
+          <wp:inline distT="0" distB="0" distL="0" distR="0" wp14:anchorId="12161032" wp14:editId="272C32CC">
+            <wp:extent cx="6120130" cy="362585"/>
+            <wp:effectExtent l="0" t="0" r="0" b="0"/>
+            <wp:docPr id="1785639619" name="Immagine 8"/>
+            <wp:cNvGraphicFramePr>
+              <a:graphicFrameLocks xmlns:a="http://schemas.openxmlformats.org/drawingml/2006/main" noChangeAspect="1"/>
+            </wp:cNvGraphicFramePr>
+            <a:graphic xmlns:a="http://schemas.openxmlformats.org/drawingml/2006/main">
+              <a:graphicData uri="http://schemas.openxmlformats.org/drawingml/2006/picture">
+                <pic:pic xmlns:pic="http://schemas.openxmlformats.org/drawingml/2006/picture">
+                  <pic:nvPicPr>
+                    <pic:cNvPr id="1785639619" name="Immagine 1785639619"/>
+                    <pic:cNvPicPr/>
+                  </pic:nvPicPr>
+                  <pic:blipFill>
+                    <a:blip r:embed="rId14">
+                      <a:extLst>
+                        <a:ext uri="{28A0092B-C50C-407E-A947-70E740481C1C}">
+                          <a14:useLocalDpi xmlns:a14="http://schemas.microsoft.com/office/drawing/2010/main" val="0"/>
+                        </a:ext>
+                      </a:extLst>
+                    </a:blip>
+                    <a:stretch>
+                      <a:fillRect/>
+                    </a:stretch>
+                  </pic:blipFill>
+                  <pic:spPr>
+                    <a:xfrm>
+                      <a:off x="0" y="0"/>
+                      <a:ext cx="6120130" cy="362585"/>
+                    </a:xfrm>
+                    <a:prstGeom prst="rect">
+                      <a:avLst/>
+                    </a:prstGeom>
+                  </pic:spPr>
+                </pic:pic>
+              </a:graphicData>
+            </a:graphic>
+          </wp:inline>
+        </w:drawing>
+      </w:r>
+    </w:p>
+    <w:p>
+      <w:r>
+        <w:t xml:space="preserve">Ogni documento HTML deve iniziare con la dichiarazione </w:t>
+      </w:r>
+      <w:r>
+        <w:rPr>
+          <w:b/>
+          <w:bCs/>
+        </w:rPr>
+        <w:t>&lt;!DOCTYPE HTML&gt;</w:t>
+      </w:r>
+      <w:r>
+        <w:t>, che non è un tag e non ha una chiusura ma avverte semplicemente al browser che il file è un documento html.</w:t>
+      </w:r>
+      <w:r>
         <w:t xml:space="preserve"> </w:t>
+      </w:r>
+      <w:r>
+        <w:br/>
+      </w:r>
+      <w:r>
+        <w:t>Dopo tale dichiarazione, il documento HTML presenta una struttura ad albero annidato, composta da sezioni delimitate da tag che al loro interno contengono a loro volta sottosezioni più piccole</w:t>
+      </w:r>
+      <w:r>
+        <w:t>.</w:t>
+      </w:r>
+    </w:p>
+    <w:p>
+      <w:r>
+        <w:t>La struttura più esterna è quella che delimita l'intero document</w:t>
+      </w:r>
+      <w:r>
+        <w:t>o</w:t>
+      </w:r>
+      <w:r>
+        <w:t xml:space="preserve">, ed è compresa </w:t>
+      </w:r>
+      <w:r>
+        <w:t>nel</w:t>
+      </w:r>
+      <w:r>
+        <w:t xml:space="preserve"> tag </w:t>
+      </w:r>
+      <w:r>
+        <w:rPr>
+          <w:b/>
+          <w:bCs/>
+        </w:rPr>
+        <w:t>&lt;html&gt;</w:t>
+      </w:r>
+      <w:r>
+        <w:t>.</w:t>
+      </w:r>
+      <w:r>
+        <w:br/>
+        <w:t xml:space="preserve">Successivamente, all’interno del tag </w:t>
+      </w:r>
+      <w:r>
+        <w:rPr>
+          <w:i/>
+          <w:iCs/>
+        </w:rPr>
+        <w:t>&lt;html&gt;</w:t>
+      </w:r>
+      <w:r>
+        <w:t xml:space="preserve">, </w:t>
+      </w:r>
+      <w:r>
+        <w:t>lo standard prevede sempre la definizione di due sezioni ben distinte e disposte in sequenza ordinata:</w:t>
+      </w:r>
+    </w:p>
+    <w:p>
+      <w:pPr>
+        <w:pStyle w:val="Paragrafoelenco"/>
+        <w:numPr>
+          <w:ilvl w:val="0"/>
+          <w:numId w:val="40"/>
+        </w:numPr>
+      </w:pPr>
+      <w:r>
+        <w:t xml:space="preserve">La </w:t>
+      </w:r>
+      <w:r>
+        <w:t>sezione di intestazione o </w:t>
+      </w:r>
+      <w:r>
+        <w:rPr>
+          <w:i/>
+          <w:iCs/>
+        </w:rPr>
+        <w:t>header</w:t>
+      </w:r>
+      <w:r>
+        <w:t xml:space="preserve">, delimitata </w:t>
+      </w:r>
+      <w:r>
+        <w:t>dal</w:t>
+      </w:r>
+      <w:r>
+        <w:t xml:space="preserve"> tag </w:t>
+      </w:r>
+      <w:r>
+        <w:rPr>
+          <w:b/>
+          <w:bCs/>
+        </w:rPr>
+        <w:t>&lt;head&gt;</w:t>
+      </w:r>
+      <w:r>
+        <w:t>, che contiene informazioni di controllo normalmente non visualizzate dal browser, con l'eccezione di alcuni elementi</w:t>
+      </w:r>
+      <w:r>
+        <w:t>.</w:t>
+      </w:r>
+    </w:p>
+    <w:p>
+      <w:pPr>
+        <w:pStyle w:val="Paragrafoelenco"/>
+        <w:numPr>
+          <w:ilvl w:val="0"/>
+          <w:numId w:val="40"/>
+        </w:numPr>
+      </w:pPr>
+      <w:r>
+        <w:t xml:space="preserve">La </w:t>
+      </w:r>
+      <w:r>
+        <w:t>sezione del corpo o </w:t>
+      </w:r>
+      <w:r>
+        <w:rPr>
+          <w:i/>
+          <w:iCs/>
+        </w:rPr>
+        <w:t>body</w:t>
+      </w:r>
+      <w:r>
+        <w:t xml:space="preserve">, delimitata </w:t>
+      </w:r>
+      <w:r>
+        <w:t>dal</w:t>
+      </w:r>
+      <w:r>
+        <w:t xml:space="preserve"> tag </w:t>
+      </w:r>
+      <w:r>
+        <w:rPr>
+          <w:b/>
+          <w:bCs/>
+        </w:rPr>
+        <w:t>&lt;body&gt;</w:t>
+      </w:r>
+      <w:r>
+        <w:t>, che contiene la parte informativa vera e propria</w:t>
+      </w:r>
+      <w:r>
+        <w:t xml:space="preserve">, come </w:t>
+      </w:r>
+      <w:r>
+        <w:t>testo, immagini e collegamenti</w:t>
+      </w:r>
+      <w:r>
+        <w:t>,</w:t>
+      </w:r>
+      <w:r>
+        <w:t xml:space="preserve"> che costituiscono tutto ciò che viene visualizzato dal browser.</w:t>
+      </w:r>
+    </w:p>
+    <w:p>
+      <w:r>
+        <w:lastRenderedPageBreak/>
+        <w:t>I metadati (</w:t>
+      </w:r>
+      <w:r>
+        <w:t>come la codifica dei caratteri</w:t>
+      </w:r>
+      <w:r>
+        <w:t xml:space="preserve">), i </w:t>
+      </w:r>
+      <w:r>
+        <w:t>collegamenti verso file esterni</w:t>
+      </w:r>
+      <w:r>
+        <w:t xml:space="preserve"> (come a CSS, JavaScript) e il titolo associato alla pagina, sono tutte informazioni da scrivere nell’</w:t>
+      </w:r>
+      <w:r>
+        <w:rPr>
+          <w:i/>
+          <w:iCs/>
+        </w:rPr>
+        <w:t>header</w:t>
+      </w:r>
+      <w:r>
+        <w:t>; a</w:t>
+      </w:r>
+      <w:r>
+        <w:t>ll'interno della sezion</w:t>
+      </w:r>
+      <w:r>
+        <w:t xml:space="preserve">e </w:t>
+      </w:r>
+      <w:r>
+        <w:rPr>
+          <w:i/>
+          <w:iCs/>
+        </w:rPr>
+        <w:t>body</w:t>
+      </w:r>
+      <w:r>
+        <w:t>, che racchiude la parte visualizzabile del documento, si utilizzano i tag specifici previsti per la formattazione dei contenuti</w:t>
+      </w:r>
+      <w:r>
+        <w:t>.</w:t>
+      </w:r>
+    </w:p>
+    <w:p>
+      <w:pPr>
+        <w:pStyle w:val="Titolo2"/>
+      </w:pPr>
+      <w:bookmarkStart w:id="9" w:name="_Toc227706892"/>
+      <w:r>
+        <w:t>2.1 Semantica dei Tag</w:t>
+      </w:r>
+      <w:bookmarkEnd w:id="9"/>
+    </w:p>
+    <w:p>
+      <w:r>
+        <w:t>I tag utilizzati all’interno del body definiscono la vera struttura di un documento HTML.</w:t>
+      </w:r>
+      <w:r>
+        <w:br/>
+        <w:t xml:space="preserve">Prima di mostrare alcuni tag, è bene dichiarare l’esistenza di attributi globali, ovvero utilizzabili da ogni elemento HTML: </w:t>
+      </w:r>
+      <w:r>
+        <w:rPr>
+          <w:i/>
+          <w:iCs/>
+        </w:rPr>
+        <w:t xml:space="preserve">id </w:t>
+      </w:r>
+      <w:r>
+        <w:t xml:space="preserve">(identificativo univoco per un elemento), </w:t>
+      </w:r>
+      <w:r>
+        <w:rPr>
+          <w:i/>
+          <w:iCs/>
+        </w:rPr>
+        <w:t>lang</w:t>
+      </w:r>
+      <w:r>
+        <w:t xml:space="preserve"> (lingua </w:t>
+      </w:r>
+      <w:r>
+        <w:t>del contenuto del documento</w:t>
+      </w:r>
+      <w:r>
+        <w:t xml:space="preserve">), </w:t>
+      </w:r>
+      <w:r>
+        <w:rPr>
+          <w:i/>
+          <w:iCs/>
+        </w:rPr>
+        <w:t xml:space="preserve">style </w:t>
+      </w:r>
+      <w:r>
+        <w:t xml:space="preserve">e </w:t>
+      </w:r>
+      <w:r>
+        <w:rPr>
+          <w:i/>
+          <w:iCs/>
+        </w:rPr>
+        <w:t xml:space="preserve">class </w:t>
+      </w:r>
+      <w:r>
+        <w:t>(usati per modificare lo stile del documento e dei singoli elementi).</w:t>
+      </w:r>
+      <w:r>
+        <w:br/>
+        <w:t>Possiamo ora definire alcuni tag HTML, usati per formattare ed includere dati specifici.</w:t>
+      </w:r>
+    </w:p>
+    <w:p>
+      <w:r>
+        <w:rPr>
+          <w:b/>
+          <w:bCs/>
+        </w:rPr>
+        <w:t>TESTO</w:t>
+      </w:r>
+      <w:r>
+        <w:br/>
+      </w:r>
+      <w:r>
+        <w:t xml:space="preserve">Per la formattazione del testo, ritroviamo i tag da </w:t>
+      </w:r>
+      <w:r>
+        <w:rPr>
+          <w:b/>
+          <w:bCs/>
+        </w:rPr>
+        <w:t>&lt;h1&gt;</w:t>
+      </w:r>
+      <w:r>
+        <w:rPr>
+          <w:b/>
+          <w:bCs/>
+        </w:rPr>
+        <w:t xml:space="preserve"> </w:t>
+      </w:r>
+      <w:r>
+        <w:t xml:space="preserve">ad </w:t>
+      </w:r>
+      <w:r>
+        <w:rPr>
+          <w:b/>
+          <w:bCs/>
+        </w:rPr>
+        <w:t>&lt;h6&gt;</w:t>
+      </w:r>
+      <w:r>
+        <w:t xml:space="preserve"> per titoli e sotto</w:t>
+      </w:r>
+      <w:r>
+        <w:t>titoli (</w:t>
+      </w:r>
+      <w:r>
+        <w:t>la numerazione è in ordine di grandezza</w:t>
+      </w:r>
+      <w:r>
+        <w:t>)</w:t>
+      </w:r>
+      <w:r>
+        <w:t xml:space="preserve"> e </w:t>
+      </w:r>
+      <w:r>
+        <w:rPr>
+          <w:b/>
+          <w:bCs/>
+        </w:rPr>
+        <w:t>&lt;p&gt;</w:t>
+      </w:r>
+      <w:r>
+        <w:t xml:space="preserve"> per i </w:t>
+      </w:r>
+      <w:r>
+        <w:t>singoli paragrafi. Per la semantica invece:</w:t>
+      </w:r>
+    </w:p>
+    <w:tbl>
+      <w:tblPr>
+        <w:tblStyle w:val="Grigliatabella"/>
+        <w:tblW w:w="9877" w:type="dxa"/>
+        <w:tblBorders>
+          <w:top w:val="none" w:sz="0" w:space="0" w:color="auto"/>
+          <w:left w:val="none" w:sz="0" w:space="0" w:color="auto"/>
+          <w:bottom w:val="none" w:sz="0" w:space="0" w:color="auto"/>
+          <w:right w:val="none" w:sz="0" w:space="0" w:color="auto"/>
+          <w:insideH w:val="none" w:sz="0" w:space="0" w:color="auto"/>
+          <w:insideV w:val="none" w:sz="0" w:space="0" w:color="auto"/>
+        </w:tblBorders>
+        <w:tblLook w:val="04A0" w:firstRow="1" w:lastRow="0" w:firstColumn="1" w:lastColumn="0" w:noHBand="0" w:noVBand="1"/>
+      </w:tblPr>
+      <w:tblGrid>
+        <w:gridCol w:w="3484"/>
+        <w:gridCol w:w="6393"/>
+      </w:tblGrid>
+      <w:tr>
+        <w:trPr>
+          <w:trHeight w:val="338"/>
+        </w:trPr>
+        <w:tc>
+          <w:tcPr>
+            <w:tcW w:w="3484" w:type="dxa"/>
+          </w:tcPr>
+          <w:p>
+            <w:r>
+              <w:rPr>
+                <w:b/>
+                <w:bCs/>
+              </w:rPr>
+              <w:t xml:space="preserve">&lt;em&gt; </w:t>
+            </w:r>
+            <w:r>
+              <w:t>caratteri in corsivo</w:t>
+            </w:r>
+          </w:p>
+        </w:tc>
+        <w:tc>
+          <w:tcPr>
+            <w:tcW w:w="6393" w:type="dxa"/>
+          </w:tcPr>
+          <w:p>
+            <w:r>
+              <w:rPr>
+                <w:b/>
+                <w:bCs/>
+              </w:rPr>
+              <w:t>&lt;abbr title=</w:t>
+            </w:r>
+            <w:r>
+              <w:rPr>
+                <w:b/>
+                <w:bCs/>
+              </w:rPr>
+              <w:t xml:space="preserve"> </w:t>
+            </w:r>
+            <w:r>
+              <w:rPr>
+                <w:b/>
+                <w:bCs/>
+                <w:i/>
+                <w:iCs/>
+              </w:rPr>
+              <w:t>”</w:t>
+            </w:r>
+            <w:r>
+              <w:rPr>
+                <w:b/>
+                <w:bCs/>
+                <w:i/>
+                <w:iCs/>
+              </w:rPr>
+              <w:t>description</w:t>
+            </w:r>
+            <w:r>
+              <w:rPr>
+                <w:b/>
+                <w:bCs/>
+                <w:i/>
+                <w:iCs/>
+              </w:rPr>
+              <w:t>”</w:t>
+            </w:r>
+            <w:r>
+              <w:rPr>
+                <w:b/>
+                <w:bCs/>
+              </w:rPr>
+              <w:t>&gt;</w:t>
+            </w:r>
+            <w:r>
+              <w:rPr>
+                <w:b/>
+                <w:bCs/>
+              </w:rPr>
+              <w:t xml:space="preserve"> </w:t>
+            </w:r>
+            <w:r>
+              <w:t>definisce acronimi e abbreviazioni</w:t>
+            </w:r>
+          </w:p>
+        </w:tc>
+      </w:tr>
+      <w:tr>
+        <w:trPr>
+          <w:trHeight w:val="338"/>
+        </w:trPr>
+        <w:tc>
+          <w:tcPr>
+            <w:tcW w:w="3484" w:type="dxa"/>
+          </w:tcPr>
+          <w:p>
+            <w:r>
+              <w:rPr>
+                <w:b/>
+                <w:bCs/>
+              </w:rPr>
+              <w:t xml:space="preserve">&lt;strong&gt; </w:t>
+            </w:r>
+            <w:r>
+              <w:t>caratteri in</w:t>
+            </w:r>
+            <w:r>
+              <w:t xml:space="preserve"> grassetto</w:t>
+            </w:r>
+          </w:p>
+        </w:tc>
+        <w:tc>
+          <w:tcPr>
+            <w:tcW w:w="6393" w:type="dxa"/>
+          </w:tcPr>
+          <w:p>
+            <w:r>
+              <w:rPr>
+                <w:b/>
+                <w:bCs/>
+              </w:rPr>
+              <w:t xml:space="preserve">&lt;del&gt; </w:t>
+            </w:r>
+            <w:r>
+              <w:t>tratto verticale sui caratteri, cancellazione</w:t>
+            </w:r>
+          </w:p>
+        </w:tc>
+      </w:tr>
+      <w:tr>
+        <w:trPr>
+          <w:trHeight w:val="338"/>
+        </w:trPr>
+        <w:tc>
+          <w:tcPr>
+            <w:tcW w:w="3484" w:type="dxa"/>
+          </w:tcPr>
+          <w:p>
+            <w:r>
+              <w:rPr>
+                <w:b/>
+                <w:bCs/>
+              </w:rPr>
+              <w:t>&lt;br/&gt;</w:t>
+            </w:r>
+            <w:r>
+              <w:t xml:space="preserve"> per andare a capo</w:t>
+            </w:r>
+          </w:p>
+        </w:tc>
+        <w:tc>
+          <w:tcPr>
+            <w:tcW w:w="6393" w:type="dxa"/>
+          </w:tcPr>
+          <w:p>
+            <w:pPr>
+              <w:rPr>
+                <w:sz w:val="22"/>
+                <w:szCs w:val="21"/>
+              </w:rPr>
+            </w:pPr>
+            <w:r>
+              <w:rPr>
+                <w:b/>
+                <w:bCs/>
+              </w:rPr>
+              <w:t>&lt;ins</w:t>
+            </w:r>
+            <w:r>
+              <w:rPr>
+                <w:b/>
+                <w:bCs/>
+                <w:sz w:val="22"/>
+                <w:szCs w:val="21"/>
+              </w:rPr>
+              <w:t>&gt;</w:t>
+            </w:r>
+            <w:r>
+              <w:rPr>
+                <w:sz w:val="22"/>
+                <w:szCs w:val="21"/>
+              </w:rPr>
+              <w:t xml:space="preserve"> sottolineatura dei caratteri</w:t>
+            </w:r>
+          </w:p>
+        </w:tc>
+      </w:tr>
+    </w:tbl>
+    <w:p>
+      <w:r>
+        <w:rPr>
+          <w:b/>
+          <w:bCs/>
+        </w:rPr>
+        <w:br/>
+      </w:r>
+      <w:r>
+        <w:rPr>
+          <w:b/>
+          <w:bCs/>
+        </w:rPr>
+        <w:t>LINK</w:t>
+      </w:r>
+      <w:r>
+        <w:rPr>
+          <w:b/>
+          <w:bCs/>
+        </w:rPr>
+        <w:br/>
+      </w:r>
+      <w:r>
+        <w:t xml:space="preserve">Gli </w:t>
+      </w:r>
+      <w:r>
+        <w:rPr>
+          <w:i/>
+          <w:iCs/>
+        </w:rPr>
+        <w:t>hyperlink</w:t>
+      </w:r>
+      <w:r>
+        <w:t xml:space="preserve"> possono essere dichiarati usando il tag</w:t>
+      </w:r>
+      <w:r>
+        <w:t xml:space="preserve"> </w:t>
+      </w:r>
+      <w:r>
+        <w:rPr>
+          <w:b/>
+          <w:bCs/>
+        </w:rPr>
+        <w:t>&lt;a&gt;</w:t>
+      </w:r>
+      <w:r>
+        <w:t xml:space="preserve"> (</w:t>
+      </w:r>
+      <w:r>
+        <w:t>a</w:t>
+      </w:r>
+      <w:r>
+        <w:t>ncora).</w:t>
+      </w:r>
+      <w:r>
+        <w:t xml:space="preserve"> </w:t>
+      </w:r>
+      <w:r>
+        <w:t xml:space="preserve">Questo tag </w:t>
+      </w:r>
+      <w:r>
+        <w:t>usa</w:t>
+      </w:r>
+      <w:r>
+        <w:t xml:space="preserve"> l’attributo </w:t>
+      </w:r>
+      <w:r>
+        <w:rPr>
+          <w:b/>
+          <w:bCs/>
+          <w:i/>
+          <w:iCs/>
+        </w:rPr>
+        <w:t>href</w:t>
+      </w:r>
+      <w:r>
+        <w:t xml:space="preserve">, il cui valore indica la destinazione del link </w:t>
+      </w:r>
+      <w:r>
+        <w:rPr>
+          <w:i/>
+          <w:iCs/>
+        </w:rPr>
+        <w:t>URL</w:t>
+      </w:r>
+      <w:r>
+        <w:t xml:space="preserve">, </w:t>
+      </w:r>
+      <w:r>
+        <w:t>il cui path</w:t>
+      </w:r>
+      <w:r>
+        <w:t xml:space="preserve"> può essere </w:t>
+      </w:r>
+      <w:r>
+        <w:rPr>
+          <w:b/>
+          <w:bCs/>
+        </w:rPr>
+        <w:t>assoluto</w:t>
+      </w:r>
+      <w:r>
+        <w:t xml:space="preserve"> (</w:t>
+      </w:r>
+      <w:r>
+        <w:t>include lo schema e l’hostname, e contiene tutte le informazioni necessarie per raggiungere la risorsa</w:t>
+      </w:r>
+      <w:r>
+        <w:t>)</w:t>
+      </w:r>
+      <w:r>
+        <w:t xml:space="preserve"> o relativo</w:t>
+      </w:r>
+      <w:r>
+        <w:t xml:space="preserve"> (</w:t>
+      </w:r>
+      <w:r>
+        <w:t>specificano solo un percorso, il resto viene dedotto dal contesto del link</w:t>
+      </w:r>
+      <w:r>
+        <w:t xml:space="preserve">). I path relativi possono fare uso della </w:t>
+      </w:r>
+      <w:r>
+        <w:rPr>
+          <w:i/>
+          <w:iCs/>
+        </w:rPr>
+        <w:t xml:space="preserve">dot </w:t>
+      </w:r>
+      <w:r>
+        <w:rPr>
+          <w:i/>
+          <w:iCs/>
+        </w:rPr>
+        <w:t>notation</w:t>
+      </w:r>
+      <w:r>
+        <w:t xml:space="preserve"> per indicare con </w:t>
+      </w:r>
+      <w:r>
+        <w:rPr>
+          <w:b/>
+          <w:bCs/>
+        </w:rPr>
+        <w:t>./</w:t>
+      </w:r>
+      <w:r>
+        <w:t xml:space="preserve"> la directory corrente, con </w:t>
+      </w:r>
+      <w:r>
+        <w:rPr>
+          <w:b/>
+          <w:bCs/>
+        </w:rPr>
+        <w:t>../</w:t>
+      </w:r>
+      <w:r>
+        <w:t xml:space="preserve"> la directory padre.</w:t>
+      </w:r>
+      <w:r>
+        <w:br/>
+        <w:t xml:space="preserve">Conviene usare path </w:t>
+      </w:r>
+      <w:r>
+        <w:t xml:space="preserve">relativi per risorse della stessa applicazione </w:t>
+      </w:r>
+      <w:r>
+        <w:t>w</w:t>
+      </w:r>
+      <w:r>
+        <w:t>eb</w:t>
+      </w:r>
+      <w:r>
+        <w:t>, assoluti per risorse esterne.</w:t>
+      </w:r>
+      <w:r>
+        <w:br/>
+        <w:t xml:space="preserve">L’attributo </w:t>
+      </w:r>
+      <w:r>
+        <w:rPr>
+          <w:b/>
+          <w:bCs/>
+          <w:i/>
+          <w:iCs/>
+        </w:rPr>
+        <w:t>target</w:t>
+      </w:r>
+      <w:r>
+        <w:t xml:space="preserve"> </w:t>
+      </w:r>
+      <w:r>
+        <w:t xml:space="preserve">specifica dove aprire la risorsa collegata: il valore può essere </w:t>
+      </w:r>
+      <w:r>
+        <w:rPr>
+          <w:i/>
+          <w:iCs/>
+        </w:rPr>
+        <w:t>“</w:t>
+      </w:r>
+      <w:r>
+        <w:rPr>
+          <w:i/>
+          <w:iCs/>
+        </w:rPr>
+        <w:t>self</w:t>
+      </w:r>
+      <w:r>
+        <w:rPr>
+          <w:i/>
+          <w:iCs/>
+        </w:rPr>
+        <w:t>”</w:t>
+      </w:r>
+      <w:r>
+        <w:t xml:space="preserve"> per aprirla nella pagina corrente oppure </w:t>
+      </w:r>
+      <w:r>
+        <w:rPr>
+          <w:i/>
+          <w:iCs/>
+        </w:rPr>
+        <w:t>“_blank”</w:t>
+      </w:r>
+      <w:r>
+        <w:t xml:space="preserve"> per aprirla in una nuova finestra</w:t>
+      </w:r>
+      <w:r>
+        <w:t>.</w:t>
+      </w:r>
+    </w:p>
+    <w:p>
+      <w:r>
+        <w:rPr>
+          <w:b/>
+          <w:bCs/>
+        </w:rPr>
+        <w:t>TABELLE</w:t>
+      </w:r>
+      <w:r>
+        <w:rPr>
+          <w:b/>
+          <w:bCs/>
+        </w:rPr>
+        <w:br/>
+      </w:r>
+      <w:r>
+        <w:t xml:space="preserve">Una tabella in </w:t>
+      </w:r>
+      <w:r>
+        <w:t>HTML</w:t>
+      </w:r>
+      <w:r>
+        <w:t xml:space="preserve"> permette di </w:t>
+      </w:r>
+      <w:r>
+        <w:t>formattare</w:t>
+      </w:r>
+      <w:r>
+        <w:t xml:space="preserve"> dati in forma tabulare. </w:t>
+      </w:r>
+      <w:r>
+        <w:t xml:space="preserve">Definita dal tag </w:t>
+      </w:r>
+      <w:r>
+        <w:rPr>
+          <w:b/>
+          <w:bCs/>
+        </w:rPr>
+        <w:t>&lt;table&gt;</w:t>
+      </w:r>
+      <w:r>
+        <w:t>, c</w:t>
+      </w:r>
+      <w:r>
+        <w:t>ontiene un set di righe</w:t>
+      </w:r>
+      <w:r>
+        <w:t xml:space="preserve"> identificate con</w:t>
+      </w:r>
+      <w:r>
+        <w:t xml:space="preserve"> </w:t>
+      </w:r>
+      <w:r>
+        <w:rPr>
+          <w:b/>
+          <w:bCs/>
+        </w:rPr>
+        <w:t>&lt;tr&gt;</w:t>
+      </w:r>
+      <w:r>
+        <w:t xml:space="preserve"> </w:t>
+      </w:r>
+      <w:r>
+        <w:rPr>
+          <w:i/>
+          <w:iCs/>
+        </w:rPr>
+        <w:t>(table row)</w:t>
+      </w:r>
+      <w:r>
+        <w:t xml:space="preserve">, e ognuna </w:t>
+      </w:r>
+      <w:r>
+        <w:t>può</w:t>
+      </w:r>
+      <w:r>
+        <w:t xml:space="preserve"> conte</w:t>
+      </w:r>
+      <w:r>
+        <w:t>nere una o più</w:t>
+      </w:r>
+      <w:r>
+        <w:t xml:space="preserve"> dei </w:t>
+      </w:r>
+      <w:r>
+        <w:rPr>
+          <w:b/>
+          <w:bCs/>
+        </w:rPr>
+        <w:t>&lt;th&gt;</w:t>
+      </w:r>
+      <w:r>
+        <w:t xml:space="preserve"> </w:t>
+      </w:r>
+      <w:r>
+        <w:rPr>
+          <w:i/>
+          <w:iCs/>
+        </w:rPr>
+        <w:t>(table header)</w:t>
+      </w:r>
+      <w:r>
+        <w:t xml:space="preserve"> </w:t>
+      </w:r>
+      <w:r>
+        <w:t>e</w:t>
+      </w:r>
+      <w:r>
+        <w:t xml:space="preserve"> </w:t>
+      </w:r>
+      <w:r>
+        <w:rPr>
+          <w:b/>
+          <w:bCs/>
+        </w:rPr>
+        <w:t>&lt;td&gt;</w:t>
+      </w:r>
+      <w:r>
+        <w:t xml:space="preserve"> </w:t>
+      </w:r>
+      <w:r>
+        <w:rPr>
+          <w:i/>
+          <w:iCs/>
+        </w:rPr>
+        <w:t>(table data)</w:t>
+      </w:r>
+      <w:r>
+        <w:t xml:space="preserve">. </w:t>
+      </w:r>
+      <w:r>
+        <w:t>Il tag</w:t>
+      </w:r>
+      <w:r>
+        <w:t xml:space="preserve"> </w:t>
+      </w:r>
+      <w:r>
+        <w:rPr>
+          <w:b/>
+          <w:bCs/>
+        </w:rPr>
+        <w:t xml:space="preserve">&lt;caption&gt; </w:t>
+      </w:r>
+      <w:r>
+        <w:t>aggiunge</w:t>
+      </w:r>
+      <w:r>
+        <w:t xml:space="preserve"> una descrizione</w:t>
+      </w:r>
+      <w:r>
+        <w:t xml:space="preserve"> a tutta la tabella</w:t>
+      </w:r>
+      <w:r>
+        <w:t>.</w:t>
+      </w:r>
+    </w:p>
+    <w:p>
+      <w:pPr>
+        <w:rPr>
+          <w:sz w:val="22"/>
+          <w:szCs w:val="21"/>
+        </w:rPr>
+      </w:pPr>
+      <w:r>
+        <w:rPr>
+          <w:b/>
+          <w:bCs/>
+        </w:rPr>
+        <w:t>LISTE</w:t>
+      </w:r>
+      <w:r>
+        <w:rPr>
+          <w:b/>
+          <w:bCs/>
+        </w:rPr>
+        <w:br/>
+      </w:r>
+      <w:r>
+        <w:t xml:space="preserve">Esistono tre tipi di </w:t>
+      </w:r>
+      <w:r>
+        <w:t xml:space="preserve">liste in HTML: </w:t>
+      </w:r>
+      <w:r>
+        <w:rPr>
+          <w:b/>
+          <w:bCs/>
+        </w:rPr>
+        <w:t>&lt;ol&gt;</w:t>
+      </w:r>
+      <w:r>
+        <w:t xml:space="preserve"> per liste ordinate (enumerazioni), </w:t>
+      </w:r>
+      <w:r>
+        <w:rPr>
+          <w:b/>
+          <w:bCs/>
+        </w:rPr>
+        <w:t>&lt;ul&gt;</w:t>
+      </w:r>
+      <w:r>
+        <w:t xml:space="preserve"> per liste non ordinate (elenchi puntati), </w:t>
+      </w:r>
+      <w:r>
+        <w:rPr>
+          <w:b/>
+          <w:bCs/>
+        </w:rPr>
+        <w:t>&lt;dl&gt;</w:t>
+      </w:r>
+      <w:r>
+        <w:t xml:space="preserve"> per liste descrittive (usando </w:t>
+      </w:r>
+      <w:r>
+        <w:rPr>
+          <w:b/>
+          <w:bCs/>
+        </w:rPr>
+        <w:t>&lt;dt&gt;</w:t>
+      </w:r>
+      <w:r>
+        <w:t xml:space="preserve"> per i termini e </w:t>
+      </w:r>
+      <w:r>
+        <w:rPr>
+          <w:b/>
+          <w:bCs/>
+        </w:rPr>
+        <w:t>&lt;dd&gt;</w:t>
+      </w:r>
+      <w:r>
+        <w:t xml:space="preserve"> per le descrizioni)</w:t>
+      </w:r>
+      <w:r>
+        <w:rPr>
+          <w:sz w:val="22"/>
+          <w:szCs w:val="21"/>
+        </w:rPr>
+        <w:t>.</w:t>
+      </w:r>
+      <w:r>
+        <w:rPr>
+          <w:sz w:val="22"/>
+          <w:szCs w:val="21"/>
+        </w:rPr>
+        <w:br/>
+        <w:t xml:space="preserve">I singoli elementi della lista sono invece definiti dal tag </w:t>
+      </w:r>
+      <w:r>
+        <w:rPr>
+          <w:b/>
+          <w:bCs/>
+          <w:sz w:val="22"/>
+          <w:szCs w:val="21"/>
+        </w:rPr>
+        <w:t>&lt;li&gt;</w:t>
+      </w:r>
+      <w:r>
+        <w:rPr>
+          <w:sz w:val="22"/>
+          <w:szCs w:val="21"/>
+        </w:rPr>
+        <w:t xml:space="preserve"> </w:t>
+      </w:r>
+      <w:r>
+        <w:rPr>
+          <w:i/>
+          <w:iCs/>
+          <w:sz w:val="22"/>
+          <w:szCs w:val="21"/>
+        </w:rPr>
+        <w:t>(list item)</w:t>
+      </w:r>
+      <w:r>
+        <w:rPr>
+          <w:sz w:val="22"/>
+          <w:szCs w:val="21"/>
+        </w:rPr>
+        <w:t>.</w:t>
+      </w:r>
+    </w:p>
+    <w:p>
+      <w:pPr>
+        <w:rPr>
+          <w:szCs w:val="24"/>
+        </w:rPr>
+      </w:pPr>
+      <w:r>
+        <w:rPr>
+          <w:b/>
+          <w:bCs/>
+          <w:sz w:val="22"/>
+          <w:szCs w:val="21"/>
+        </w:rPr>
+        <w:t>IMMAGINI</w:t>
+      </w:r>
+      <w:r>
+        <w:rPr>
+          <w:b/>
+          <w:bCs/>
+          <w:sz w:val="22"/>
+          <w:szCs w:val="21"/>
+        </w:rPr>
+        <w:br/>
+      </w:r>
+      <w:r>
+        <w:rPr>
+          <w:szCs w:val="24"/>
+        </w:rPr>
+        <w:t>I</w:t>
+      </w:r>
+      <w:r>
+        <w:rPr>
+          <w:szCs w:val="24"/>
+        </w:rPr>
+        <w:t xml:space="preserve">l tag </w:t>
+      </w:r>
+      <w:r>
+        <w:rPr>
+          <w:b/>
+          <w:bCs/>
+          <w:szCs w:val="24"/>
+        </w:rPr>
+        <w:t>&lt;img&gt;</w:t>
+      </w:r>
+      <w:r>
+        <w:rPr>
+          <w:szCs w:val="24"/>
+        </w:rPr>
+        <w:t xml:space="preserve"> è usato per </w:t>
+      </w:r>
+      <w:r>
+        <w:rPr>
+          <w:szCs w:val="24"/>
+        </w:rPr>
+        <w:t>includere</w:t>
+      </w:r>
+      <w:r>
+        <w:rPr>
+          <w:szCs w:val="24"/>
+        </w:rPr>
+        <w:t xml:space="preserve"> un’immagine in un documento HTML</w:t>
+      </w:r>
+      <w:r>
+        <w:rPr>
+          <w:szCs w:val="24"/>
+        </w:rPr>
+        <w:t>;</w:t>
+      </w:r>
+      <w:r>
+        <w:rPr>
+          <w:szCs w:val="24"/>
+        </w:rPr>
+        <w:t xml:space="preserve"> </w:t>
+      </w:r>
+      <w:r>
+        <w:rPr>
+          <w:szCs w:val="24"/>
+        </w:rPr>
+        <w:t>è</w:t>
+      </w:r>
+      <w:r>
+        <w:rPr>
+          <w:szCs w:val="24"/>
+        </w:rPr>
+        <w:t xml:space="preserve"> un elemento vuoto, cioè non deve contenere altri tag</w:t>
+      </w:r>
+      <w:r>
+        <w:rPr>
+          <w:szCs w:val="24"/>
+        </w:rPr>
+        <w:t xml:space="preserve">. Utilizza gli attributi: </w:t>
+      </w:r>
+      <w:r>
+        <w:rPr>
+          <w:i/>
+          <w:iCs/>
+          <w:szCs w:val="24"/>
+        </w:rPr>
+        <w:t>src</w:t>
+      </w:r>
+      <w:r>
+        <w:rPr>
+          <w:szCs w:val="24"/>
+        </w:rPr>
+        <w:t xml:space="preserve"> per identificare l’URL dell’immagine, </w:t>
+      </w:r>
+      <w:r>
+        <w:rPr>
+          <w:i/>
+          <w:iCs/>
+          <w:szCs w:val="24"/>
+        </w:rPr>
+        <w:t>alt</w:t>
+      </w:r>
+      <w:r>
+        <w:rPr>
+          <w:szCs w:val="24"/>
+        </w:rPr>
+        <w:t xml:space="preserve"> per specificarne una descrizione testuale, </w:t>
+      </w:r>
+      <w:r>
+        <w:rPr>
+          <w:i/>
+          <w:iCs/>
+          <w:szCs w:val="24"/>
+        </w:rPr>
+        <w:t>width</w:t>
+      </w:r>
+      <w:r>
+        <w:rPr>
+          <w:szCs w:val="24"/>
+        </w:rPr>
+        <w:t xml:space="preserve"> e </w:t>
+      </w:r>
+      <w:r>
+        <w:rPr>
+          <w:i/>
+          <w:iCs/>
+          <w:szCs w:val="24"/>
+        </w:rPr>
+        <w:t xml:space="preserve">height </w:t>
+      </w:r>
+      <w:r>
+        <w:rPr>
+          <w:szCs w:val="24"/>
+        </w:rPr>
+        <w:t>per specificarne le dimensioni in pixel.</w:t>
+      </w:r>
+      <w:r>
+        <w:rPr>
+          <w:szCs w:val="24"/>
+        </w:rPr>
+        <w:br/>
+        <w:t>Il browser effettua una richiesta HTTP per fare il retrieve della risorsa (l’immagine).</w:t>
       </w:r>
     </w:p>
     <w:sectPr>
@@ -3418,6 +4851,119 @@
     </w:lvl>
   </w:abstractNum>
   <w:abstractNum w:abstractNumId="2" w15:restartNumberingAfterBreak="0">
+    <w:nsid w:val="05CA4FBD"/>
+    <w:multiLevelType w:val="hybridMultilevel"/>
+    <w:tmpl w:val="79D44BF6"/>
+    <w:lvl w:ilvl="0" w:tplc="04100001">
+      <w:start w:val="1"/>
+      <w:numFmt w:val="bullet"/>
+      <w:lvlText w:val=""/>
+      <w:lvlJc w:val="left"/>
+      <w:pPr>
+        <w:ind w:left="720" w:hanging="360"/>
+      </w:pPr>
+      <w:rPr>
+        <w:rFonts w:ascii="Symbol" w:hAnsi="Symbol" w:hint="default"/>
+      </w:rPr>
+    </w:lvl>
+    <w:lvl w:ilvl="1" w:tplc="04100003" w:tentative="1">
+      <w:start w:val="1"/>
+      <w:numFmt w:val="bullet"/>
+      <w:lvlText w:val="o"/>
+      <w:lvlJc w:val="left"/>
+      <w:pPr>
+        <w:ind w:left="1440" w:hanging="360"/>
+      </w:pPr>
+      <w:rPr>
+        <w:rFonts w:ascii="Courier New" w:hAnsi="Courier New" w:cs="Courier New" w:hint="default"/>
+      </w:rPr>
+    </w:lvl>
+    <w:lvl w:ilvl="2" w:tplc="04100005" w:tentative="1">
+      <w:start w:val="1"/>
+      <w:numFmt w:val="bullet"/>
+      <w:lvlText w:val=""/>
+      <w:lvlJc w:val="left"/>
+      <w:pPr>
+        <w:ind w:left="2160" w:hanging="360"/>
+      </w:pPr>
+      <w:rPr>
+        <w:rFonts w:ascii="Wingdings" w:hAnsi="Wingdings" w:hint="default"/>
+      </w:rPr>
+    </w:lvl>
+    <w:lvl w:ilvl="3" w:tplc="04100001" w:tentative="1">
+      <w:start w:val="1"/>
+      <w:numFmt w:val="bullet"/>
+      <w:lvlText w:val=""/>
+      <w:lvlJc w:val="left"/>
+      <w:pPr>
+        <w:ind w:left="2880" w:hanging="360"/>
+      </w:pPr>
+      <w:rPr>
+        <w:rFonts w:ascii="Symbol" w:hAnsi="Symbol" w:hint="default"/>
+      </w:rPr>
+    </w:lvl>
+    <w:lvl w:ilvl="4" w:tplc="04100003" w:tentative="1">
+      <w:start w:val="1"/>
+      <w:numFmt w:val="bullet"/>
+      <w:lvlText w:val="o"/>
+      <w:lvlJc w:val="left"/>
+      <w:pPr>
+        <w:ind w:left="3600" w:hanging="360"/>
+      </w:pPr>
+      <w:rPr>
+        <w:rFonts w:ascii="Courier New" w:hAnsi="Courier New" w:cs="Courier New" w:hint="default"/>
+      </w:rPr>
+    </w:lvl>
+    <w:lvl w:ilvl="5" w:tplc="04100005" w:tentative="1">
+      <w:start w:val="1"/>
+      <w:numFmt w:val="bullet"/>
+      <w:lvlText w:val=""/>
+      <w:lvlJc w:val="left"/>
+      <w:pPr>
+        <w:ind w:left="4320" w:hanging="360"/>
+      </w:pPr>
+      <w:rPr>
+        <w:rFonts w:ascii="Wingdings" w:hAnsi="Wingdings" w:hint="default"/>
+      </w:rPr>
+    </w:lvl>
+    <w:lvl w:ilvl="6" w:tplc="04100001" w:tentative="1">
+      <w:start w:val="1"/>
+      <w:numFmt w:val="bullet"/>
+      <w:lvlText w:val=""/>
+      <w:lvlJc w:val="left"/>
+      <w:pPr>
+        <w:ind w:left="5040" w:hanging="360"/>
+      </w:pPr>
+      <w:rPr>
+        <w:rFonts w:ascii="Symbol" w:hAnsi="Symbol" w:hint="default"/>
+      </w:rPr>
+    </w:lvl>
+    <w:lvl w:ilvl="7" w:tplc="04100003" w:tentative="1">
+      <w:start w:val="1"/>
+      <w:numFmt w:val="bullet"/>
+      <w:lvlText w:val="o"/>
+      <w:lvlJc w:val="left"/>
+      <w:pPr>
+        <w:ind w:left="5760" w:hanging="360"/>
+      </w:pPr>
+      <w:rPr>
+        <w:rFonts w:ascii="Courier New" w:hAnsi="Courier New" w:cs="Courier New" w:hint="default"/>
+      </w:rPr>
+    </w:lvl>
+    <w:lvl w:ilvl="8" w:tplc="04100005" w:tentative="1">
+      <w:start w:val="1"/>
+      <w:numFmt w:val="bullet"/>
+      <w:lvlText w:val=""/>
+      <w:lvlJc w:val="left"/>
+      <w:pPr>
+        <w:ind w:left="6480" w:hanging="360"/>
+      </w:pPr>
+      <w:rPr>
+        <w:rFonts w:ascii="Wingdings" w:hAnsi="Wingdings" w:hint="default"/>
+      </w:rPr>
+    </w:lvl>
+  </w:abstractNum>
+  <w:abstractNum w:abstractNumId="3" w15:restartNumberingAfterBreak="0">
     <w:nsid w:val="086424A1"/>
     <w:multiLevelType w:val="hybridMultilevel"/>
     <w:tmpl w:val="B8EE3A34"/>
@@ -3530,7 +5076,7 @@
       </w:rPr>
     </w:lvl>
   </w:abstractNum>
-  <w:abstractNum w:abstractNumId="3" w15:restartNumberingAfterBreak="0">
+  <w:abstractNum w:abstractNumId="4" w15:restartNumberingAfterBreak="0">
     <w:nsid w:val="09BC1DC7"/>
     <w:multiLevelType w:val="hybridMultilevel"/>
     <w:tmpl w:val="45568882"/>
@@ -3643,7 +5189,7 @@
       </w:rPr>
     </w:lvl>
   </w:abstractNum>
-  <w:abstractNum w:abstractNumId="4" w15:restartNumberingAfterBreak="0">
+  <w:abstractNum w:abstractNumId="5" w15:restartNumberingAfterBreak="0">
     <w:nsid w:val="0B4D354F"/>
     <w:multiLevelType w:val="hybridMultilevel"/>
     <w:tmpl w:val="1C847A86"/>
@@ -3756,7 +5302,7 @@
       </w:rPr>
     </w:lvl>
   </w:abstractNum>
-  <w:abstractNum w:abstractNumId="5" w15:restartNumberingAfterBreak="0">
+  <w:abstractNum w:abstractNumId="6" w15:restartNumberingAfterBreak="0">
     <w:nsid w:val="0F347231"/>
     <w:multiLevelType w:val="hybridMultilevel"/>
     <w:tmpl w:val="354E4168"/>
@@ -3869,7 +5415,7 @@
       </w:rPr>
     </w:lvl>
   </w:abstractNum>
-  <w:abstractNum w:abstractNumId="6" w15:restartNumberingAfterBreak="0">
+  <w:abstractNum w:abstractNumId="7" w15:restartNumberingAfterBreak="0">
     <w:nsid w:val="0F847B64"/>
     <w:multiLevelType w:val="hybridMultilevel"/>
     <w:tmpl w:val="ED489AEC"/>
@@ -3982,7 +5528,7 @@
       </w:rPr>
     </w:lvl>
   </w:abstractNum>
-  <w:abstractNum w:abstractNumId="7" w15:restartNumberingAfterBreak="0">
+  <w:abstractNum w:abstractNumId="8" w15:restartNumberingAfterBreak="0">
     <w:nsid w:val="109F616C"/>
     <w:multiLevelType w:val="hybridMultilevel"/>
     <w:tmpl w:val="ACD86BF6"/>
@@ -4095,7 +5641,7 @@
       </w:rPr>
     </w:lvl>
   </w:abstractNum>
-  <w:abstractNum w:abstractNumId="8" w15:restartNumberingAfterBreak="0">
+  <w:abstractNum w:abstractNumId="9" w15:restartNumberingAfterBreak="0">
     <w:nsid w:val="13F83417"/>
     <w:multiLevelType w:val="hybridMultilevel"/>
     <w:tmpl w:val="4DC863C0"/>
@@ -4208,7 +5754,7 @@
       </w:rPr>
     </w:lvl>
   </w:abstractNum>
-  <w:abstractNum w:abstractNumId="9" w15:restartNumberingAfterBreak="0">
+  <w:abstractNum w:abstractNumId="10" w15:restartNumberingAfterBreak="0">
     <w:nsid w:val="19BE4A0D"/>
     <w:multiLevelType w:val="hybridMultilevel"/>
     <w:tmpl w:val="165AC614"/>
@@ -4321,7 +5867,7 @@
       </w:rPr>
     </w:lvl>
   </w:abstractNum>
-  <w:abstractNum w:abstractNumId="10" w15:restartNumberingAfterBreak="0">
+  <w:abstractNum w:abstractNumId="11" w15:restartNumberingAfterBreak="0">
     <w:nsid w:val="1AA6757E"/>
     <w:multiLevelType w:val="multilevel"/>
     <w:tmpl w:val="6A7EDCB2"/>
@@ -4470,7 +6016,7 @@
       </w:rPr>
     </w:lvl>
   </w:abstractNum>
-  <w:abstractNum w:abstractNumId="11" w15:restartNumberingAfterBreak="0">
+  <w:abstractNum w:abstractNumId="12" w15:restartNumberingAfterBreak="0">
     <w:nsid w:val="1CE0782F"/>
     <w:multiLevelType w:val="hybridMultilevel"/>
     <w:tmpl w:val="ECA2A1E0"/>
@@ -4583,7 +6129,156 @@
       </w:rPr>
     </w:lvl>
   </w:abstractNum>
-  <w:abstractNum w:abstractNumId="12" w15:restartNumberingAfterBreak="0">
+  <w:abstractNum w:abstractNumId="13" w15:restartNumberingAfterBreak="0">
+    <w:nsid w:val="1EAC5D2E"/>
+    <w:multiLevelType w:val="multilevel"/>
+    <w:tmpl w:val="048014EC"/>
+    <w:lvl w:ilvl="0">
+      <w:start w:val="1"/>
+      <w:numFmt w:val="bullet"/>
+      <w:lvlText w:val=""/>
+      <w:lvlJc w:val="left"/>
+      <w:pPr>
+        <w:tabs>
+          <w:tab w:val="num" w:pos="720"/>
+        </w:tabs>
+        <w:ind w:left="720" w:hanging="360"/>
+      </w:pPr>
+      <w:rPr>
+        <w:rFonts w:ascii="Symbol" w:hAnsi="Symbol" w:hint="default"/>
+        <w:sz w:val="20"/>
+      </w:rPr>
+    </w:lvl>
+    <w:lvl w:ilvl="1">
+      <w:start w:val="1"/>
+      <w:numFmt w:val="bullet"/>
+      <w:lvlText w:val="o"/>
+      <w:lvlJc w:val="left"/>
+      <w:pPr>
+        <w:tabs>
+          <w:tab w:val="num" w:pos="1440"/>
+        </w:tabs>
+        <w:ind w:left="1440" w:hanging="360"/>
+      </w:pPr>
+      <w:rPr>
+        <w:rFonts w:ascii="Courier New" w:hAnsi="Courier New" w:hint="default"/>
+        <w:sz w:val="20"/>
+      </w:rPr>
+    </w:lvl>
+    <w:lvl w:ilvl="2" w:tentative="1">
+      <w:start w:val="1"/>
+      <w:numFmt w:val="bullet"/>
+      <w:lvlText w:val=""/>
+      <w:lvlJc w:val="left"/>
+      <w:pPr>
+        <w:tabs>
+          <w:tab w:val="num" w:pos="2160"/>
+        </w:tabs>
+        <w:ind w:left="2160" w:hanging="360"/>
+      </w:pPr>
+      <w:rPr>
+        <w:rFonts w:ascii="Wingdings" w:hAnsi="Wingdings" w:hint="default"/>
+        <w:sz w:val="20"/>
+      </w:rPr>
+    </w:lvl>
+    <w:lvl w:ilvl="3" w:tentative="1">
+      <w:start w:val="1"/>
+      <w:numFmt w:val="bullet"/>
+      <w:lvlText w:val=""/>
+      <w:lvlJc w:val="left"/>
+      <w:pPr>
+        <w:tabs>
+          <w:tab w:val="num" w:pos="2880"/>
+        </w:tabs>
+        <w:ind w:left="2880" w:hanging="360"/>
+      </w:pPr>
+      <w:rPr>
+        <w:rFonts w:ascii="Wingdings" w:hAnsi="Wingdings" w:hint="default"/>
+        <w:sz w:val="20"/>
+      </w:rPr>
+    </w:lvl>
+    <w:lvl w:ilvl="4" w:tentative="1">
+      <w:start w:val="1"/>
+      <w:numFmt w:val="bullet"/>
+      <w:lvlText w:val=""/>
+      <w:lvlJc w:val="left"/>
+      <w:pPr>
+        <w:tabs>
+          <w:tab w:val="num" w:pos="3600"/>
+        </w:tabs>
+        <w:ind w:left="3600" w:hanging="360"/>
+      </w:pPr>
+      <w:rPr>
+        <w:rFonts w:ascii="Wingdings" w:hAnsi="Wingdings" w:hint="default"/>
+        <w:sz w:val="20"/>
+      </w:rPr>
+    </w:lvl>
+    <w:lvl w:ilvl="5" w:tentative="1">
+      <w:start w:val="1"/>
+      <w:numFmt w:val="bullet"/>
+      <w:lvlText w:val=""/>
+      <w:lvlJc w:val="left"/>
+      <w:pPr>
+        <w:tabs>
+          <w:tab w:val="num" w:pos="4320"/>
+        </w:tabs>
+        <w:ind w:left="4320" w:hanging="360"/>
+      </w:pPr>
+      <w:rPr>
+        <w:rFonts w:ascii="Wingdings" w:hAnsi="Wingdings" w:hint="default"/>
+        <w:sz w:val="20"/>
+      </w:rPr>
+    </w:lvl>
+    <w:lvl w:ilvl="6" w:tentative="1">
+      <w:start w:val="1"/>
+      <w:numFmt w:val="bullet"/>
+      <w:lvlText w:val=""/>
+      <w:lvlJc w:val="left"/>
+      <w:pPr>
+        <w:tabs>
+          <w:tab w:val="num" w:pos="5040"/>
+        </w:tabs>
+        <w:ind w:left="5040" w:hanging="360"/>
+      </w:pPr>
+      <w:rPr>
+        <w:rFonts w:ascii="Wingdings" w:hAnsi="Wingdings" w:hint="default"/>
+        <w:sz w:val="20"/>
+      </w:rPr>
+    </w:lvl>
+    <w:lvl w:ilvl="7" w:tentative="1">
+      <w:start w:val="1"/>
+      <w:numFmt w:val="bullet"/>
+      <w:lvlText w:val=""/>
+      <w:lvlJc w:val="left"/>
+      <w:pPr>
+        <w:tabs>
+          <w:tab w:val="num" w:pos="5760"/>
+        </w:tabs>
+        <w:ind w:left="5760" w:hanging="360"/>
+      </w:pPr>
+      <w:rPr>
+        <w:rFonts w:ascii="Wingdings" w:hAnsi="Wingdings" w:hint="default"/>
+        <w:sz w:val="20"/>
+      </w:rPr>
+    </w:lvl>
+    <w:lvl w:ilvl="8" w:tentative="1">
+      <w:start w:val="1"/>
+      <w:numFmt w:val="bullet"/>
+      <w:lvlText w:val=""/>
+      <w:lvlJc w:val="left"/>
+      <w:pPr>
+        <w:tabs>
+          <w:tab w:val="num" w:pos="6480"/>
+        </w:tabs>
+        <w:ind w:left="6480" w:hanging="360"/>
+      </w:pPr>
+      <w:rPr>
+        <w:rFonts w:ascii="Wingdings" w:hAnsi="Wingdings" w:hint="default"/>
+        <w:sz w:val="20"/>
+      </w:rPr>
+    </w:lvl>
+  </w:abstractNum>
+  <w:abstractNum w:abstractNumId="14" w15:restartNumberingAfterBreak="0">
     <w:nsid w:val="20713FCD"/>
     <w:multiLevelType w:val="hybridMultilevel"/>
     <w:tmpl w:val="CF0232E2"/>
@@ -4696,7 +6391,7 @@
       </w:rPr>
     </w:lvl>
   </w:abstractNum>
-  <w:abstractNum w:abstractNumId="13" w15:restartNumberingAfterBreak="0">
+  <w:abstractNum w:abstractNumId="15" w15:restartNumberingAfterBreak="0">
     <w:nsid w:val="20C56A89"/>
     <w:multiLevelType w:val="hybridMultilevel"/>
     <w:tmpl w:val="BC7690CA"/>
@@ -4809,7 +6504,7 @@
       </w:rPr>
     </w:lvl>
   </w:abstractNum>
-  <w:abstractNum w:abstractNumId="14" w15:restartNumberingAfterBreak="0">
+  <w:abstractNum w:abstractNumId="16" w15:restartNumberingAfterBreak="0">
     <w:nsid w:val="2670531E"/>
     <w:multiLevelType w:val="multilevel"/>
     <w:tmpl w:val="E7961DA6"/>
@@ -4958,7 +6653,7 @@
       </w:rPr>
     </w:lvl>
   </w:abstractNum>
-  <w:abstractNum w:abstractNumId="15" w15:restartNumberingAfterBreak="0">
+  <w:abstractNum w:abstractNumId="17" w15:restartNumberingAfterBreak="0">
     <w:nsid w:val="28DB03B6"/>
     <w:multiLevelType w:val="hybridMultilevel"/>
     <w:tmpl w:val="3BDE33D8"/>
@@ -5071,7 +6766,7 @@
       </w:rPr>
     </w:lvl>
   </w:abstractNum>
-  <w:abstractNum w:abstractNumId="16" w15:restartNumberingAfterBreak="0">
+  <w:abstractNum w:abstractNumId="18" w15:restartNumberingAfterBreak="0">
     <w:nsid w:val="2CF146AB"/>
     <w:multiLevelType w:val="hybridMultilevel"/>
     <w:tmpl w:val="83DAE35E"/>
@@ -5184,7 +6879,7 @@
       </w:rPr>
     </w:lvl>
   </w:abstractNum>
-  <w:abstractNum w:abstractNumId="17" w15:restartNumberingAfterBreak="0">
+  <w:abstractNum w:abstractNumId="19" w15:restartNumberingAfterBreak="0">
     <w:nsid w:val="2DD21BCE"/>
     <w:multiLevelType w:val="hybridMultilevel"/>
     <w:tmpl w:val="77D6C402"/>
@@ -5297,7 +6992,7 @@
       </w:rPr>
     </w:lvl>
   </w:abstractNum>
-  <w:abstractNum w:abstractNumId="18" w15:restartNumberingAfterBreak="0">
+  <w:abstractNum w:abstractNumId="20" w15:restartNumberingAfterBreak="0">
     <w:nsid w:val="30E75B17"/>
     <w:multiLevelType w:val="hybridMultilevel"/>
     <w:tmpl w:val="AC1672FC"/>
@@ -5410,7 +7105,7 @@
       </w:rPr>
     </w:lvl>
   </w:abstractNum>
-  <w:abstractNum w:abstractNumId="19" w15:restartNumberingAfterBreak="0">
+  <w:abstractNum w:abstractNumId="21" w15:restartNumberingAfterBreak="0">
     <w:nsid w:val="38DA53F0"/>
     <w:multiLevelType w:val="hybridMultilevel"/>
     <w:tmpl w:val="BCAA4998"/>
@@ -5523,7 +7218,7 @@
       </w:rPr>
     </w:lvl>
   </w:abstractNum>
-  <w:abstractNum w:abstractNumId="20" w15:restartNumberingAfterBreak="0">
+  <w:abstractNum w:abstractNumId="22" w15:restartNumberingAfterBreak="0">
     <w:nsid w:val="3B4E6364"/>
     <w:multiLevelType w:val="multilevel"/>
     <w:tmpl w:val="A126D6F6"/>
@@ -5672,7 +7367,7 @@
       </w:rPr>
     </w:lvl>
   </w:abstractNum>
-  <w:abstractNum w:abstractNumId="21" w15:restartNumberingAfterBreak="0">
+  <w:abstractNum w:abstractNumId="23" w15:restartNumberingAfterBreak="0">
     <w:nsid w:val="3FF279E7"/>
     <w:multiLevelType w:val="hybridMultilevel"/>
     <w:tmpl w:val="70C00538"/>
@@ -5785,7 +7480,7 @@
       </w:rPr>
     </w:lvl>
   </w:abstractNum>
-  <w:abstractNum w:abstractNumId="22" w15:restartNumberingAfterBreak="0">
+  <w:abstractNum w:abstractNumId="24" w15:restartNumberingAfterBreak="0">
     <w:nsid w:val="40F066FB"/>
     <w:multiLevelType w:val="hybridMultilevel"/>
     <w:tmpl w:val="103296A2"/>
@@ -5898,7 +7593,7 @@
       </w:rPr>
     </w:lvl>
   </w:abstractNum>
-  <w:abstractNum w:abstractNumId="23" w15:restartNumberingAfterBreak="0">
+  <w:abstractNum w:abstractNumId="25" w15:restartNumberingAfterBreak="0">
     <w:nsid w:val="42A27F2A"/>
     <w:multiLevelType w:val="hybridMultilevel"/>
     <w:tmpl w:val="852C56CA"/>
@@ -6011,7 +7706,7 @@
       </w:rPr>
     </w:lvl>
   </w:abstractNum>
-  <w:abstractNum w:abstractNumId="24" w15:restartNumberingAfterBreak="0">
+  <w:abstractNum w:abstractNumId="26" w15:restartNumberingAfterBreak="0">
     <w:nsid w:val="4F122034"/>
     <w:multiLevelType w:val="hybridMultilevel"/>
     <w:tmpl w:val="3F424C58"/>
@@ -6124,7 +7819,7 @@
       </w:rPr>
     </w:lvl>
   </w:abstractNum>
-  <w:abstractNum w:abstractNumId="25" w15:restartNumberingAfterBreak="0">
+  <w:abstractNum w:abstractNumId="27" w15:restartNumberingAfterBreak="0">
     <w:nsid w:val="517C5855"/>
     <w:multiLevelType w:val="hybridMultilevel"/>
     <w:tmpl w:val="DC985CAA"/>
@@ -6237,7 +7932,7 @@
       </w:rPr>
     </w:lvl>
   </w:abstractNum>
-  <w:abstractNum w:abstractNumId="26" w15:restartNumberingAfterBreak="0">
+  <w:abstractNum w:abstractNumId="28" w15:restartNumberingAfterBreak="0">
     <w:nsid w:val="51CF2E50"/>
     <w:multiLevelType w:val="hybridMultilevel"/>
     <w:tmpl w:val="8F88B684"/>
@@ -6350,7 +8045,156 @@
       </w:rPr>
     </w:lvl>
   </w:abstractNum>
-  <w:abstractNum w:abstractNumId="27" w15:restartNumberingAfterBreak="0">
+  <w:abstractNum w:abstractNumId="29" w15:restartNumberingAfterBreak="0">
+    <w:nsid w:val="51F266EF"/>
+    <w:multiLevelType w:val="multilevel"/>
+    <w:tmpl w:val="35AC929A"/>
+    <w:lvl w:ilvl="0">
+      <w:start w:val="1"/>
+      <w:numFmt w:val="bullet"/>
+      <w:lvlText w:val=""/>
+      <w:lvlJc w:val="left"/>
+      <w:pPr>
+        <w:tabs>
+          <w:tab w:val="num" w:pos="720"/>
+        </w:tabs>
+        <w:ind w:left="720" w:hanging="360"/>
+      </w:pPr>
+      <w:rPr>
+        <w:rFonts w:ascii="Symbol" w:hAnsi="Symbol" w:hint="default"/>
+        <w:sz w:val="20"/>
+      </w:rPr>
+    </w:lvl>
+    <w:lvl w:ilvl="1" w:tentative="1">
+      <w:start w:val="1"/>
+      <w:numFmt w:val="bullet"/>
+      <w:lvlText w:val="o"/>
+      <w:lvlJc w:val="left"/>
+      <w:pPr>
+        <w:tabs>
+          <w:tab w:val="num" w:pos="1440"/>
+        </w:tabs>
+        <w:ind w:left="1440" w:hanging="360"/>
+      </w:pPr>
+      <w:rPr>
+        <w:rFonts w:ascii="Courier New" w:hAnsi="Courier New" w:hint="default"/>
+        <w:sz w:val="20"/>
+      </w:rPr>
+    </w:lvl>
+    <w:lvl w:ilvl="2" w:tentative="1">
+      <w:start w:val="1"/>
+      <w:numFmt w:val="bullet"/>
+      <w:lvlText w:val=""/>
+      <w:lvlJc w:val="left"/>
+      <w:pPr>
+        <w:tabs>
+          <w:tab w:val="num" w:pos="2160"/>
+        </w:tabs>
+        <w:ind w:left="2160" w:hanging="360"/>
+      </w:pPr>
+      <w:rPr>
+        <w:rFonts w:ascii="Wingdings" w:hAnsi="Wingdings" w:hint="default"/>
+        <w:sz w:val="20"/>
+      </w:rPr>
+    </w:lvl>
+    <w:lvl w:ilvl="3" w:tentative="1">
+      <w:start w:val="1"/>
+      <w:numFmt w:val="bullet"/>
+      <w:lvlText w:val=""/>
+      <w:lvlJc w:val="left"/>
+      <w:pPr>
+        <w:tabs>
+          <w:tab w:val="num" w:pos="2880"/>
+        </w:tabs>
+        <w:ind w:left="2880" w:hanging="360"/>
+      </w:pPr>
+      <w:rPr>
+        <w:rFonts w:ascii="Wingdings" w:hAnsi="Wingdings" w:hint="default"/>
+        <w:sz w:val="20"/>
+      </w:rPr>
+    </w:lvl>
+    <w:lvl w:ilvl="4" w:tentative="1">
+      <w:start w:val="1"/>
+      <w:numFmt w:val="bullet"/>
+      <w:lvlText w:val=""/>
+      <w:lvlJc w:val="left"/>
+      <w:pPr>
+        <w:tabs>
+          <w:tab w:val="num" w:pos="3600"/>
+        </w:tabs>
+        <w:ind w:left="3600" w:hanging="360"/>
+      </w:pPr>
+      <w:rPr>
+        <w:rFonts w:ascii="Wingdings" w:hAnsi="Wingdings" w:hint="default"/>
+        <w:sz w:val="20"/>
+      </w:rPr>
+    </w:lvl>
+    <w:lvl w:ilvl="5" w:tentative="1">
+      <w:start w:val="1"/>
+      <w:numFmt w:val="bullet"/>
+      <w:lvlText w:val=""/>
+      <w:lvlJc w:val="left"/>
+      <w:pPr>
+        <w:tabs>
+          <w:tab w:val="num" w:pos="4320"/>
+        </w:tabs>
+        <w:ind w:left="4320" w:hanging="360"/>
+      </w:pPr>
+      <w:rPr>
+        <w:rFonts w:ascii="Wingdings" w:hAnsi="Wingdings" w:hint="default"/>
+        <w:sz w:val="20"/>
+      </w:rPr>
+    </w:lvl>
+    <w:lvl w:ilvl="6" w:tentative="1">
+      <w:start w:val="1"/>
+      <w:numFmt w:val="bullet"/>
+      <w:lvlText w:val=""/>
+      <w:lvlJc w:val="left"/>
+      <w:pPr>
+        <w:tabs>
+          <w:tab w:val="num" w:pos="5040"/>
+        </w:tabs>
+        <w:ind w:left="5040" w:hanging="360"/>
+      </w:pPr>
+      <w:rPr>
+        <w:rFonts w:ascii="Wingdings" w:hAnsi="Wingdings" w:hint="default"/>
+        <w:sz w:val="20"/>
+      </w:rPr>
+    </w:lvl>
+    <w:lvl w:ilvl="7" w:tentative="1">
+      <w:start w:val="1"/>
+      <w:numFmt w:val="bullet"/>
+      <w:lvlText w:val=""/>
+      <w:lvlJc w:val="left"/>
+      <w:pPr>
+        <w:tabs>
+          <w:tab w:val="num" w:pos="5760"/>
+        </w:tabs>
+        <w:ind w:left="5760" w:hanging="360"/>
+      </w:pPr>
+      <w:rPr>
+        <w:rFonts w:ascii="Wingdings" w:hAnsi="Wingdings" w:hint="default"/>
+        <w:sz w:val="20"/>
+      </w:rPr>
+    </w:lvl>
+    <w:lvl w:ilvl="8" w:tentative="1">
+      <w:start w:val="1"/>
+      <w:numFmt w:val="bullet"/>
+      <w:lvlText w:val=""/>
+      <w:lvlJc w:val="left"/>
+      <w:pPr>
+        <w:tabs>
+          <w:tab w:val="num" w:pos="6480"/>
+        </w:tabs>
+        <w:ind w:left="6480" w:hanging="360"/>
+      </w:pPr>
+      <w:rPr>
+        <w:rFonts w:ascii="Wingdings" w:hAnsi="Wingdings" w:hint="default"/>
+        <w:sz w:val="20"/>
+      </w:rPr>
+    </w:lvl>
+  </w:abstractNum>
+  <w:abstractNum w:abstractNumId="30" w15:restartNumberingAfterBreak="0">
     <w:nsid w:val="55206F60"/>
     <w:multiLevelType w:val="multilevel"/>
     <w:tmpl w:val="305228DA"/>
@@ -6499,7 +8343,120 @@
       </w:rPr>
     </w:lvl>
   </w:abstractNum>
-  <w:abstractNum w:abstractNumId="28" w15:restartNumberingAfterBreak="0">
+  <w:abstractNum w:abstractNumId="31" w15:restartNumberingAfterBreak="0">
+    <w:nsid w:val="55D76176"/>
+    <w:multiLevelType w:val="hybridMultilevel"/>
+    <w:tmpl w:val="535A2316"/>
+    <w:lvl w:ilvl="0" w:tplc="04100001">
+      <w:start w:val="1"/>
+      <w:numFmt w:val="bullet"/>
+      <w:lvlText w:val=""/>
+      <w:lvlJc w:val="left"/>
+      <w:pPr>
+        <w:ind w:left="720" w:hanging="360"/>
+      </w:pPr>
+      <w:rPr>
+        <w:rFonts w:ascii="Symbol" w:hAnsi="Symbol" w:hint="default"/>
+      </w:rPr>
+    </w:lvl>
+    <w:lvl w:ilvl="1" w:tplc="04100003" w:tentative="1">
+      <w:start w:val="1"/>
+      <w:numFmt w:val="bullet"/>
+      <w:lvlText w:val="o"/>
+      <w:lvlJc w:val="left"/>
+      <w:pPr>
+        <w:ind w:left="1440" w:hanging="360"/>
+      </w:pPr>
+      <w:rPr>
+        <w:rFonts w:ascii="Courier New" w:hAnsi="Courier New" w:cs="Courier New" w:hint="default"/>
+      </w:rPr>
+    </w:lvl>
+    <w:lvl w:ilvl="2" w:tplc="04100005" w:tentative="1">
+      <w:start w:val="1"/>
+      <w:numFmt w:val="bullet"/>
+      <w:lvlText w:val=""/>
+      <w:lvlJc w:val="left"/>
+      <w:pPr>
+        <w:ind w:left="2160" w:hanging="360"/>
+      </w:pPr>
+      <w:rPr>
+        <w:rFonts w:ascii="Wingdings" w:hAnsi="Wingdings" w:hint="default"/>
+      </w:rPr>
+    </w:lvl>
+    <w:lvl w:ilvl="3" w:tplc="04100001" w:tentative="1">
+      <w:start w:val="1"/>
+      <w:numFmt w:val="bullet"/>
+      <w:lvlText w:val=""/>
+      <w:lvlJc w:val="left"/>
+      <w:pPr>
+        <w:ind w:left="2880" w:hanging="360"/>
+      </w:pPr>
+      <w:rPr>
+        <w:rFonts w:ascii="Symbol" w:hAnsi="Symbol" w:hint="default"/>
+      </w:rPr>
+    </w:lvl>
+    <w:lvl w:ilvl="4" w:tplc="04100003" w:tentative="1">
+      <w:start w:val="1"/>
+      <w:numFmt w:val="bullet"/>
+      <w:lvlText w:val="o"/>
+      <w:lvlJc w:val="left"/>
+      <w:pPr>
+        <w:ind w:left="3600" w:hanging="360"/>
+      </w:pPr>
+      <w:rPr>
+        <w:rFonts w:ascii="Courier New" w:hAnsi="Courier New" w:cs="Courier New" w:hint="default"/>
+      </w:rPr>
+    </w:lvl>
+    <w:lvl w:ilvl="5" w:tplc="04100005" w:tentative="1">
+      <w:start w:val="1"/>
+      <w:numFmt w:val="bullet"/>
+      <w:lvlText w:val=""/>
+      <w:lvlJc w:val="left"/>
+      <w:pPr>
+        <w:ind w:left="4320" w:hanging="360"/>
+      </w:pPr>
+      <w:rPr>
+        <w:rFonts w:ascii="Wingdings" w:hAnsi="Wingdings" w:hint="default"/>
+      </w:rPr>
+    </w:lvl>
+    <w:lvl w:ilvl="6" w:tplc="04100001" w:tentative="1">
+      <w:start w:val="1"/>
+      <w:numFmt w:val="bullet"/>
+      <w:lvlText w:val=""/>
+      <w:lvlJc w:val="left"/>
+      <w:pPr>
+        <w:ind w:left="5040" w:hanging="360"/>
+      </w:pPr>
+      <w:rPr>
+        <w:rFonts w:ascii="Symbol" w:hAnsi="Symbol" w:hint="default"/>
+      </w:rPr>
+    </w:lvl>
+    <w:lvl w:ilvl="7" w:tplc="04100003" w:tentative="1">
+      <w:start w:val="1"/>
+      <w:numFmt w:val="bullet"/>
+      <w:lvlText w:val="o"/>
+      <w:lvlJc w:val="left"/>
+      <w:pPr>
+        <w:ind w:left="5760" w:hanging="360"/>
+      </w:pPr>
+      <w:rPr>
+        <w:rFonts w:ascii="Courier New" w:hAnsi="Courier New" w:cs="Courier New" w:hint="default"/>
+      </w:rPr>
+    </w:lvl>
+    <w:lvl w:ilvl="8" w:tplc="04100005" w:tentative="1">
+      <w:start w:val="1"/>
+      <w:numFmt w:val="bullet"/>
+      <w:lvlText w:val=""/>
+      <w:lvlJc w:val="left"/>
+      <w:pPr>
+        <w:ind w:left="6480" w:hanging="360"/>
+      </w:pPr>
+      <w:rPr>
+        <w:rFonts w:ascii="Wingdings" w:hAnsi="Wingdings" w:hint="default"/>
+      </w:rPr>
+    </w:lvl>
+  </w:abstractNum>
+  <w:abstractNum w:abstractNumId="32" w15:restartNumberingAfterBreak="0">
     <w:nsid w:val="57AF2A6A"/>
     <w:multiLevelType w:val="hybridMultilevel"/>
     <w:tmpl w:val="BBB49CB6"/>
@@ -6612,7 +8569,7 @@
       </w:rPr>
     </w:lvl>
   </w:abstractNum>
-  <w:abstractNum w:abstractNumId="29" w15:restartNumberingAfterBreak="0">
+  <w:abstractNum w:abstractNumId="33" w15:restartNumberingAfterBreak="0">
     <w:nsid w:val="5C7B28AE"/>
     <w:multiLevelType w:val="hybridMultilevel"/>
     <w:tmpl w:val="943422C4"/>
@@ -6725,7 +8682,156 @@
       </w:rPr>
     </w:lvl>
   </w:abstractNum>
-  <w:abstractNum w:abstractNumId="30" w15:restartNumberingAfterBreak="0">
+  <w:abstractNum w:abstractNumId="34" w15:restartNumberingAfterBreak="0">
+    <w:nsid w:val="5C9F785D"/>
+    <w:multiLevelType w:val="multilevel"/>
+    <w:tmpl w:val="B6823C42"/>
+    <w:lvl w:ilvl="0">
+      <w:start w:val="1"/>
+      <w:numFmt w:val="bullet"/>
+      <w:lvlText w:val=""/>
+      <w:lvlJc w:val="left"/>
+      <w:pPr>
+        <w:tabs>
+          <w:tab w:val="num" w:pos="720"/>
+        </w:tabs>
+        <w:ind w:left="720" w:hanging="360"/>
+      </w:pPr>
+      <w:rPr>
+        <w:rFonts w:ascii="Symbol" w:hAnsi="Symbol" w:hint="default"/>
+        <w:sz w:val="20"/>
+      </w:rPr>
+    </w:lvl>
+    <w:lvl w:ilvl="1" w:tentative="1">
+      <w:start w:val="1"/>
+      <w:numFmt w:val="bullet"/>
+      <w:lvlText w:val="o"/>
+      <w:lvlJc w:val="left"/>
+      <w:pPr>
+        <w:tabs>
+          <w:tab w:val="num" w:pos="1440"/>
+        </w:tabs>
+        <w:ind w:left="1440" w:hanging="360"/>
+      </w:pPr>
+      <w:rPr>
+        <w:rFonts w:ascii="Courier New" w:hAnsi="Courier New" w:hint="default"/>
+        <w:sz w:val="20"/>
+      </w:rPr>
+    </w:lvl>
+    <w:lvl w:ilvl="2" w:tentative="1">
+      <w:start w:val="1"/>
+      <w:numFmt w:val="bullet"/>
+      <w:lvlText w:val=""/>
+      <w:lvlJc w:val="left"/>
+      <w:pPr>
+        <w:tabs>
+          <w:tab w:val="num" w:pos="2160"/>
+        </w:tabs>
+        <w:ind w:left="2160" w:hanging="360"/>
+      </w:pPr>
+      <w:rPr>
+        <w:rFonts w:ascii="Wingdings" w:hAnsi="Wingdings" w:hint="default"/>
+        <w:sz w:val="20"/>
+      </w:rPr>
+    </w:lvl>
+    <w:lvl w:ilvl="3" w:tentative="1">
+      <w:start w:val="1"/>
+      <w:numFmt w:val="bullet"/>
+      <w:lvlText w:val=""/>
+      <w:lvlJc w:val="left"/>
+      <w:pPr>
+        <w:tabs>
+          <w:tab w:val="num" w:pos="2880"/>
+        </w:tabs>
+        <w:ind w:left="2880" w:hanging="360"/>
+      </w:pPr>
+      <w:rPr>
+        <w:rFonts w:ascii="Wingdings" w:hAnsi="Wingdings" w:hint="default"/>
+        <w:sz w:val="20"/>
+      </w:rPr>
+    </w:lvl>
+    <w:lvl w:ilvl="4" w:tentative="1">
+      <w:start w:val="1"/>
+      <w:numFmt w:val="bullet"/>
+      <w:lvlText w:val=""/>
+      <w:lvlJc w:val="left"/>
+      <w:pPr>
+        <w:tabs>
+          <w:tab w:val="num" w:pos="3600"/>
+        </w:tabs>
+        <w:ind w:left="3600" w:hanging="360"/>
+      </w:pPr>
+      <w:rPr>
+        <w:rFonts w:ascii="Wingdings" w:hAnsi="Wingdings" w:hint="default"/>
+        <w:sz w:val="20"/>
+      </w:rPr>
+    </w:lvl>
+    <w:lvl w:ilvl="5" w:tentative="1">
+      <w:start w:val="1"/>
+      <w:numFmt w:val="bullet"/>
+      <w:lvlText w:val=""/>
+      <w:lvlJc w:val="left"/>
+      <w:pPr>
+        <w:tabs>
+          <w:tab w:val="num" w:pos="4320"/>
+        </w:tabs>
+        <w:ind w:left="4320" w:hanging="360"/>
+      </w:pPr>
+      <w:rPr>
+        <w:rFonts w:ascii="Wingdings" w:hAnsi="Wingdings" w:hint="default"/>
+        <w:sz w:val="20"/>
+      </w:rPr>
+    </w:lvl>
+    <w:lvl w:ilvl="6" w:tentative="1">
+      <w:start w:val="1"/>
+      <w:numFmt w:val="bullet"/>
+      <w:lvlText w:val=""/>
+      <w:lvlJc w:val="left"/>
+      <w:pPr>
+        <w:tabs>
+          <w:tab w:val="num" w:pos="5040"/>
+        </w:tabs>
+        <w:ind w:left="5040" w:hanging="360"/>
+      </w:pPr>
+      <w:rPr>
+        <w:rFonts w:ascii="Wingdings" w:hAnsi="Wingdings" w:hint="default"/>
+        <w:sz w:val="20"/>
+      </w:rPr>
+    </w:lvl>
+    <w:lvl w:ilvl="7" w:tentative="1">
+      <w:start w:val="1"/>
+      <w:numFmt w:val="bullet"/>
+      <w:lvlText w:val=""/>
+      <w:lvlJc w:val="left"/>
+      <w:pPr>
+        <w:tabs>
+          <w:tab w:val="num" w:pos="5760"/>
+        </w:tabs>
+        <w:ind w:left="5760" w:hanging="360"/>
+      </w:pPr>
+      <w:rPr>
+        <w:rFonts w:ascii="Wingdings" w:hAnsi="Wingdings" w:hint="default"/>
+        <w:sz w:val="20"/>
+      </w:rPr>
+    </w:lvl>
+    <w:lvl w:ilvl="8" w:tentative="1">
+      <w:start w:val="1"/>
+      <w:numFmt w:val="bullet"/>
+      <w:lvlText w:val=""/>
+      <w:lvlJc w:val="left"/>
+      <w:pPr>
+        <w:tabs>
+          <w:tab w:val="num" w:pos="6480"/>
+        </w:tabs>
+        <w:ind w:left="6480" w:hanging="360"/>
+      </w:pPr>
+      <w:rPr>
+        <w:rFonts w:ascii="Wingdings" w:hAnsi="Wingdings" w:hint="default"/>
+        <w:sz w:val="20"/>
+      </w:rPr>
+    </w:lvl>
+  </w:abstractNum>
+  <w:abstractNum w:abstractNumId="35" w15:restartNumberingAfterBreak="0">
     <w:nsid w:val="5EAD6D0A"/>
     <w:multiLevelType w:val="hybridMultilevel"/>
     <w:tmpl w:val="26E458FE"/>
@@ -6838,7 +8944,7 @@
       </w:rPr>
     </w:lvl>
   </w:abstractNum>
-  <w:abstractNum w:abstractNumId="31" w15:restartNumberingAfterBreak="0">
+  <w:abstractNum w:abstractNumId="36" w15:restartNumberingAfterBreak="0">
     <w:nsid w:val="644E447D"/>
     <w:multiLevelType w:val="hybridMultilevel"/>
     <w:tmpl w:val="89D2E0F6"/>
@@ -6951,7 +9057,7 @@
       </w:rPr>
     </w:lvl>
   </w:abstractNum>
-  <w:abstractNum w:abstractNumId="32" w15:restartNumberingAfterBreak="0">
+  <w:abstractNum w:abstractNumId="37" w15:restartNumberingAfterBreak="0">
     <w:nsid w:val="68793F9F"/>
     <w:multiLevelType w:val="multilevel"/>
     <w:tmpl w:val="D80A9724"/>
@@ -7100,7 +9206,7 @@
       </w:rPr>
     </w:lvl>
   </w:abstractNum>
-  <w:abstractNum w:abstractNumId="33" w15:restartNumberingAfterBreak="0">
+  <w:abstractNum w:abstractNumId="38" w15:restartNumberingAfterBreak="0">
     <w:nsid w:val="70D01D11"/>
     <w:multiLevelType w:val="hybridMultilevel"/>
     <w:tmpl w:val="6C80F5BA"/>
@@ -7213,7 +9319,7 @@
       </w:rPr>
     </w:lvl>
   </w:abstractNum>
-  <w:abstractNum w:abstractNumId="34" w15:restartNumberingAfterBreak="0">
+  <w:abstractNum w:abstractNumId="39" w15:restartNumberingAfterBreak="0">
     <w:nsid w:val="718A175F"/>
     <w:multiLevelType w:val="hybridMultilevel"/>
     <w:tmpl w:val="8A82323A"/>
@@ -7326,7 +9432,7 @@
       </w:rPr>
     </w:lvl>
   </w:abstractNum>
-  <w:abstractNum w:abstractNumId="35" w15:restartNumberingAfterBreak="0">
+  <w:abstractNum w:abstractNumId="40" w15:restartNumberingAfterBreak="0">
     <w:nsid w:val="73393167"/>
     <w:multiLevelType w:val="hybridMultilevel"/>
     <w:tmpl w:val="16AAC9CE"/>
@@ -7439,7 +9545,121 @@
       </w:rPr>
     </w:lvl>
   </w:abstractNum>
-  <w:abstractNum w:abstractNumId="36" w15:restartNumberingAfterBreak="0">
+  <w:abstractNum w:abstractNumId="41" w15:restartNumberingAfterBreak="0">
+    <w:nsid w:val="747F7687"/>
+    <w:multiLevelType w:val="hybridMultilevel"/>
+    <w:tmpl w:val="0C5EC1C2"/>
+    <w:lvl w:ilvl="0" w:tplc="79541C1E">
+      <w:start w:val="2"/>
+      <w:numFmt w:val="bullet"/>
+      <w:lvlText w:val=""/>
+      <w:lvlJc w:val="left"/>
+      <w:pPr>
+        <w:ind w:left="720" w:hanging="360"/>
+      </w:pPr>
+      <w:rPr>
+        <w:rFonts w:ascii="Symbol" w:eastAsiaTheme="minorHAnsi" w:hAnsi="Symbol" w:cstheme="minorBidi" w:hint="default"/>
+        <w:b/>
+      </w:rPr>
+    </w:lvl>
+    <w:lvl w:ilvl="1" w:tplc="04100003" w:tentative="1">
+      <w:start w:val="1"/>
+      <w:numFmt w:val="bullet"/>
+      <w:lvlText w:val="o"/>
+      <w:lvlJc w:val="left"/>
+      <w:pPr>
+        <w:ind w:left="1440" w:hanging="360"/>
+      </w:pPr>
+      <w:rPr>
+        <w:rFonts w:ascii="Courier New" w:hAnsi="Courier New" w:cs="Courier New" w:hint="default"/>
+      </w:rPr>
+    </w:lvl>
+    <w:lvl w:ilvl="2" w:tplc="04100005" w:tentative="1">
+      <w:start w:val="1"/>
+      <w:numFmt w:val="bullet"/>
+      <w:lvlText w:val=""/>
+      <w:lvlJc w:val="left"/>
+      <w:pPr>
+        <w:ind w:left="2160" w:hanging="360"/>
+      </w:pPr>
+      <w:rPr>
+        <w:rFonts w:ascii="Wingdings" w:hAnsi="Wingdings" w:hint="default"/>
+      </w:rPr>
+    </w:lvl>
+    <w:lvl w:ilvl="3" w:tplc="04100001" w:tentative="1">
+      <w:start w:val="1"/>
+      <w:numFmt w:val="bullet"/>
+      <w:lvlText w:val=""/>
+      <w:lvlJc w:val="left"/>
+      <w:pPr>
+        <w:ind w:left="2880" w:hanging="360"/>
+      </w:pPr>
+      <w:rPr>
+        <w:rFonts w:ascii="Symbol" w:hAnsi="Symbol" w:hint="default"/>
+      </w:rPr>
+    </w:lvl>
+    <w:lvl w:ilvl="4" w:tplc="04100003" w:tentative="1">
+      <w:start w:val="1"/>
+      <w:numFmt w:val="bullet"/>
+      <w:lvlText w:val="o"/>
+      <w:lvlJc w:val="left"/>
+      <w:pPr>
+        <w:ind w:left="3600" w:hanging="360"/>
+      </w:pPr>
+      <w:rPr>
+        <w:rFonts w:ascii="Courier New" w:hAnsi="Courier New" w:cs="Courier New" w:hint="default"/>
+      </w:rPr>
+    </w:lvl>
+    <w:lvl w:ilvl="5" w:tplc="04100005" w:tentative="1">
+      <w:start w:val="1"/>
+      <w:numFmt w:val="bullet"/>
+      <w:lvlText w:val=""/>
+      <w:lvlJc w:val="left"/>
+      <w:pPr>
+        <w:ind w:left="4320" w:hanging="360"/>
+      </w:pPr>
+      <w:rPr>
+        <w:rFonts w:ascii="Wingdings" w:hAnsi="Wingdings" w:hint="default"/>
+      </w:rPr>
+    </w:lvl>
+    <w:lvl w:ilvl="6" w:tplc="04100001" w:tentative="1">
+      <w:start w:val="1"/>
+      <w:numFmt w:val="bullet"/>
+      <w:lvlText w:val=""/>
+      <w:lvlJc w:val="left"/>
+      <w:pPr>
+        <w:ind w:left="5040" w:hanging="360"/>
+      </w:pPr>
+      <w:rPr>
+        <w:rFonts w:ascii="Symbol" w:hAnsi="Symbol" w:hint="default"/>
+      </w:rPr>
+    </w:lvl>
+    <w:lvl w:ilvl="7" w:tplc="04100003" w:tentative="1">
+      <w:start w:val="1"/>
+      <w:numFmt w:val="bullet"/>
+      <w:lvlText w:val="o"/>
+      <w:lvlJc w:val="left"/>
+      <w:pPr>
+        <w:ind w:left="5760" w:hanging="360"/>
+      </w:pPr>
+      <w:rPr>
+        <w:rFonts w:ascii="Courier New" w:hAnsi="Courier New" w:cs="Courier New" w:hint="default"/>
+      </w:rPr>
+    </w:lvl>
+    <w:lvl w:ilvl="8" w:tplc="04100005" w:tentative="1">
+      <w:start w:val="1"/>
+      <w:numFmt w:val="bullet"/>
+      <w:lvlText w:val=""/>
+      <w:lvlJc w:val="left"/>
+      <w:pPr>
+        <w:ind w:left="6480" w:hanging="360"/>
+      </w:pPr>
+      <w:rPr>
+        <w:rFonts w:ascii="Wingdings" w:hAnsi="Wingdings" w:hint="default"/>
+      </w:rPr>
+    </w:lvl>
+  </w:abstractNum>
+  <w:abstractNum w:abstractNumId="42" w15:restartNumberingAfterBreak="0">
     <w:nsid w:val="766563A5"/>
     <w:multiLevelType w:val="multilevel"/>
     <w:tmpl w:val="1AE89B50"/>
@@ -7588,7 +9808,7 @@
       </w:rPr>
     </w:lvl>
   </w:abstractNum>
-  <w:abstractNum w:abstractNumId="37" w15:restartNumberingAfterBreak="0">
+  <w:abstractNum w:abstractNumId="43" w15:restartNumberingAfterBreak="0">
     <w:nsid w:val="768D59D4"/>
     <w:multiLevelType w:val="multilevel"/>
     <w:tmpl w:val="B8ECEA2C"/>
@@ -7737,7 +9957,7 @@
       </w:rPr>
     </w:lvl>
   </w:abstractNum>
-  <w:abstractNum w:abstractNumId="38" w15:restartNumberingAfterBreak="0">
+  <w:abstractNum w:abstractNumId="44" w15:restartNumberingAfterBreak="0">
     <w:nsid w:val="77B24451"/>
     <w:multiLevelType w:val="hybridMultilevel"/>
     <w:tmpl w:val="20027024"/>
@@ -7851,121 +10071,139 @@
     </w:lvl>
   </w:abstractNum>
   <w:num w:numId="1" w16cid:durableId="32929092">
+    <w:abstractNumId w:val="4"/>
+  </w:num>
+  <w:num w:numId="2" w16cid:durableId="1093284848">
+    <w:abstractNumId w:val="21"/>
+  </w:num>
+  <w:num w:numId="3" w16cid:durableId="1272468756">
+    <w:abstractNumId w:val="14"/>
+  </w:num>
+  <w:num w:numId="4" w16cid:durableId="1440831352">
+    <w:abstractNumId w:val="36"/>
+  </w:num>
+  <w:num w:numId="5" w16cid:durableId="2021854743">
+    <w:abstractNumId w:val="18"/>
+  </w:num>
+  <w:num w:numId="6" w16cid:durableId="1476530431">
+    <w:abstractNumId w:val="24"/>
+  </w:num>
+  <w:num w:numId="7" w16cid:durableId="93327648">
+    <w:abstractNumId w:val="12"/>
+  </w:num>
+  <w:num w:numId="8" w16cid:durableId="626473993">
+    <w:abstractNumId w:val="32"/>
+  </w:num>
+  <w:num w:numId="9" w16cid:durableId="905724271">
     <w:abstractNumId w:val="3"/>
   </w:num>
-  <w:num w:numId="2" w16cid:durableId="1093284848">
-    <w:abstractNumId w:val="19"/>
+  <w:num w:numId="10" w16cid:durableId="1107624426">
+    <w:abstractNumId w:val="6"/>
   </w:num>
-  <w:num w:numId="3" w16cid:durableId="1272468756">
-    <w:abstractNumId w:val="12"/>
+  <w:num w:numId="11" w16cid:durableId="1013844642">
+    <w:abstractNumId w:val="10"/>
   </w:num>
-  <w:num w:numId="4" w16cid:durableId="1440831352">
-    <w:abstractNumId w:val="31"/>
+  <w:num w:numId="12" w16cid:durableId="273639122">
+    <w:abstractNumId w:val="25"/>
   </w:num>
-  <w:num w:numId="5" w16cid:durableId="2021854743">
-    <w:abstractNumId w:val="16"/>
-  </w:num>
-  <w:num w:numId="6" w16cid:durableId="1476530431">
-    <w:abstractNumId w:val="22"/>
-  </w:num>
-  <w:num w:numId="7" w16cid:durableId="93327648">
+  <w:num w:numId="13" w16cid:durableId="432434078">
     <w:abstractNumId w:val="11"/>
   </w:num>
-  <w:num w:numId="8" w16cid:durableId="626473993">
-    <w:abstractNumId w:val="28"/>
-  </w:num>
-  <w:num w:numId="9" w16cid:durableId="905724271">
-    <w:abstractNumId w:val="2"/>
-  </w:num>
-  <w:num w:numId="10" w16cid:durableId="1107624426">
-    <w:abstractNumId w:val="5"/>
-  </w:num>
-  <w:num w:numId="11" w16cid:durableId="1013844642">
-    <w:abstractNumId w:val="9"/>
-  </w:num>
-  <w:num w:numId="12" w16cid:durableId="273639122">
-    <w:abstractNumId w:val="23"/>
-  </w:num>
-  <w:num w:numId="13" w16cid:durableId="432434078">
-    <w:abstractNumId w:val="10"/>
-  </w:num>
   <w:num w:numId="14" w16cid:durableId="1418676717">
-    <w:abstractNumId w:val="32"/>
+    <w:abstractNumId w:val="37"/>
   </w:num>
   <w:num w:numId="15" w16cid:durableId="1205364778">
-    <w:abstractNumId w:val="29"/>
+    <w:abstractNumId w:val="33"/>
   </w:num>
   <w:num w:numId="16" w16cid:durableId="764423634">
     <w:abstractNumId w:val="0"/>
   </w:num>
   <w:num w:numId="17" w16cid:durableId="1418135551">
-    <w:abstractNumId w:val="27"/>
+    <w:abstractNumId w:val="30"/>
   </w:num>
   <w:num w:numId="18" w16cid:durableId="1624459743">
-    <w:abstractNumId w:val="36"/>
+    <w:abstractNumId w:val="42"/>
   </w:num>
   <w:num w:numId="19" w16cid:durableId="305010161">
+    <w:abstractNumId w:val="22"/>
+  </w:num>
+  <w:num w:numId="20" w16cid:durableId="471992473">
+    <w:abstractNumId w:val="43"/>
+  </w:num>
+  <w:num w:numId="21" w16cid:durableId="1519660479">
+    <w:abstractNumId w:val="23"/>
+  </w:num>
+  <w:num w:numId="22" w16cid:durableId="1245144216">
+    <w:abstractNumId w:val="8"/>
+  </w:num>
+  <w:num w:numId="23" w16cid:durableId="1365907363">
+    <w:abstractNumId w:val="5"/>
+  </w:num>
+  <w:num w:numId="24" w16cid:durableId="459880245">
+    <w:abstractNumId w:val="17"/>
+  </w:num>
+  <w:num w:numId="25" w16cid:durableId="2011787519">
     <w:abstractNumId w:val="20"/>
   </w:num>
-  <w:num w:numId="20" w16cid:durableId="471992473">
-    <w:abstractNumId w:val="37"/>
+  <w:num w:numId="26" w16cid:durableId="1980957081">
+    <w:abstractNumId w:val="44"/>
   </w:num>
-  <w:num w:numId="21" w16cid:durableId="1519660479">
-    <w:abstractNumId w:val="21"/>
-  </w:num>
-  <w:num w:numId="22" w16cid:durableId="1245144216">
+  <w:num w:numId="27" w16cid:durableId="47925916">
     <w:abstractNumId w:val="7"/>
   </w:num>
-  <w:num w:numId="23" w16cid:durableId="1365907363">
-    <w:abstractNumId w:val="4"/>
-  </w:num>
-  <w:num w:numId="24" w16cid:durableId="459880245">
-    <w:abstractNumId w:val="15"/>
-  </w:num>
-  <w:num w:numId="25" w16cid:durableId="2011787519">
-    <w:abstractNumId w:val="18"/>
-  </w:num>
-  <w:num w:numId="26" w16cid:durableId="1980957081">
-    <w:abstractNumId w:val="38"/>
-  </w:num>
-  <w:num w:numId="27" w16cid:durableId="47925916">
-    <w:abstractNumId w:val="6"/>
-  </w:num>
   <w:num w:numId="28" w16cid:durableId="657077588">
-    <w:abstractNumId w:val="8"/>
+    <w:abstractNumId w:val="9"/>
   </w:num>
   <w:num w:numId="29" w16cid:durableId="526871051">
-    <w:abstractNumId w:val="35"/>
+    <w:abstractNumId w:val="40"/>
   </w:num>
   <w:num w:numId="30" w16cid:durableId="1087924038">
     <w:abstractNumId w:val="1"/>
   </w:num>
   <w:num w:numId="31" w16cid:durableId="258173303">
-    <w:abstractNumId w:val="30"/>
+    <w:abstractNumId w:val="35"/>
   </w:num>
   <w:num w:numId="32" w16cid:durableId="1709649222">
+    <w:abstractNumId w:val="28"/>
+  </w:num>
+  <w:num w:numId="33" w16cid:durableId="1824392770">
+    <w:abstractNumId w:val="16"/>
+  </w:num>
+  <w:num w:numId="34" w16cid:durableId="431317971">
+    <w:abstractNumId w:val="38"/>
+  </w:num>
+  <w:num w:numId="35" w16cid:durableId="1720474588">
+    <w:abstractNumId w:val="27"/>
+  </w:num>
+  <w:num w:numId="36" w16cid:durableId="2100176802">
+    <w:abstractNumId w:val="19"/>
+  </w:num>
+  <w:num w:numId="37" w16cid:durableId="2079936304">
+    <w:abstractNumId w:val="15"/>
+  </w:num>
+  <w:num w:numId="38" w16cid:durableId="897401265">
+    <w:abstractNumId w:val="39"/>
+  </w:num>
+  <w:num w:numId="39" w16cid:durableId="655687708">
     <w:abstractNumId w:val="26"/>
   </w:num>
-  <w:num w:numId="33" w16cid:durableId="1824392770">
-    <w:abstractNumId w:val="14"/>
+  <w:num w:numId="40" w16cid:durableId="1568177559">
+    <w:abstractNumId w:val="31"/>
   </w:num>
-  <w:num w:numId="34" w16cid:durableId="431317971">
-    <w:abstractNumId w:val="33"/>
+  <w:num w:numId="41" w16cid:durableId="1108431148">
+    <w:abstractNumId w:val="29"/>
   </w:num>
-  <w:num w:numId="35" w16cid:durableId="1720474588">
-    <w:abstractNumId w:val="25"/>
+  <w:num w:numId="42" w16cid:durableId="257255711">
+    <w:abstractNumId w:val="34"/>
   </w:num>
-  <w:num w:numId="36" w16cid:durableId="2100176802">
-    <w:abstractNumId w:val="17"/>
-  </w:num>
-  <w:num w:numId="37" w16cid:durableId="2079936304">
+  <w:num w:numId="43" w16cid:durableId="247276982">
     <w:abstractNumId w:val="13"/>
   </w:num>
-  <w:num w:numId="38" w16cid:durableId="897401265">
-    <w:abstractNumId w:val="34"/>
+  <w:num w:numId="44" w16cid:durableId="1997343614">
+    <w:abstractNumId w:val="2"/>
   </w:num>
-  <w:num w:numId="39" w16cid:durableId="655687708">
-    <w:abstractNumId w:val="24"/>
+  <w:num w:numId="45" w16cid:durableId="358703672">
+    <w:abstractNumId w:val="41"/>
   </w:num>
   <w:numIdMacAtCleanup w:val="3"/>
 </w:numbering>
@@ -8445,7 +10683,6 @@
   <w:style w:type="character" w:default="1" w:styleId="Carpredefinitoparagrafo">
     <w:name w:val="Default Paragraph Font"/>
     <w:uiPriority w:val="1"/>
-    <w:semiHidden/>
     <w:unhideWhenUsed/>
   </w:style>
   <w:style w:type="table" w:default="1" w:styleId="Tabellanormale">

</xml_diff>

<commit_message>
Completata sezione 2. HTML
</commit_message>
<xml_diff>
--- a/Workspace/Tec Web.docx
+++ b/Workspace/Tec Web.docx
@@ -385,7 +385,7 @@
           <w:r>
             <w:fldChar w:fldCharType="separate"/>
           </w:r>
-          <w:hyperlink w:anchor="_Toc227706883" w:history="1">
+          <w:hyperlink w:anchor="_Toc227765424" w:history="1">
             <w:r>
               <w:rPr>
                 <w:rStyle w:val="Collegamentoipertestuale"/>
@@ -412,7 +412,7 @@
                 <w:noProof/>
                 <w:webHidden/>
               </w:rPr>
-              <w:instrText xml:space="preserve"> PAGEREF _Toc227706883 \h </w:instrText>
+              <w:instrText xml:space="preserve"> PAGEREF _Toc227765424 \h </w:instrText>
             </w:r>
             <w:r>
               <w:rPr>
@@ -456,7 +456,7 @@
               <w:lang w:eastAsia="ja-JP"/>
             </w:rPr>
           </w:pPr>
-          <w:hyperlink w:anchor="_Toc227706884" w:history="1">
+          <w:hyperlink w:anchor="_Toc227765425" w:history="1">
             <w:r>
               <w:rPr>
                 <w:rStyle w:val="Collegamentoipertestuale"/>
@@ -483,7 +483,7 @@
                 <w:noProof/>
                 <w:webHidden/>
               </w:rPr>
-              <w:instrText xml:space="preserve"> PAGEREF _Toc227706884 \h </w:instrText>
+              <w:instrText xml:space="preserve"> PAGEREF _Toc227765425 \h </w:instrText>
             </w:r>
             <w:r>
               <w:rPr>
@@ -527,7 +527,7 @@
               <w:lang w:eastAsia="ja-JP"/>
             </w:rPr>
           </w:pPr>
-          <w:hyperlink w:anchor="_Toc227706885" w:history="1">
+          <w:hyperlink w:anchor="_Toc227765426" w:history="1">
             <w:r>
               <w:rPr>
                 <w:rStyle w:val="Collegamentoipertestuale"/>
@@ -554,7 +554,7 @@
                 <w:noProof/>
                 <w:webHidden/>
               </w:rPr>
-              <w:instrText xml:space="preserve"> PAGEREF _Toc227706885 \h </w:instrText>
+              <w:instrText xml:space="preserve"> PAGEREF _Toc227765426 \h </w:instrText>
             </w:r>
             <w:r>
               <w:rPr>
@@ -598,7 +598,7 @@
               <w:lang w:eastAsia="ja-JP"/>
             </w:rPr>
           </w:pPr>
-          <w:hyperlink w:anchor="_Toc227706886" w:history="1">
+          <w:hyperlink w:anchor="_Toc227765427" w:history="1">
             <w:r>
               <w:rPr>
                 <w:rStyle w:val="Collegamentoipertestuale"/>
@@ -625,7 +625,7 @@
                 <w:noProof/>
                 <w:webHidden/>
               </w:rPr>
-              <w:instrText xml:space="preserve"> PAGEREF _Toc227706886 \h </w:instrText>
+              <w:instrText xml:space="preserve"> PAGEREF _Toc227765427 \h </w:instrText>
             </w:r>
             <w:r>
               <w:rPr>
@@ -669,7 +669,7 @@
               <w:lang w:eastAsia="ja-JP"/>
             </w:rPr>
           </w:pPr>
-          <w:hyperlink w:anchor="_Toc227706887" w:history="1">
+          <w:hyperlink w:anchor="_Toc227765428" w:history="1">
             <w:r>
               <w:rPr>
                 <w:rStyle w:val="Collegamentoipertestuale"/>
@@ -697,7 +697,7 @@
                 <w:noProof/>
                 <w:webHidden/>
               </w:rPr>
-              <w:instrText xml:space="preserve"> PAGEREF _Toc227706887 \h </w:instrText>
+              <w:instrText xml:space="preserve"> PAGEREF _Toc227765428 \h </w:instrText>
             </w:r>
             <w:r>
               <w:rPr>
@@ -741,7 +741,7 @@
               <w:lang w:eastAsia="ja-JP"/>
             </w:rPr>
           </w:pPr>
-          <w:hyperlink w:anchor="_Toc227706888" w:history="1">
+          <w:hyperlink w:anchor="_Toc227765429" w:history="1">
             <w:r>
               <w:rPr>
                 <w:rStyle w:val="Collegamentoipertestuale"/>
@@ -768,7 +768,7 @@
                 <w:noProof/>
                 <w:webHidden/>
               </w:rPr>
-              <w:instrText xml:space="preserve"> PAGEREF _Toc227706888 \h </w:instrText>
+              <w:instrText xml:space="preserve"> PAGEREF _Toc227765429 \h </w:instrText>
             </w:r>
             <w:r>
               <w:rPr>
@@ -812,7 +812,7 @@
               <w:lang w:eastAsia="ja-JP"/>
             </w:rPr>
           </w:pPr>
-          <w:hyperlink w:anchor="_Toc227706889" w:history="1">
+          <w:hyperlink w:anchor="_Toc227765430" w:history="1">
             <w:r>
               <w:rPr>
                 <w:rStyle w:val="Collegamentoipertestuale"/>
@@ -839,7 +839,7 @@
                 <w:noProof/>
                 <w:webHidden/>
               </w:rPr>
-              <w:instrText xml:space="preserve"> PAGEREF _Toc227706889 \h </w:instrText>
+              <w:instrText xml:space="preserve"> PAGEREF _Toc227765430 \h </w:instrText>
             </w:r>
             <w:r>
               <w:rPr>
@@ -883,7 +883,7 @@
               <w:lang w:eastAsia="ja-JP"/>
             </w:rPr>
           </w:pPr>
-          <w:hyperlink w:anchor="_Toc227706890" w:history="1">
+          <w:hyperlink w:anchor="_Toc227765431" w:history="1">
             <w:r>
               <w:rPr>
                 <w:rStyle w:val="Collegamentoipertestuale"/>
@@ -910,7 +910,7 @@
                 <w:noProof/>
                 <w:webHidden/>
               </w:rPr>
-              <w:instrText xml:space="preserve"> PAGEREF _Toc227706890 \h </w:instrText>
+              <w:instrText xml:space="preserve"> PAGEREF _Toc227765431 \h </w:instrText>
             </w:r>
             <w:r>
               <w:rPr>
@@ -954,7 +954,7 @@
               <w:lang w:eastAsia="ja-JP"/>
             </w:rPr>
           </w:pPr>
-          <w:hyperlink w:anchor="_Toc227706891" w:history="1">
+          <w:hyperlink w:anchor="_Toc227765432" w:history="1">
             <w:r>
               <w:rPr>
                 <w:rStyle w:val="Collegamentoipertestuale"/>
@@ -981,7 +981,7 @@
                 <w:noProof/>
                 <w:webHidden/>
               </w:rPr>
-              <w:instrText xml:space="preserve"> PAGEREF _Toc227706891 \h </w:instrText>
+              <w:instrText xml:space="preserve"> PAGEREF _Toc227765432 \h </w:instrText>
             </w:r>
             <w:r>
               <w:rPr>
@@ -1001,7 +1001,7 @@
                 <w:noProof/>
                 <w:webHidden/>
               </w:rPr>
-              <w:t>5</w:t>
+              <w:t>6</w:t>
             </w:r>
             <w:r>
               <w:rPr>
@@ -1025,7 +1025,7 @@
               <w:lang w:eastAsia="ja-JP"/>
             </w:rPr>
           </w:pPr>
-          <w:hyperlink w:anchor="_Toc227706892" w:history="1">
+          <w:hyperlink w:anchor="_Toc227765433" w:history="1">
             <w:r>
               <w:rPr>
                 <w:rStyle w:val="Collegamentoipertestuale"/>
@@ -1052,7 +1052,7 @@
                 <w:noProof/>
                 <w:webHidden/>
               </w:rPr>
-              <w:instrText xml:space="preserve"> PAGEREF _Toc227706892 \h </w:instrText>
+              <w:instrText xml:space="preserve"> PAGEREF _Toc227765433 \h </w:instrText>
             </w:r>
             <w:r>
               <w:rPr>
@@ -1073,6 +1073,219 @@
                 <w:webHidden/>
               </w:rPr>
               <w:t>6</w:t>
+            </w:r>
+            <w:r>
+              <w:rPr>
+                <w:noProof/>
+                <w:webHidden/>
+              </w:rPr>
+              <w:fldChar w:fldCharType="end"/>
+            </w:r>
+          </w:hyperlink>
+        </w:p>
+        <w:p>
+          <w:pPr>
+            <w:pStyle w:val="Sommario2"/>
+            <w:tabs>
+              <w:tab w:val="right" w:leader="dot" w:pos="9628"/>
+            </w:tabs>
+            <w:rPr>
+              <w:rFonts w:eastAsiaTheme="minorEastAsia"/>
+              <w:noProof/>
+              <w:szCs w:val="24"/>
+              <w:lang w:eastAsia="ja-JP"/>
+            </w:rPr>
+          </w:pPr>
+          <w:hyperlink w:anchor="_Toc227765434" w:history="1">
+            <w:r>
+              <w:rPr>
+                <w:rStyle w:val="Collegamentoipertestuale"/>
+                <w:noProof/>
+              </w:rPr>
+              <w:t>2.2 Organizzare il contenuto</w:t>
+            </w:r>
+            <w:r>
+              <w:rPr>
+                <w:noProof/>
+                <w:webHidden/>
+              </w:rPr>
+              <w:tab/>
+            </w:r>
+            <w:r>
+              <w:rPr>
+                <w:noProof/>
+                <w:webHidden/>
+              </w:rPr>
+              <w:fldChar w:fldCharType="begin"/>
+            </w:r>
+            <w:r>
+              <w:rPr>
+                <w:noProof/>
+                <w:webHidden/>
+              </w:rPr>
+              <w:instrText xml:space="preserve"> PAGEREF _Toc227765434 \h </w:instrText>
+            </w:r>
+            <w:r>
+              <w:rPr>
+                <w:noProof/>
+                <w:webHidden/>
+              </w:rPr>
+            </w:r>
+            <w:r>
+              <w:rPr>
+                <w:noProof/>
+                <w:webHidden/>
+              </w:rPr>
+              <w:fldChar w:fldCharType="separate"/>
+            </w:r>
+            <w:r>
+              <w:rPr>
+                <w:noProof/>
+                <w:webHidden/>
+              </w:rPr>
+              <w:t>8</w:t>
+            </w:r>
+            <w:r>
+              <w:rPr>
+                <w:noProof/>
+                <w:webHidden/>
+              </w:rPr>
+              <w:fldChar w:fldCharType="end"/>
+            </w:r>
+          </w:hyperlink>
+        </w:p>
+        <w:p>
+          <w:pPr>
+            <w:pStyle w:val="Sommario1"/>
+            <w:tabs>
+              <w:tab w:val="right" w:leader="dot" w:pos="9628"/>
+            </w:tabs>
+            <w:rPr>
+              <w:rFonts w:eastAsiaTheme="minorEastAsia"/>
+              <w:noProof/>
+              <w:szCs w:val="24"/>
+              <w:lang w:eastAsia="ja-JP"/>
+            </w:rPr>
+          </w:pPr>
+          <w:hyperlink w:anchor="_Toc227765435" w:history="1">
+            <w:r>
+              <w:rPr>
+                <w:rStyle w:val="Collegamentoipertestuale"/>
+                <w:noProof/>
+              </w:rPr>
+              <w:t>3. CSS (Cascading Style Sheets)</w:t>
+            </w:r>
+            <w:r>
+              <w:rPr>
+                <w:noProof/>
+                <w:webHidden/>
+              </w:rPr>
+              <w:tab/>
+            </w:r>
+            <w:r>
+              <w:rPr>
+                <w:noProof/>
+                <w:webHidden/>
+              </w:rPr>
+              <w:fldChar w:fldCharType="begin"/>
+            </w:r>
+            <w:r>
+              <w:rPr>
+                <w:noProof/>
+                <w:webHidden/>
+              </w:rPr>
+              <w:instrText xml:space="preserve"> PAGEREF _Toc227765435 \h </w:instrText>
+            </w:r>
+            <w:r>
+              <w:rPr>
+                <w:noProof/>
+                <w:webHidden/>
+              </w:rPr>
+            </w:r>
+            <w:r>
+              <w:rPr>
+                <w:noProof/>
+                <w:webHidden/>
+              </w:rPr>
+              <w:fldChar w:fldCharType="separate"/>
+            </w:r>
+            <w:r>
+              <w:rPr>
+                <w:noProof/>
+                <w:webHidden/>
+              </w:rPr>
+              <w:t>8</w:t>
+            </w:r>
+            <w:r>
+              <w:rPr>
+                <w:noProof/>
+                <w:webHidden/>
+              </w:rPr>
+              <w:fldChar w:fldCharType="end"/>
+            </w:r>
+          </w:hyperlink>
+        </w:p>
+        <w:p>
+          <w:pPr>
+            <w:pStyle w:val="Sommario1"/>
+            <w:tabs>
+              <w:tab w:val="right" w:leader="dot" w:pos="9628"/>
+            </w:tabs>
+            <w:rPr>
+              <w:rFonts w:eastAsiaTheme="minorEastAsia"/>
+              <w:noProof/>
+              <w:szCs w:val="24"/>
+              <w:lang w:eastAsia="ja-JP"/>
+            </w:rPr>
+          </w:pPr>
+          <w:hyperlink w:anchor="_Toc227765436" w:history="1">
+            <w:r>
+              <w:rPr>
+                <w:rStyle w:val="Collegamentoipertestuale"/>
+                <w:noProof/>
+              </w:rPr>
+              <w:t>4. JavaScript</w:t>
+            </w:r>
+            <w:r>
+              <w:rPr>
+                <w:noProof/>
+                <w:webHidden/>
+              </w:rPr>
+              <w:tab/>
+            </w:r>
+            <w:r>
+              <w:rPr>
+                <w:noProof/>
+                <w:webHidden/>
+              </w:rPr>
+              <w:fldChar w:fldCharType="begin"/>
+            </w:r>
+            <w:r>
+              <w:rPr>
+                <w:noProof/>
+                <w:webHidden/>
+              </w:rPr>
+              <w:instrText xml:space="preserve"> PAGEREF _Toc227765436 \h </w:instrText>
+            </w:r>
+            <w:r>
+              <w:rPr>
+                <w:noProof/>
+                <w:webHidden/>
+              </w:rPr>
+            </w:r>
+            <w:r>
+              <w:rPr>
+                <w:noProof/>
+                <w:webHidden/>
+              </w:rPr>
+              <w:fldChar w:fldCharType="separate"/>
+            </w:r>
+            <w:r>
+              <w:rPr>
+                <w:noProof/>
+                <w:webHidden/>
+              </w:rPr>
+              <w:t>8</w:t>
             </w:r>
             <w:r>
               <w:rPr>
@@ -1105,7 +1318,7 @@
       <w:pPr>
         <w:pStyle w:val="Titolo1"/>
       </w:pPr>
-      <w:bookmarkStart w:id="0" w:name="_Toc227706883"/>
+      <w:bookmarkStart w:id="0" w:name="_Toc227765424"/>
       <w:r>
         <w:lastRenderedPageBreak/>
         <w:t>0. Premessa</w:t>
@@ -1270,7 +1483,7 @@
       <w:pPr>
         <w:pStyle w:val="Titolo2"/>
       </w:pPr>
-      <w:bookmarkStart w:id="1" w:name="_Toc227706884"/>
+      <w:bookmarkStart w:id="1" w:name="_Toc227765425"/>
       <w:r>
         <w:t xml:space="preserve">0.1 </w:t>
       </w:r>
@@ -1461,7 +1674,7 @@
       <w:pPr>
         <w:pStyle w:val="Titolo2"/>
       </w:pPr>
-      <w:bookmarkStart w:id="2" w:name="_Toc227706885"/>
+      <w:bookmarkStart w:id="2" w:name="_Toc227765426"/>
       <w:r>
         <w:t>0.2 Collaboratori</w:t>
       </w:r>
@@ -1553,7 +1766,7 @@
       <w:pPr>
         <w:pStyle w:val="Titolo2"/>
       </w:pPr>
-      <w:bookmarkStart w:id="3" w:name="_Toc227706886"/>
+      <w:bookmarkStart w:id="3" w:name="_Toc227765427"/>
       <w:r>
         <w:t>0.</w:t>
       </w:r>
@@ -1696,7 +1909,7 @@
           <w:lang w:val="en-GB"/>
         </w:rPr>
       </w:pPr>
-      <w:bookmarkStart w:id="4" w:name="_Toc227706887"/>
+      <w:bookmarkStart w:id="4" w:name="_Toc227765428"/>
       <w:r>
         <w:rPr>
           <w:lang w:val="en-GB"/>
@@ -1859,7 +2072,7 @@
       <w:pPr>
         <w:pStyle w:val="Titolo1"/>
       </w:pPr>
-      <w:bookmarkStart w:id="5" w:name="_Toc227706888"/>
+      <w:bookmarkStart w:id="5" w:name="_Toc227765429"/>
       <w:r>
         <w:lastRenderedPageBreak/>
         <w:t>1. Introduzione</w:t>
@@ -2274,7 +2487,7 @@
       <w:pPr>
         <w:pStyle w:val="Titolo2"/>
       </w:pPr>
-      <w:bookmarkStart w:id="6" w:name="_Toc227706889"/>
+      <w:bookmarkStart w:id="6" w:name="_Toc227765430"/>
       <w:r>
         <w:t>1.1 HTTP (HyperText Transfer Protocol)</w:t>
       </w:r>
@@ -2824,7 +3037,7 @@
       <w:pPr>
         <w:pStyle w:val="Titolo2"/>
       </w:pPr>
-      <w:bookmarkStart w:id="7" w:name="_Toc227706890"/>
+      <w:bookmarkStart w:id="7" w:name="_Toc227765431"/>
       <w:r>
         <w:lastRenderedPageBreak/>
         <w:t>1.2 URL (Uniform Resource Locator)</w:t>
@@ -2833,7 +3046,13 @@
     </w:p>
     <w:p>
       <w:r>
-        <w:t>Sul web, le risorse e la loro posizione sono identificate dagli URL (Uniform Resource Locator), che seguono il formato:</w:t>
+        <w:t xml:space="preserve">Sul web, le risorse e la loro posizione sono identificate dagli URL (Uniform Resource Locator), </w:t>
+      </w:r>
+      <w:r>
+        <w:t xml:space="preserve">seguendo </w:t>
+      </w:r>
+      <w:r>
+        <w:t>il formato:</w:t>
       </w:r>
     </w:p>
     <w:p>
@@ -2845,8 +3064,8 @@
           <w:noProof/>
         </w:rPr>
         <w:drawing>
-          <wp:inline distT="0" distB="0" distL="0" distR="0" wp14:anchorId="2EDB2813" wp14:editId="3769D1D6">
-            <wp:extent cx="4726858" cy="729283"/>
+          <wp:inline distT="0" distB="0" distL="0" distR="0" wp14:anchorId="2EDB2813" wp14:editId="24495408">
+            <wp:extent cx="6117852" cy="592667"/>
             <wp:effectExtent l="0" t="0" r="0" b="0"/>
             <wp:docPr id="778375113" name="Immagine 3"/>
             <wp:cNvGraphicFramePr>
@@ -2856,7 +3075,7 @@
               <a:graphicData uri="http://schemas.openxmlformats.org/drawingml/2006/picture">
                 <pic:pic xmlns:pic="http://schemas.openxmlformats.org/drawingml/2006/picture">
                   <pic:nvPicPr>
-                    <pic:cNvPr id="778375113" name="Immagine 778375113"/>
+                    <pic:cNvPr id="778375113" name="Immagine 3"/>
                     <pic:cNvPicPr/>
                   </pic:nvPicPr>
                   <pic:blipFill>
@@ -2874,7 +3093,7 @@
                   <pic:spPr>
                     <a:xfrm>
                       <a:off x="0" y="0"/>
-                      <a:ext cx="4774614" cy="736651"/>
+                      <a:ext cx="6173428" cy="598051"/>
                     </a:xfrm>
                     <a:prstGeom prst="rect">
                       <a:avLst/>
@@ -2989,11 +3208,51 @@
       </w:r>
     </w:p>
     <w:p>
+      <w:r>
+        <w:t xml:space="preserve">5. Query: </w:t>
+      </w:r>
+      <w:r>
+        <w:t xml:space="preserve">(opzionale) </w:t>
+      </w:r>
+      <w:r>
+        <w:t xml:space="preserve">insieme di parametri inviati al server per specificare o filtrare la richiesta. È composta da coppie </w:t>
+      </w:r>
+      <w:r>
+        <w:t xml:space="preserve">nel formato </w:t>
+      </w:r>
+      <w:r>
+        <w:rPr>
+          <w:i/>
+          <w:iCs/>
+        </w:rPr>
+        <w:t>chiave=valore</w:t>
+      </w:r>
+      <w:r>
+        <w:t xml:space="preserve"> separate da </w:t>
+      </w:r>
+      <w:r>
+        <w:rPr>
+          <w:i/>
+          <w:iCs/>
+        </w:rPr>
+        <w:t>&amp;</w:t>
+      </w:r>
+      <w:r>
+        <w:t>.</w:t>
+      </w:r>
+    </w:p>
+    <w:p>
+      <w:r>
+        <w:br w:type="page"/>
+      </w:r>
+    </w:p>
+    <w:p>
       <w:pPr>
         <w:pStyle w:val="Titolo1"/>
       </w:pPr>
-      <w:bookmarkStart w:id="8" w:name="_Toc227706891"/>
-      <w:r>
+      <w:bookmarkStart w:id="8" w:name="_Toc227765432"/>
+      <w:r>
+        <w:lastRenderedPageBreak/>
         <w:t>2. HTML (HyperText Markup Language)</w:t>
       </w:r>
       <w:bookmarkEnd w:id="8"/>
@@ -3295,7 +3554,6 @@
     </w:p>
     <w:p>
       <w:r>
-        <w:lastRenderedPageBreak/>
         <w:t>I metadati (</w:t>
       </w:r>
       <w:r>
@@ -3344,7 +3602,7 @@
       <w:pPr>
         <w:pStyle w:val="Titolo2"/>
       </w:pPr>
-      <w:bookmarkStart w:id="9" w:name="_Toc227706892"/>
+      <w:bookmarkStart w:id="9" w:name="_Toc227765433"/>
       <w:r>
         <w:t>2.1 Semantica dei Tag</w:t>
       </w:r>
@@ -3457,10 +3715,7 @@
         <w:t>la numerazione è in ordine di grandezza</w:t>
       </w:r>
       <w:r>
-        <w:t>)</w:t>
-      </w:r>
-      <w:r>
-        <w:t xml:space="preserve"> e </w:t>
+        <w:t xml:space="preserve">) e </w:t>
       </w:r>
       <w:r>
         <w:rPr>
@@ -3598,10 +3853,7 @@
               <w:t xml:space="preserve">&lt;strong&gt; </w:t>
             </w:r>
             <w:r>
-              <w:t>caratteri in</w:t>
-            </w:r>
-            <w:r>
-              <w:t xml:space="preserve"> grassetto</w:t>
+              <w:t>caratteri in grassetto</w:t>
             </w:r>
           </w:p>
         </w:tc>
@@ -3688,6 +3940,7 @@
           <w:b/>
           <w:bCs/>
         </w:rPr>
+        <w:lastRenderedPageBreak/>
         <w:br/>
       </w:r>
       <w:r>
@@ -3771,7 +4024,7 @@
         <w:t xml:space="preserve">, </w:t>
       </w:r>
       <w:r>
-        <w:t>il cui path</w:t>
+        <w:t>che</w:t>
       </w:r>
       <w:r>
         <w:t xml:space="preserve"> può essere </w:t>
@@ -4105,7 +4358,13 @@
         <w:t>&lt;ol&gt;</w:t>
       </w:r>
       <w:r>
-        <w:t xml:space="preserve"> per liste ordinate (enumerazioni), </w:t>
+        <w:t xml:space="preserve"> per liste ordinate (</w:t>
+      </w:r>
+      <w:r>
+        <w:t>elenchi numerati</w:t>
+      </w:r>
+      <w:r>
+        <w:t xml:space="preserve">), </w:t>
       </w:r>
       <w:r>
         <w:rPr>
@@ -4159,7 +4418,13 @@
           <w:sz w:val="22"/>
           <w:szCs w:val="21"/>
         </w:rPr>
-        <w:br/>
+        <w:t xml:space="preserve"> </w:t>
+      </w:r>
+      <w:r>
+        <w:rPr>
+          <w:sz w:val="22"/>
+          <w:szCs w:val="21"/>
+        </w:rPr>
         <w:t xml:space="preserve">I singoli elementi della lista sono invece definiti dal tag </w:t>
       </w:r>
       <w:r>
@@ -4349,6 +4614,873 @@
         </w:rPr>
         <w:br/>
         <w:t>Il browser effettua una richiesta HTTP per fare il retrieve della risorsa (l’immagine).</w:t>
+      </w:r>
+    </w:p>
+    <w:p>
+      <w:pPr>
+        <w:rPr>
+          <w:sz w:val="22"/>
+        </w:rPr>
+      </w:pPr>
+      <w:r>
+        <w:rPr>
+          <w:b/>
+          <w:bCs/>
+          <w:szCs w:val="24"/>
+        </w:rPr>
+        <w:t>FORMS</w:t>
+      </w:r>
+      <w:r>
+        <w:rPr>
+          <w:b/>
+          <w:bCs/>
+          <w:szCs w:val="24"/>
+        </w:rPr>
+        <w:br/>
+      </w:r>
+      <w:r>
+        <w:rPr>
+          <w:szCs w:val="24"/>
+        </w:rPr>
+        <w:t xml:space="preserve">I form sono </w:t>
+      </w:r>
+      <w:r>
+        <w:rPr>
+          <w:szCs w:val="24"/>
+        </w:rPr>
+        <w:t xml:space="preserve">indicati dal tag </w:t>
+      </w:r>
+      <w:r>
+        <w:rPr>
+          <w:b/>
+          <w:bCs/>
+          <w:szCs w:val="24"/>
+        </w:rPr>
+        <w:t xml:space="preserve">&lt;form&gt; </w:t>
+      </w:r>
+      <w:r>
+        <w:rPr>
+          <w:szCs w:val="24"/>
+        </w:rPr>
+        <w:t xml:space="preserve">e sono </w:t>
+      </w:r>
+      <w:r>
+        <w:rPr>
+          <w:szCs w:val="24"/>
+        </w:rPr>
+        <w:t>elementi usati per ricevere input dall’utente</w:t>
+      </w:r>
+      <w:r>
+        <w:rPr>
+          <w:szCs w:val="24"/>
+        </w:rPr>
+        <w:t xml:space="preserve">; </w:t>
+      </w:r>
+      <w:r>
+        <w:rPr>
+          <w:szCs w:val="24"/>
+        </w:rPr>
+        <w:t>tramite il tag</w:t>
+      </w:r>
+      <w:r>
+        <w:rPr>
+          <w:szCs w:val="24"/>
+        </w:rPr>
+        <w:t xml:space="preserve"> </w:t>
+      </w:r>
+      <w:r>
+        <w:rPr>
+          <w:b/>
+          <w:bCs/>
+          <w:szCs w:val="24"/>
+        </w:rPr>
+        <w:t>&lt;label&gt;</w:t>
+      </w:r>
+      <w:r>
+        <w:rPr>
+          <w:szCs w:val="24"/>
+        </w:rPr>
+        <w:t xml:space="preserve"> </w:t>
+      </w:r>
+      <w:r>
+        <w:rPr>
+          <w:szCs w:val="24"/>
+        </w:rPr>
+        <w:t xml:space="preserve">si assegna un nome ai singoli input, utilizzando l’attributo </w:t>
+      </w:r>
+      <w:r>
+        <w:rPr>
+          <w:i/>
+          <w:iCs/>
+          <w:szCs w:val="24"/>
+        </w:rPr>
+        <w:t>for</w:t>
+      </w:r>
+      <w:r>
+        <w:rPr>
+          <w:szCs w:val="24"/>
+        </w:rPr>
+        <w:t xml:space="preserve"> (con valore l’</w:t>
+      </w:r>
+      <w:r>
+        <w:rPr>
+          <w:i/>
+          <w:iCs/>
+          <w:szCs w:val="24"/>
+        </w:rPr>
+        <w:t>id</w:t>
+      </w:r>
+      <w:r>
+        <w:rPr>
+          <w:szCs w:val="24"/>
+        </w:rPr>
+        <w:t xml:space="preserve"> dell’input corrispondente). Per quanto riguarda gli </w:t>
+      </w:r>
+      <w:r>
+        <w:rPr>
+          <w:b/>
+          <w:bCs/>
+          <w:szCs w:val="24"/>
+        </w:rPr>
+        <w:t>&lt;input&gt;</w:t>
+      </w:r>
+      <w:r>
+        <w:rPr>
+          <w:szCs w:val="24"/>
+        </w:rPr>
+        <w:t xml:space="preserve">, ovvero gli effettivi elementi da compilare in un form, ne esistono di vario tipo, specificati dall’attributo </w:t>
+      </w:r>
+      <w:r>
+        <w:rPr>
+          <w:i/>
+          <w:iCs/>
+          <w:szCs w:val="24"/>
+        </w:rPr>
+        <w:t>type</w:t>
+      </w:r>
+      <w:r>
+        <w:rPr>
+          <w:szCs w:val="24"/>
+        </w:rPr>
+        <w:t xml:space="preserve"> (possono essere </w:t>
+      </w:r>
+      <w:r>
+        <w:rPr>
+          <w:i/>
+          <w:iCs/>
+          <w:szCs w:val="24"/>
+        </w:rPr>
+        <w:t>“text”, “password”, “number”, “radio”, “checkbox”, “button”, “date”, “select”)</w:t>
+      </w:r>
+      <w:r>
+        <w:rPr>
+          <w:szCs w:val="24"/>
+        </w:rPr>
+        <w:t>.</w:t>
+      </w:r>
+    </w:p>
+    <w:p>
+      <w:pPr>
+        <w:rPr>
+          <w:szCs w:val="24"/>
+        </w:rPr>
+      </w:pPr>
+      <w:r>
+        <w:rPr>
+          <w:szCs w:val="24"/>
+        </w:rPr>
+        <w:t>I form possono essere</w:t>
+      </w:r>
+      <w:r>
+        <w:rPr>
+          <w:szCs w:val="24"/>
+        </w:rPr>
+        <w:t xml:space="preserve"> inviati</w:t>
+      </w:r>
+      <w:r>
+        <w:rPr>
+          <w:szCs w:val="24"/>
+        </w:rPr>
+        <w:t xml:space="preserve"> </w:t>
+      </w:r>
+      <w:r>
+        <w:rPr>
+          <w:i/>
+          <w:iCs/>
+          <w:szCs w:val="24"/>
+        </w:rPr>
+        <w:t>(</w:t>
+      </w:r>
+      <w:r>
+        <w:rPr>
+          <w:i/>
+          <w:iCs/>
+          <w:szCs w:val="24"/>
+        </w:rPr>
+        <w:t>submitted</w:t>
+      </w:r>
+      <w:r>
+        <w:rPr>
+          <w:i/>
+          <w:iCs/>
+          <w:szCs w:val="24"/>
+        </w:rPr>
+        <w:t>)</w:t>
+      </w:r>
+      <w:r>
+        <w:rPr>
+          <w:szCs w:val="24"/>
+        </w:rPr>
+        <w:t xml:space="preserve"> </w:t>
+      </w:r>
+      <w:r>
+        <w:rPr>
+          <w:szCs w:val="24"/>
+        </w:rPr>
+        <w:t>ad</w:t>
+      </w:r>
+      <w:r>
+        <w:rPr>
+          <w:szCs w:val="24"/>
+        </w:rPr>
+        <w:t xml:space="preserve"> un </w:t>
+      </w:r>
+      <w:r>
+        <w:rPr>
+          <w:i/>
+          <w:iCs/>
+          <w:szCs w:val="24"/>
+        </w:rPr>
+        <w:t>handler</w:t>
+      </w:r>
+      <w:r>
+        <w:rPr>
+          <w:szCs w:val="24"/>
+        </w:rPr>
+        <w:t xml:space="preserve"> tramite richiesta HTTP</w:t>
+      </w:r>
+      <w:r>
+        <w:rPr>
+          <w:szCs w:val="24"/>
+        </w:rPr>
+        <w:t>: l’</w:t>
+      </w:r>
+      <w:r>
+        <w:rPr>
+          <w:i/>
+          <w:iCs/>
+          <w:szCs w:val="24"/>
+        </w:rPr>
+        <w:t>URL</w:t>
+      </w:r>
+      <w:r>
+        <w:rPr>
+          <w:szCs w:val="24"/>
+        </w:rPr>
+        <w:t xml:space="preserve"> dell’</w:t>
+      </w:r>
+      <w:r>
+        <w:rPr>
+          <w:i/>
+          <w:iCs/>
+          <w:szCs w:val="24"/>
+        </w:rPr>
+        <w:t>handler</w:t>
+      </w:r>
+      <w:r>
+        <w:rPr>
+          <w:szCs w:val="24"/>
+        </w:rPr>
+        <w:t xml:space="preserve"> (a cui viene mandata la richiesta) è specificato dall’attributo </w:t>
+      </w:r>
+      <w:r>
+        <w:rPr>
+          <w:i/>
+          <w:iCs/>
+          <w:szCs w:val="24"/>
+        </w:rPr>
+        <w:t>action</w:t>
+      </w:r>
+      <w:r>
+        <w:rPr>
+          <w:i/>
+          <w:iCs/>
+          <w:szCs w:val="24"/>
+        </w:rPr>
+        <w:t>,</w:t>
+      </w:r>
+      <w:r>
+        <w:rPr>
+          <w:i/>
+          <w:iCs/>
+          <w:szCs w:val="24"/>
+        </w:rPr>
+        <w:t xml:space="preserve"> </w:t>
+      </w:r>
+      <w:r>
+        <w:rPr>
+          <w:szCs w:val="24"/>
+        </w:rPr>
+        <w:t>mentre per</w:t>
+      </w:r>
+      <w:r>
+        <w:rPr>
+          <w:szCs w:val="24"/>
+        </w:rPr>
+        <w:t xml:space="preserve"> specificare il metodo</w:t>
+      </w:r>
+      <w:r>
+        <w:rPr>
+          <w:szCs w:val="24"/>
+        </w:rPr>
+        <w:t xml:space="preserve"> </w:t>
+      </w:r>
+      <w:r>
+        <w:rPr>
+          <w:szCs w:val="24"/>
+        </w:rPr>
+        <w:t>da usare tramite</w:t>
+      </w:r>
+      <w:r>
+        <w:rPr>
+          <w:szCs w:val="24"/>
+        </w:rPr>
+        <w:t xml:space="preserve"> nella richiesta, si usa</w:t>
+      </w:r>
+      <w:r>
+        <w:rPr>
+          <w:szCs w:val="24"/>
+        </w:rPr>
+        <w:t xml:space="preserve"> l’attributo </w:t>
+      </w:r>
+      <w:r>
+        <w:rPr>
+          <w:i/>
+          <w:iCs/>
+          <w:szCs w:val="24"/>
+        </w:rPr>
+        <w:t xml:space="preserve">method </w:t>
+      </w:r>
+      <w:r>
+        <w:rPr>
+          <w:szCs w:val="24"/>
+        </w:rPr>
+        <w:t xml:space="preserve">(quello di default è </w:t>
+      </w:r>
+      <w:r>
+        <w:rPr>
+          <w:i/>
+          <w:iCs/>
+          <w:szCs w:val="24"/>
+        </w:rPr>
+        <w:t>GET</w:t>
+      </w:r>
+      <w:r>
+        <w:rPr>
+          <w:szCs w:val="24"/>
+        </w:rPr>
+        <w:t>).</w:t>
+      </w:r>
+      <w:r>
+        <w:rPr>
+          <w:szCs w:val="24"/>
+        </w:rPr>
+        <w:t xml:space="preserve"> </w:t>
+      </w:r>
+      <w:r>
+        <w:rPr>
+          <w:szCs w:val="24"/>
+        </w:rPr>
+        <w:br/>
+      </w:r>
+      <w:r>
+        <w:rPr>
+          <w:szCs w:val="24"/>
+        </w:rPr>
+        <w:t xml:space="preserve">Al momento della </w:t>
+      </w:r>
+      <w:r>
+        <w:rPr>
+          <w:i/>
+          <w:iCs/>
+          <w:szCs w:val="24"/>
+        </w:rPr>
+        <w:t>submission</w:t>
+      </w:r>
+      <w:r>
+        <w:rPr>
+          <w:szCs w:val="24"/>
+        </w:rPr>
+        <w:t xml:space="preserve"> i valori presi dall’input sono rappresentati come una serie di coppie nome/valore</w:t>
+      </w:r>
+      <w:r>
+        <w:rPr>
+          <w:szCs w:val="24"/>
+        </w:rPr>
+        <w:t xml:space="preserve">, concatenati dal simbolo </w:t>
+      </w:r>
+      <w:r>
+        <w:rPr>
+          <w:i/>
+          <w:iCs/>
+          <w:szCs w:val="24"/>
+        </w:rPr>
+        <w:t>&amp;</w:t>
+      </w:r>
+      <w:r>
+        <w:rPr>
+          <w:szCs w:val="24"/>
+        </w:rPr>
+        <w:t>, dove ogni nome corrisponde all’elemento del form.</w:t>
+      </w:r>
+      <w:r>
+        <w:rPr>
+          <w:szCs w:val="24"/>
+        </w:rPr>
+        <w:t xml:space="preserve"> Se il metodo utilizzato è </w:t>
+      </w:r>
+      <w:r>
+        <w:rPr>
+          <w:i/>
+          <w:iCs/>
+          <w:szCs w:val="24"/>
+        </w:rPr>
+        <w:t>GET</w:t>
+      </w:r>
+      <w:r>
+        <w:rPr>
+          <w:szCs w:val="24"/>
+        </w:rPr>
+        <w:t>, gli input vengono concatenati all’</w:t>
+      </w:r>
+      <w:r>
+        <w:rPr>
+          <w:i/>
+          <w:iCs/>
+          <w:szCs w:val="24"/>
+        </w:rPr>
+        <w:t>URL</w:t>
+      </w:r>
+      <w:r>
+        <w:rPr>
+          <w:szCs w:val="24"/>
+        </w:rPr>
+        <w:t xml:space="preserve"> dell’handler</w:t>
+      </w:r>
+      <w:r>
+        <w:rPr>
+          <w:szCs w:val="24"/>
+        </w:rPr>
+        <w:t xml:space="preserve"> come </w:t>
+      </w:r>
+      <w:r>
+        <w:rPr>
+          <w:b/>
+          <w:bCs/>
+          <w:szCs w:val="24"/>
+        </w:rPr>
+        <w:t>query parameters</w:t>
+      </w:r>
+      <w:r>
+        <w:rPr>
+          <w:szCs w:val="24"/>
+        </w:rPr>
+        <w:t>, mentre se il metodo è POST, vengono inviati nel body della richiesta.</w:t>
+      </w:r>
+      <w:r>
+        <w:rPr>
+          <w:szCs w:val="24"/>
+        </w:rPr>
+        <w:t xml:space="preserve"> È possibile </w:t>
+      </w:r>
+      <w:r>
+        <w:rPr>
+          <w:szCs w:val="24"/>
+        </w:rPr>
+        <w:t xml:space="preserve">raggruppare diversi input all’interno di un </w:t>
+      </w:r>
+      <w:r>
+        <w:rPr>
+          <w:b/>
+          <w:bCs/>
+          <w:szCs w:val="24"/>
+        </w:rPr>
+        <w:t>&lt;fieldset&gt;</w:t>
+      </w:r>
+      <w:r>
+        <w:rPr>
+          <w:szCs w:val="24"/>
+        </w:rPr>
+        <w:t>,</w:t>
+      </w:r>
+      <w:r>
+        <w:rPr>
+          <w:szCs w:val="24"/>
+        </w:rPr>
+        <w:t xml:space="preserve"> al quale si può dare un titolo con</w:t>
+      </w:r>
+      <w:r>
+        <w:rPr>
+          <w:szCs w:val="24"/>
+        </w:rPr>
+        <w:t xml:space="preserve"> </w:t>
+      </w:r>
+      <w:r>
+        <w:rPr>
+          <w:b/>
+          <w:bCs/>
+          <w:szCs w:val="24"/>
+        </w:rPr>
+        <w:t>&lt;legend&gt;</w:t>
+      </w:r>
+      <w:r>
+        <w:rPr>
+          <w:szCs w:val="24"/>
+        </w:rPr>
+        <w:t>.</w:t>
+      </w:r>
+    </w:p>
+    <w:p>
+      <w:pPr>
+        <w:rPr>
+          <w:szCs w:val="24"/>
+        </w:rPr>
+      </w:pPr>
+      <w:r>
+        <w:rPr>
+          <w:szCs w:val="24"/>
+        </w:rPr>
+        <w:br w:type="page"/>
+      </w:r>
+    </w:p>
+    <w:p>
+      <w:pPr>
+        <w:pStyle w:val="Titolo2"/>
+      </w:pPr>
+      <w:bookmarkStart w:id="10" w:name="_Toc227765434"/>
+      <w:r>
+        <w:lastRenderedPageBreak/>
+        <w:t>2.2 Organizzare il contenuto</w:t>
+      </w:r>
+      <w:bookmarkEnd w:id="10"/>
+    </w:p>
+    <w:p>
+      <w:r>
+        <w:rPr>
+          <w:b/>
+          <w:bCs/>
+          <w:noProof/>
+        </w:rPr>
+        <w:drawing>
+          <wp:anchor distT="0" distB="0" distL="114300" distR="114300" simplePos="0" relativeHeight="251660288" behindDoc="0" locked="0" layoutInCell="1" allowOverlap="1" wp14:anchorId="33E7BF1E" wp14:editId="4AFA16B6">
+            <wp:simplePos x="0" y="0"/>
+            <wp:positionH relativeFrom="margin">
+              <wp:posOffset>4401820</wp:posOffset>
+            </wp:positionH>
+            <wp:positionV relativeFrom="paragraph">
+              <wp:posOffset>525145</wp:posOffset>
+            </wp:positionV>
+            <wp:extent cx="1287780" cy="1652270"/>
+            <wp:effectExtent l="0" t="0" r="7620" b="5080"/>
+            <wp:wrapSquare wrapText="bothSides"/>
+            <wp:docPr id="2034502905" name="Immagine 3"/>
+            <wp:cNvGraphicFramePr>
+              <a:graphicFrameLocks xmlns:a="http://schemas.openxmlformats.org/drawingml/2006/main" noChangeAspect="1"/>
+            </wp:cNvGraphicFramePr>
+            <a:graphic xmlns:a="http://schemas.openxmlformats.org/drawingml/2006/main">
+              <a:graphicData uri="http://schemas.openxmlformats.org/drawingml/2006/picture">
+                <pic:pic xmlns:pic="http://schemas.openxmlformats.org/drawingml/2006/picture">
+                  <pic:nvPicPr>
+                    <pic:cNvPr id="2034502905" name="Immagine 2034502905"/>
+                    <pic:cNvPicPr/>
+                  </pic:nvPicPr>
+                  <pic:blipFill>
+                    <a:blip r:embed="rId15" cstate="print">
+                      <a:extLst>
+                        <a:ext uri="{28A0092B-C50C-407E-A947-70E740481C1C}">
+                          <a14:useLocalDpi xmlns:a14="http://schemas.microsoft.com/office/drawing/2010/main" val="0"/>
+                        </a:ext>
+                      </a:extLst>
+                    </a:blip>
+                    <a:stretch>
+                      <a:fillRect/>
+                    </a:stretch>
+                  </pic:blipFill>
+                  <pic:spPr>
+                    <a:xfrm>
+                      <a:off x="0" y="0"/>
+                      <a:ext cx="1287780" cy="1652270"/>
+                    </a:xfrm>
+                    <a:prstGeom prst="rect">
+                      <a:avLst/>
+                    </a:prstGeom>
+                  </pic:spPr>
+                </pic:pic>
+              </a:graphicData>
+            </a:graphic>
+            <wp14:sizeRelH relativeFrom="margin">
+              <wp14:pctWidth>0</wp14:pctWidth>
+            </wp14:sizeRelH>
+            <wp14:sizeRelV relativeFrom="margin">
+              <wp14:pctHeight>0</wp14:pctHeight>
+            </wp14:sizeRelV>
+          </wp:anchor>
+        </w:drawing>
+      </w:r>
+      <w:r>
+        <w:t xml:space="preserve">Nelle versioni più vecchie di HTML si utilizzava spesso </w:t>
+      </w:r>
+      <w:r>
+        <w:rPr>
+          <w:b/>
+          <w:bCs/>
+        </w:rPr>
+        <w:t>&lt;div&gt;</w:t>
+      </w:r>
+      <w:r>
+        <w:t>, un tag la cui unica funzione è semplicemente raggruppare contenuti correlati tra loro.</w:t>
+      </w:r>
+      <w:r>
+        <w:t xml:space="preserve"> S</w:t>
+      </w:r>
+      <w:r>
+        <w:t>ono</w:t>
+      </w:r>
+      <w:r>
+        <w:t xml:space="preserve"> poi</w:t>
+      </w:r>
+      <w:r>
+        <w:t xml:space="preserve"> stati introdotti i tag</w:t>
+      </w:r>
+      <w:r>
+        <w:t xml:space="preserve"> semantici</w:t>
+      </w:r>
+      <w:r>
+        <w:t>, che riarrangiano il contenuto di una pagina in modo più coerente</w:t>
+      </w:r>
+      <w:r>
+        <w:t>:</w:t>
+      </w:r>
+    </w:p>
+    <w:p>
+      <w:pPr>
+        <w:pStyle w:val="Paragrafoelenco"/>
+        <w:numPr>
+          <w:ilvl w:val="0"/>
+          <w:numId w:val="48"/>
+        </w:numPr>
+      </w:pPr>
+      <w:r>
+        <w:rPr>
+          <w:b/>
+          <w:bCs/>
+        </w:rPr>
+        <w:t>H</w:t>
+      </w:r>
+      <w:r>
+        <w:rPr>
+          <w:b/>
+          <w:bCs/>
+        </w:rPr>
+        <w:t>eader</w:t>
+      </w:r>
+      <w:r>
+        <w:rPr>
+          <w:b/>
+          <w:bCs/>
+        </w:rPr>
+        <w:t>:</w:t>
+      </w:r>
+      <w:r>
+        <w:t xml:space="preserve"> l’intestazione</w:t>
+      </w:r>
+      <w:r>
+        <w:t xml:space="preserve"> del documento</w:t>
+      </w:r>
+      <w:r>
+        <w:t>.</w:t>
+      </w:r>
+    </w:p>
+    <w:p>
+      <w:pPr>
+        <w:pStyle w:val="Paragrafoelenco"/>
+        <w:numPr>
+          <w:ilvl w:val="0"/>
+          <w:numId w:val="48"/>
+        </w:numPr>
+      </w:pPr>
+      <w:r>
+        <w:rPr>
+          <w:b/>
+          <w:bCs/>
+        </w:rPr>
+        <w:t xml:space="preserve">Nav: </w:t>
+      </w:r>
+      <w:r>
+        <w:t>usato per la barra di navigazione.</w:t>
+      </w:r>
+    </w:p>
+    <w:p>
+      <w:pPr>
+        <w:pStyle w:val="Paragrafoelenco"/>
+        <w:numPr>
+          <w:ilvl w:val="0"/>
+          <w:numId w:val="48"/>
+        </w:numPr>
+      </w:pPr>
+      <w:r>
+        <w:rPr>
+          <w:b/>
+          <w:bCs/>
+        </w:rPr>
+        <w:t xml:space="preserve">Main: </w:t>
+      </w:r>
+      <w:r>
+        <w:t>indica il contenuto principale</w:t>
+      </w:r>
+      <w:r>
+        <w:t>.</w:t>
+      </w:r>
+    </w:p>
+    <w:p>
+      <w:pPr>
+        <w:pStyle w:val="Paragrafoelenco"/>
+        <w:numPr>
+          <w:ilvl w:val="0"/>
+          <w:numId w:val="48"/>
+        </w:numPr>
+      </w:pPr>
+      <w:r>
+        <w:rPr>
+          <w:b/>
+          <w:bCs/>
+        </w:rPr>
+        <w:t xml:space="preserve">Aside: </w:t>
+      </w:r>
+      <w:r>
+        <w:t>contenuti trasversali o laterali</w:t>
+      </w:r>
+      <w:r>
+        <w:t xml:space="preserve"> (come adv).</w:t>
+      </w:r>
+    </w:p>
+    <w:p>
+      <w:pPr>
+        <w:pStyle w:val="Paragrafoelenco"/>
+        <w:numPr>
+          <w:ilvl w:val="0"/>
+          <w:numId w:val="48"/>
+        </w:numPr>
+      </w:pPr>
+      <w:r>
+        <w:rPr>
+          <w:b/>
+          <w:bCs/>
+        </w:rPr>
+        <w:t xml:space="preserve">Footer: </w:t>
+      </w:r>
+      <w:r>
+        <w:t>indica il piè di pagina.</w:t>
+      </w:r>
+    </w:p>
+    <w:p>
+      <w:pPr>
+        <w:pStyle w:val="Paragrafoelenco"/>
+        <w:numPr>
+          <w:ilvl w:val="0"/>
+          <w:numId w:val="48"/>
+        </w:numPr>
+      </w:pPr>
+      <w:r>
+        <w:rPr>
+          <w:b/>
+          <w:bCs/>
+        </w:rPr>
+        <w:t xml:space="preserve">Article: </w:t>
+      </w:r>
+      <w:r>
+        <w:t>usato per contenuto indipendente</w:t>
+      </w:r>
+      <w:r>
+        <w:t>.</w:t>
+      </w:r>
+    </w:p>
+    <w:p>
+      <w:pPr>
+        <w:pStyle w:val="Paragrafoelenco"/>
+        <w:numPr>
+          <w:ilvl w:val="0"/>
+          <w:numId w:val="48"/>
+        </w:numPr>
+      </w:pPr>
+      <w:r>
+        <w:rPr>
+          <w:b/>
+          <w:bCs/>
+        </w:rPr>
+        <w:t xml:space="preserve">Section: </w:t>
+      </w:r>
+      <w:r>
+        <w:t xml:space="preserve">sessioni </w:t>
+      </w:r>
+      <w:r>
+        <w:t xml:space="preserve">interne </w:t>
+      </w:r>
+      <w:r>
+        <w:t>a sé stanti</w:t>
+      </w:r>
+      <w:r>
+        <w:t>.</w:t>
+      </w:r>
+    </w:p>
+    <w:p>
+      <w:pPr>
+        <w:pStyle w:val="Titolo1"/>
+      </w:pPr>
+      <w:bookmarkStart w:id="11" w:name="_Toc227765435"/>
+      <w:r>
+        <w:t>3. CSS (Cascading Style Sheets)</w:t>
+      </w:r>
+      <w:bookmarkEnd w:id="11"/>
+    </w:p>
+    <w:p>
+      <w:pPr>
+        <w:rPr>
+          <w:i/>
+          <w:iCs/>
+        </w:rPr>
+      </w:pPr>
+      <w:r>
+        <w:rPr>
+          <w:i/>
+          <w:iCs/>
+        </w:rPr>
+        <w:t>Placeholder</w:t>
+      </w:r>
+    </w:p>
+    <w:p>
+      <w:pPr>
+        <w:pStyle w:val="Titolo1"/>
+      </w:pPr>
+      <w:bookmarkStart w:id="12" w:name="_Toc227765436"/>
+      <w:r>
+        <w:t>4. JavaScript</w:t>
+      </w:r>
+      <w:bookmarkEnd w:id="12"/>
+    </w:p>
+    <w:p>
+      <w:pPr>
+        <w:rPr>
+          <w:i/>
+          <w:iCs/>
+        </w:rPr>
+      </w:pPr>
+      <w:r>
+        <w:rPr>
+          <w:i/>
+          <w:iCs/>
+        </w:rPr>
+        <w:t>Placeholder</w:t>
       </w:r>
     </w:p>
     <w:sectPr>
@@ -6767,6 +7899,155 @@
     </w:lvl>
   </w:abstractNum>
   <w:abstractNum w:abstractNumId="18" w15:restartNumberingAfterBreak="0">
+    <w:nsid w:val="2A4E2254"/>
+    <w:multiLevelType w:val="multilevel"/>
+    <w:tmpl w:val="56B0F096"/>
+    <w:lvl w:ilvl="0">
+      <w:start w:val="1"/>
+      <w:numFmt w:val="bullet"/>
+      <w:lvlText w:val=""/>
+      <w:lvlJc w:val="left"/>
+      <w:pPr>
+        <w:tabs>
+          <w:tab w:val="num" w:pos="720"/>
+        </w:tabs>
+        <w:ind w:left="720" w:hanging="360"/>
+      </w:pPr>
+      <w:rPr>
+        <w:rFonts w:ascii="Symbol" w:hAnsi="Symbol" w:hint="default"/>
+        <w:sz w:val="20"/>
+      </w:rPr>
+    </w:lvl>
+    <w:lvl w:ilvl="1" w:tentative="1">
+      <w:start w:val="1"/>
+      <w:numFmt w:val="bullet"/>
+      <w:lvlText w:val="o"/>
+      <w:lvlJc w:val="left"/>
+      <w:pPr>
+        <w:tabs>
+          <w:tab w:val="num" w:pos="1440"/>
+        </w:tabs>
+        <w:ind w:left="1440" w:hanging="360"/>
+      </w:pPr>
+      <w:rPr>
+        <w:rFonts w:ascii="Courier New" w:hAnsi="Courier New" w:hint="default"/>
+        <w:sz w:val="20"/>
+      </w:rPr>
+    </w:lvl>
+    <w:lvl w:ilvl="2" w:tentative="1">
+      <w:start w:val="1"/>
+      <w:numFmt w:val="bullet"/>
+      <w:lvlText w:val=""/>
+      <w:lvlJc w:val="left"/>
+      <w:pPr>
+        <w:tabs>
+          <w:tab w:val="num" w:pos="2160"/>
+        </w:tabs>
+        <w:ind w:left="2160" w:hanging="360"/>
+      </w:pPr>
+      <w:rPr>
+        <w:rFonts w:ascii="Wingdings" w:hAnsi="Wingdings" w:hint="default"/>
+        <w:sz w:val="20"/>
+      </w:rPr>
+    </w:lvl>
+    <w:lvl w:ilvl="3" w:tentative="1">
+      <w:start w:val="1"/>
+      <w:numFmt w:val="bullet"/>
+      <w:lvlText w:val=""/>
+      <w:lvlJc w:val="left"/>
+      <w:pPr>
+        <w:tabs>
+          <w:tab w:val="num" w:pos="2880"/>
+        </w:tabs>
+        <w:ind w:left="2880" w:hanging="360"/>
+      </w:pPr>
+      <w:rPr>
+        <w:rFonts w:ascii="Wingdings" w:hAnsi="Wingdings" w:hint="default"/>
+        <w:sz w:val="20"/>
+      </w:rPr>
+    </w:lvl>
+    <w:lvl w:ilvl="4" w:tentative="1">
+      <w:start w:val="1"/>
+      <w:numFmt w:val="bullet"/>
+      <w:lvlText w:val=""/>
+      <w:lvlJc w:val="left"/>
+      <w:pPr>
+        <w:tabs>
+          <w:tab w:val="num" w:pos="3600"/>
+        </w:tabs>
+        <w:ind w:left="3600" w:hanging="360"/>
+      </w:pPr>
+      <w:rPr>
+        <w:rFonts w:ascii="Wingdings" w:hAnsi="Wingdings" w:hint="default"/>
+        <w:sz w:val="20"/>
+      </w:rPr>
+    </w:lvl>
+    <w:lvl w:ilvl="5" w:tentative="1">
+      <w:start w:val="1"/>
+      <w:numFmt w:val="bullet"/>
+      <w:lvlText w:val=""/>
+      <w:lvlJc w:val="left"/>
+      <w:pPr>
+        <w:tabs>
+          <w:tab w:val="num" w:pos="4320"/>
+        </w:tabs>
+        <w:ind w:left="4320" w:hanging="360"/>
+      </w:pPr>
+      <w:rPr>
+        <w:rFonts w:ascii="Wingdings" w:hAnsi="Wingdings" w:hint="default"/>
+        <w:sz w:val="20"/>
+      </w:rPr>
+    </w:lvl>
+    <w:lvl w:ilvl="6" w:tentative="1">
+      <w:start w:val="1"/>
+      <w:numFmt w:val="bullet"/>
+      <w:lvlText w:val=""/>
+      <w:lvlJc w:val="left"/>
+      <w:pPr>
+        <w:tabs>
+          <w:tab w:val="num" w:pos="5040"/>
+        </w:tabs>
+        <w:ind w:left="5040" w:hanging="360"/>
+      </w:pPr>
+      <w:rPr>
+        <w:rFonts w:ascii="Wingdings" w:hAnsi="Wingdings" w:hint="default"/>
+        <w:sz w:val="20"/>
+      </w:rPr>
+    </w:lvl>
+    <w:lvl w:ilvl="7" w:tentative="1">
+      <w:start w:val="1"/>
+      <w:numFmt w:val="bullet"/>
+      <w:lvlText w:val=""/>
+      <w:lvlJc w:val="left"/>
+      <w:pPr>
+        <w:tabs>
+          <w:tab w:val="num" w:pos="5760"/>
+        </w:tabs>
+        <w:ind w:left="5760" w:hanging="360"/>
+      </w:pPr>
+      <w:rPr>
+        <w:rFonts w:ascii="Wingdings" w:hAnsi="Wingdings" w:hint="default"/>
+        <w:sz w:val="20"/>
+      </w:rPr>
+    </w:lvl>
+    <w:lvl w:ilvl="8" w:tentative="1">
+      <w:start w:val="1"/>
+      <w:numFmt w:val="bullet"/>
+      <w:lvlText w:val=""/>
+      <w:lvlJc w:val="left"/>
+      <w:pPr>
+        <w:tabs>
+          <w:tab w:val="num" w:pos="6480"/>
+        </w:tabs>
+        <w:ind w:left="6480" w:hanging="360"/>
+      </w:pPr>
+      <w:rPr>
+        <w:rFonts w:ascii="Wingdings" w:hAnsi="Wingdings" w:hint="default"/>
+        <w:sz w:val="20"/>
+      </w:rPr>
+    </w:lvl>
+  </w:abstractNum>
+  <w:abstractNum w:abstractNumId="19" w15:restartNumberingAfterBreak="0">
     <w:nsid w:val="2CF146AB"/>
     <w:multiLevelType w:val="hybridMultilevel"/>
     <w:tmpl w:val="83DAE35E"/>
@@ -6879,7 +8160,7 @@
       </w:rPr>
     </w:lvl>
   </w:abstractNum>
-  <w:abstractNum w:abstractNumId="19" w15:restartNumberingAfterBreak="0">
+  <w:abstractNum w:abstractNumId="20" w15:restartNumberingAfterBreak="0">
     <w:nsid w:val="2DD21BCE"/>
     <w:multiLevelType w:val="hybridMultilevel"/>
     <w:tmpl w:val="77D6C402"/>
@@ -6992,7 +8273,7 @@
       </w:rPr>
     </w:lvl>
   </w:abstractNum>
-  <w:abstractNum w:abstractNumId="20" w15:restartNumberingAfterBreak="0">
+  <w:abstractNum w:abstractNumId="21" w15:restartNumberingAfterBreak="0">
     <w:nsid w:val="30E75B17"/>
     <w:multiLevelType w:val="hybridMultilevel"/>
     <w:tmpl w:val="AC1672FC"/>
@@ -7105,7 +8386,120 @@
       </w:rPr>
     </w:lvl>
   </w:abstractNum>
-  <w:abstractNum w:abstractNumId="21" w15:restartNumberingAfterBreak="0">
+  <w:abstractNum w:abstractNumId="22" w15:restartNumberingAfterBreak="0">
+    <w:nsid w:val="36510B13"/>
+    <w:multiLevelType w:val="hybridMultilevel"/>
+    <w:tmpl w:val="30FA5872"/>
+    <w:lvl w:ilvl="0" w:tplc="04100001">
+      <w:start w:val="1"/>
+      <w:numFmt w:val="bullet"/>
+      <w:lvlText w:val=""/>
+      <w:lvlJc w:val="left"/>
+      <w:pPr>
+        <w:ind w:left="720" w:hanging="360"/>
+      </w:pPr>
+      <w:rPr>
+        <w:rFonts w:ascii="Symbol" w:hAnsi="Symbol" w:hint="default"/>
+      </w:rPr>
+    </w:lvl>
+    <w:lvl w:ilvl="1" w:tplc="04100003" w:tentative="1">
+      <w:start w:val="1"/>
+      <w:numFmt w:val="bullet"/>
+      <w:lvlText w:val="o"/>
+      <w:lvlJc w:val="left"/>
+      <w:pPr>
+        <w:ind w:left="1440" w:hanging="360"/>
+      </w:pPr>
+      <w:rPr>
+        <w:rFonts w:ascii="Courier New" w:hAnsi="Courier New" w:cs="Courier New" w:hint="default"/>
+      </w:rPr>
+    </w:lvl>
+    <w:lvl w:ilvl="2" w:tplc="04100005" w:tentative="1">
+      <w:start w:val="1"/>
+      <w:numFmt w:val="bullet"/>
+      <w:lvlText w:val=""/>
+      <w:lvlJc w:val="left"/>
+      <w:pPr>
+        <w:ind w:left="2160" w:hanging="360"/>
+      </w:pPr>
+      <w:rPr>
+        <w:rFonts w:ascii="Wingdings" w:hAnsi="Wingdings" w:hint="default"/>
+      </w:rPr>
+    </w:lvl>
+    <w:lvl w:ilvl="3" w:tplc="04100001" w:tentative="1">
+      <w:start w:val="1"/>
+      <w:numFmt w:val="bullet"/>
+      <w:lvlText w:val=""/>
+      <w:lvlJc w:val="left"/>
+      <w:pPr>
+        <w:ind w:left="2880" w:hanging="360"/>
+      </w:pPr>
+      <w:rPr>
+        <w:rFonts w:ascii="Symbol" w:hAnsi="Symbol" w:hint="default"/>
+      </w:rPr>
+    </w:lvl>
+    <w:lvl w:ilvl="4" w:tplc="04100003" w:tentative="1">
+      <w:start w:val="1"/>
+      <w:numFmt w:val="bullet"/>
+      <w:lvlText w:val="o"/>
+      <w:lvlJc w:val="left"/>
+      <w:pPr>
+        <w:ind w:left="3600" w:hanging="360"/>
+      </w:pPr>
+      <w:rPr>
+        <w:rFonts w:ascii="Courier New" w:hAnsi="Courier New" w:cs="Courier New" w:hint="default"/>
+      </w:rPr>
+    </w:lvl>
+    <w:lvl w:ilvl="5" w:tplc="04100005" w:tentative="1">
+      <w:start w:val="1"/>
+      <w:numFmt w:val="bullet"/>
+      <w:lvlText w:val=""/>
+      <w:lvlJc w:val="left"/>
+      <w:pPr>
+        <w:ind w:left="4320" w:hanging="360"/>
+      </w:pPr>
+      <w:rPr>
+        <w:rFonts w:ascii="Wingdings" w:hAnsi="Wingdings" w:hint="default"/>
+      </w:rPr>
+    </w:lvl>
+    <w:lvl w:ilvl="6" w:tplc="04100001" w:tentative="1">
+      <w:start w:val="1"/>
+      <w:numFmt w:val="bullet"/>
+      <w:lvlText w:val=""/>
+      <w:lvlJc w:val="left"/>
+      <w:pPr>
+        <w:ind w:left="5040" w:hanging="360"/>
+      </w:pPr>
+      <w:rPr>
+        <w:rFonts w:ascii="Symbol" w:hAnsi="Symbol" w:hint="default"/>
+      </w:rPr>
+    </w:lvl>
+    <w:lvl w:ilvl="7" w:tplc="04100003" w:tentative="1">
+      <w:start w:val="1"/>
+      <w:numFmt w:val="bullet"/>
+      <w:lvlText w:val="o"/>
+      <w:lvlJc w:val="left"/>
+      <w:pPr>
+        <w:ind w:left="5760" w:hanging="360"/>
+      </w:pPr>
+      <w:rPr>
+        <w:rFonts w:ascii="Courier New" w:hAnsi="Courier New" w:cs="Courier New" w:hint="default"/>
+      </w:rPr>
+    </w:lvl>
+    <w:lvl w:ilvl="8" w:tplc="04100005" w:tentative="1">
+      <w:start w:val="1"/>
+      <w:numFmt w:val="bullet"/>
+      <w:lvlText w:val=""/>
+      <w:lvlJc w:val="left"/>
+      <w:pPr>
+        <w:ind w:left="6480" w:hanging="360"/>
+      </w:pPr>
+      <w:rPr>
+        <w:rFonts w:ascii="Wingdings" w:hAnsi="Wingdings" w:hint="default"/>
+      </w:rPr>
+    </w:lvl>
+  </w:abstractNum>
+  <w:abstractNum w:abstractNumId="23" w15:restartNumberingAfterBreak="0">
     <w:nsid w:val="38DA53F0"/>
     <w:multiLevelType w:val="hybridMultilevel"/>
     <w:tmpl w:val="BCAA4998"/>
@@ -7218,7 +8612,7 @@
       </w:rPr>
     </w:lvl>
   </w:abstractNum>
-  <w:abstractNum w:abstractNumId="22" w15:restartNumberingAfterBreak="0">
+  <w:abstractNum w:abstractNumId="24" w15:restartNumberingAfterBreak="0">
     <w:nsid w:val="3B4E6364"/>
     <w:multiLevelType w:val="multilevel"/>
     <w:tmpl w:val="A126D6F6"/>
@@ -7367,7 +8761,7 @@
       </w:rPr>
     </w:lvl>
   </w:abstractNum>
-  <w:abstractNum w:abstractNumId="23" w15:restartNumberingAfterBreak="0">
+  <w:abstractNum w:abstractNumId="25" w15:restartNumberingAfterBreak="0">
     <w:nsid w:val="3FF279E7"/>
     <w:multiLevelType w:val="hybridMultilevel"/>
     <w:tmpl w:val="70C00538"/>
@@ -7480,7 +8874,7 @@
       </w:rPr>
     </w:lvl>
   </w:abstractNum>
-  <w:abstractNum w:abstractNumId="24" w15:restartNumberingAfterBreak="0">
+  <w:abstractNum w:abstractNumId="26" w15:restartNumberingAfterBreak="0">
     <w:nsid w:val="40F066FB"/>
     <w:multiLevelType w:val="hybridMultilevel"/>
     <w:tmpl w:val="103296A2"/>
@@ -7593,7 +8987,7 @@
       </w:rPr>
     </w:lvl>
   </w:abstractNum>
-  <w:abstractNum w:abstractNumId="25" w15:restartNumberingAfterBreak="0">
+  <w:abstractNum w:abstractNumId="27" w15:restartNumberingAfterBreak="0">
     <w:nsid w:val="42A27F2A"/>
     <w:multiLevelType w:val="hybridMultilevel"/>
     <w:tmpl w:val="852C56CA"/>
@@ -7706,7 +9100,7 @@
       </w:rPr>
     </w:lvl>
   </w:abstractNum>
-  <w:abstractNum w:abstractNumId="26" w15:restartNumberingAfterBreak="0">
+  <w:abstractNum w:abstractNumId="28" w15:restartNumberingAfterBreak="0">
     <w:nsid w:val="4F122034"/>
     <w:multiLevelType w:val="hybridMultilevel"/>
     <w:tmpl w:val="3F424C58"/>
@@ -7819,7 +9213,7 @@
       </w:rPr>
     </w:lvl>
   </w:abstractNum>
-  <w:abstractNum w:abstractNumId="27" w15:restartNumberingAfterBreak="0">
+  <w:abstractNum w:abstractNumId="29" w15:restartNumberingAfterBreak="0">
     <w:nsid w:val="517C5855"/>
     <w:multiLevelType w:val="hybridMultilevel"/>
     <w:tmpl w:val="DC985CAA"/>
@@ -7932,7 +9326,7 @@
       </w:rPr>
     </w:lvl>
   </w:abstractNum>
-  <w:abstractNum w:abstractNumId="28" w15:restartNumberingAfterBreak="0">
+  <w:abstractNum w:abstractNumId="30" w15:restartNumberingAfterBreak="0">
     <w:nsid w:val="51CF2E50"/>
     <w:multiLevelType w:val="hybridMultilevel"/>
     <w:tmpl w:val="8F88B684"/>
@@ -8045,7 +9439,7 @@
       </w:rPr>
     </w:lvl>
   </w:abstractNum>
-  <w:abstractNum w:abstractNumId="29" w15:restartNumberingAfterBreak="0">
+  <w:abstractNum w:abstractNumId="31" w15:restartNumberingAfterBreak="0">
     <w:nsid w:val="51F266EF"/>
     <w:multiLevelType w:val="multilevel"/>
     <w:tmpl w:val="35AC929A"/>
@@ -8194,7 +9588,7 @@
       </w:rPr>
     </w:lvl>
   </w:abstractNum>
-  <w:abstractNum w:abstractNumId="30" w15:restartNumberingAfterBreak="0">
+  <w:abstractNum w:abstractNumId="32" w15:restartNumberingAfterBreak="0">
     <w:nsid w:val="55206F60"/>
     <w:multiLevelType w:val="multilevel"/>
     <w:tmpl w:val="305228DA"/>
@@ -8343,7 +9737,7 @@
       </w:rPr>
     </w:lvl>
   </w:abstractNum>
-  <w:abstractNum w:abstractNumId="31" w15:restartNumberingAfterBreak="0">
+  <w:abstractNum w:abstractNumId="33" w15:restartNumberingAfterBreak="0">
     <w:nsid w:val="55D76176"/>
     <w:multiLevelType w:val="hybridMultilevel"/>
     <w:tmpl w:val="535A2316"/>
@@ -8456,7 +9850,156 @@
       </w:rPr>
     </w:lvl>
   </w:abstractNum>
-  <w:abstractNum w:abstractNumId="32" w15:restartNumberingAfterBreak="0">
+  <w:abstractNum w:abstractNumId="34" w15:restartNumberingAfterBreak="0">
+    <w:nsid w:val="55EF0445"/>
+    <w:multiLevelType w:val="multilevel"/>
+    <w:tmpl w:val="00B8D00C"/>
+    <w:lvl w:ilvl="0">
+      <w:start w:val="1"/>
+      <w:numFmt w:val="bullet"/>
+      <w:lvlText w:val=""/>
+      <w:lvlJc w:val="left"/>
+      <w:pPr>
+        <w:tabs>
+          <w:tab w:val="num" w:pos="720"/>
+        </w:tabs>
+        <w:ind w:left="720" w:hanging="360"/>
+      </w:pPr>
+      <w:rPr>
+        <w:rFonts w:ascii="Symbol" w:hAnsi="Symbol" w:hint="default"/>
+        <w:sz w:val="20"/>
+      </w:rPr>
+    </w:lvl>
+    <w:lvl w:ilvl="1">
+      <w:start w:val="1"/>
+      <w:numFmt w:val="bullet"/>
+      <w:lvlText w:val="o"/>
+      <w:lvlJc w:val="left"/>
+      <w:pPr>
+        <w:tabs>
+          <w:tab w:val="num" w:pos="1440"/>
+        </w:tabs>
+        <w:ind w:left="1440" w:hanging="360"/>
+      </w:pPr>
+      <w:rPr>
+        <w:rFonts w:ascii="Courier New" w:hAnsi="Courier New" w:hint="default"/>
+        <w:sz w:val="20"/>
+      </w:rPr>
+    </w:lvl>
+    <w:lvl w:ilvl="2" w:tentative="1">
+      <w:start w:val="1"/>
+      <w:numFmt w:val="bullet"/>
+      <w:lvlText w:val=""/>
+      <w:lvlJc w:val="left"/>
+      <w:pPr>
+        <w:tabs>
+          <w:tab w:val="num" w:pos="2160"/>
+        </w:tabs>
+        <w:ind w:left="2160" w:hanging="360"/>
+      </w:pPr>
+      <w:rPr>
+        <w:rFonts w:ascii="Wingdings" w:hAnsi="Wingdings" w:hint="default"/>
+        <w:sz w:val="20"/>
+      </w:rPr>
+    </w:lvl>
+    <w:lvl w:ilvl="3" w:tentative="1">
+      <w:start w:val="1"/>
+      <w:numFmt w:val="bullet"/>
+      <w:lvlText w:val=""/>
+      <w:lvlJc w:val="left"/>
+      <w:pPr>
+        <w:tabs>
+          <w:tab w:val="num" w:pos="2880"/>
+        </w:tabs>
+        <w:ind w:left="2880" w:hanging="360"/>
+      </w:pPr>
+      <w:rPr>
+        <w:rFonts w:ascii="Wingdings" w:hAnsi="Wingdings" w:hint="default"/>
+        <w:sz w:val="20"/>
+      </w:rPr>
+    </w:lvl>
+    <w:lvl w:ilvl="4" w:tentative="1">
+      <w:start w:val="1"/>
+      <w:numFmt w:val="bullet"/>
+      <w:lvlText w:val=""/>
+      <w:lvlJc w:val="left"/>
+      <w:pPr>
+        <w:tabs>
+          <w:tab w:val="num" w:pos="3600"/>
+        </w:tabs>
+        <w:ind w:left="3600" w:hanging="360"/>
+      </w:pPr>
+      <w:rPr>
+        <w:rFonts w:ascii="Wingdings" w:hAnsi="Wingdings" w:hint="default"/>
+        <w:sz w:val="20"/>
+      </w:rPr>
+    </w:lvl>
+    <w:lvl w:ilvl="5" w:tentative="1">
+      <w:start w:val="1"/>
+      <w:numFmt w:val="bullet"/>
+      <w:lvlText w:val=""/>
+      <w:lvlJc w:val="left"/>
+      <w:pPr>
+        <w:tabs>
+          <w:tab w:val="num" w:pos="4320"/>
+        </w:tabs>
+        <w:ind w:left="4320" w:hanging="360"/>
+      </w:pPr>
+      <w:rPr>
+        <w:rFonts w:ascii="Wingdings" w:hAnsi="Wingdings" w:hint="default"/>
+        <w:sz w:val="20"/>
+      </w:rPr>
+    </w:lvl>
+    <w:lvl w:ilvl="6" w:tentative="1">
+      <w:start w:val="1"/>
+      <w:numFmt w:val="bullet"/>
+      <w:lvlText w:val=""/>
+      <w:lvlJc w:val="left"/>
+      <w:pPr>
+        <w:tabs>
+          <w:tab w:val="num" w:pos="5040"/>
+        </w:tabs>
+        <w:ind w:left="5040" w:hanging="360"/>
+      </w:pPr>
+      <w:rPr>
+        <w:rFonts w:ascii="Wingdings" w:hAnsi="Wingdings" w:hint="default"/>
+        <w:sz w:val="20"/>
+      </w:rPr>
+    </w:lvl>
+    <w:lvl w:ilvl="7" w:tentative="1">
+      <w:start w:val="1"/>
+      <w:numFmt w:val="bullet"/>
+      <w:lvlText w:val=""/>
+      <w:lvlJc w:val="left"/>
+      <w:pPr>
+        <w:tabs>
+          <w:tab w:val="num" w:pos="5760"/>
+        </w:tabs>
+        <w:ind w:left="5760" w:hanging="360"/>
+      </w:pPr>
+      <w:rPr>
+        <w:rFonts w:ascii="Wingdings" w:hAnsi="Wingdings" w:hint="default"/>
+        <w:sz w:val="20"/>
+      </w:rPr>
+    </w:lvl>
+    <w:lvl w:ilvl="8" w:tentative="1">
+      <w:start w:val="1"/>
+      <w:numFmt w:val="bullet"/>
+      <w:lvlText w:val=""/>
+      <w:lvlJc w:val="left"/>
+      <w:pPr>
+        <w:tabs>
+          <w:tab w:val="num" w:pos="6480"/>
+        </w:tabs>
+        <w:ind w:left="6480" w:hanging="360"/>
+      </w:pPr>
+      <w:rPr>
+        <w:rFonts w:ascii="Wingdings" w:hAnsi="Wingdings" w:hint="default"/>
+        <w:sz w:val="20"/>
+      </w:rPr>
+    </w:lvl>
+  </w:abstractNum>
+  <w:abstractNum w:abstractNumId="35" w15:restartNumberingAfterBreak="0">
     <w:nsid w:val="57AF2A6A"/>
     <w:multiLevelType w:val="hybridMultilevel"/>
     <w:tmpl w:val="BBB49CB6"/>
@@ -8569,7 +10112,7 @@
       </w:rPr>
     </w:lvl>
   </w:abstractNum>
-  <w:abstractNum w:abstractNumId="33" w15:restartNumberingAfterBreak="0">
+  <w:abstractNum w:abstractNumId="36" w15:restartNumberingAfterBreak="0">
     <w:nsid w:val="5C7B28AE"/>
     <w:multiLevelType w:val="hybridMultilevel"/>
     <w:tmpl w:val="943422C4"/>
@@ -8682,7 +10225,7 @@
       </w:rPr>
     </w:lvl>
   </w:abstractNum>
-  <w:abstractNum w:abstractNumId="34" w15:restartNumberingAfterBreak="0">
+  <w:abstractNum w:abstractNumId="37" w15:restartNumberingAfterBreak="0">
     <w:nsid w:val="5C9F785D"/>
     <w:multiLevelType w:val="multilevel"/>
     <w:tmpl w:val="B6823C42"/>
@@ -8831,7 +10374,7 @@
       </w:rPr>
     </w:lvl>
   </w:abstractNum>
-  <w:abstractNum w:abstractNumId="35" w15:restartNumberingAfterBreak="0">
+  <w:abstractNum w:abstractNumId="38" w15:restartNumberingAfterBreak="0">
     <w:nsid w:val="5EAD6D0A"/>
     <w:multiLevelType w:val="hybridMultilevel"/>
     <w:tmpl w:val="26E458FE"/>
@@ -8944,7 +10487,7 @@
       </w:rPr>
     </w:lvl>
   </w:abstractNum>
-  <w:abstractNum w:abstractNumId="36" w15:restartNumberingAfterBreak="0">
+  <w:abstractNum w:abstractNumId="39" w15:restartNumberingAfterBreak="0">
     <w:nsid w:val="644E447D"/>
     <w:multiLevelType w:val="hybridMultilevel"/>
     <w:tmpl w:val="89D2E0F6"/>
@@ -9057,7 +10600,7 @@
       </w:rPr>
     </w:lvl>
   </w:abstractNum>
-  <w:abstractNum w:abstractNumId="37" w15:restartNumberingAfterBreak="0">
+  <w:abstractNum w:abstractNumId="40" w15:restartNumberingAfterBreak="0">
     <w:nsid w:val="68793F9F"/>
     <w:multiLevelType w:val="multilevel"/>
     <w:tmpl w:val="D80A9724"/>
@@ -9206,7 +10749,7 @@
       </w:rPr>
     </w:lvl>
   </w:abstractNum>
-  <w:abstractNum w:abstractNumId="38" w15:restartNumberingAfterBreak="0">
+  <w:abstractNum w:abstractNumId="41" w15:restartNumberingAfterBreak="0">
     <w:nsid w:val="70D01D11"/>
     <w:multiLevelType w:val="hybridMultilevel"/>
     <w:tmpl w:val="6C80F5BA"/>
@@ -9319,7 +10862,7 @@
       </w:rPr>
     </w:lvl>
   </w:abstractNum>
-  <w:abstractNum w:abstractNumId="39" w15:restartNumberingAfterBreak="0">
+  <w:abstractNum w:abstractNumId="42" w15:restartNumberingAfterBreak="0">
     <w:nsid w:val="718A175F"/>
     <w:multiLevelType w:val="hybridMultilevel"/>
     <w:tmpl w:val="8A82323A"/>
@@ -9432,7 +10975,7 @@
       </w:rPr>
     </w:lvl>
   </w:abstractNum>
-  <w:abstractNum w:abstractNumId="40" w15:restartNumberingAfterBreak="0">
+  <w:abstractNum w:abstractNumId="43" w15:restartNumberingAfterBreak="0">
     <w:nsid w:val="73393167"/>
     <w:multiLevelType w:val="hybridMultilevel"/>
     <w:tmpl w:val="16AAC9CE"/>
@@ -9545,7 +11088,7 @@
       </w:rPr>
     </w:lvl>
   </w:abstractNum>
-  <w:abstractNum w:abstractNumId="41" w15:restartNumberingAfterBreak="0">
+  <w:abstractNum w:abstractNumId="44" w15:restartNumberingAfterBreak="0">
     <w:nsid w:val="747F7687"/>
     <w:multiLevelType w:val="hybridMultilevel"/>
     <w:tmpl w:val="0C5EC1C2"/>
@@ -9659,7 +11202,7 @@
       </w:rPr>
     </w:lvl>
   </w:abstractNum>
-  <w:abstractNum w:abstractNumId="42" w15:restartNumberingAfterBreak="0">
+  <w:abstractNum w:abstractNumId="45" w15:restartNumberingAfterBreak="0">
     <w:nsid w:val="766563A5"/>
     <w:multiLevelType w:val="multilevel"/>
     <w:tmpl w:val="1AE89B50"/>
@@ -9808,7 +11351,7 @@
       </w:rPr>
     </w:lvl>
   </w:abstractNum>
-  <w:abstractNum w:abstractNumId="43" w15:restartNumberingAfterBreak="0">
+  <w:abstractNum w:abstractNumId="46" w15:restartNumberingAfterBreak="0">
     <w:nsid w:val="768D59D4"/>
     <w:multiLevelType w:val="multilevel"/>
     <w:tmpl w:val="B8ECEA2C"/>
@@ -9957,7 +11500,7 @@
       </w:rPr>
     </w:lvl>
   </w:abstractNum>
-  <w:abstractNum w:abstractNumId="44" w15:restartNumberingAfterBreak="0">
+  <w:abstractNum w:abstractNumId="47" w15:restartNumberingAfterBreak="0">
     <w:nsid w:val="77B24451"/>
     <w:multiLevelType w:val="hybridMultilevel"/>
     <w:tmpl w:val="20027024"/>
@@ -10074,25 +11617,25 @@
     <w:abstractNumId w:val="4"/>
   </w:num>
   <w:num w:numId="2" w16cid:durableId="1093284848">
-    <w:abstractNumId w:val="21"/>
+    <w:abstractNumId w:val="23"/>
   </w:num>
   <w:num w:numId="3" w16cid:durableId="1272468756">
     <w:abstractNumId w:val="14"/>
   </w:num>
   <w:num w:numId="4" w16cid:durableId="1440831352">
-    <w:abstractNumId w:val="36"/>
+    <w:abstractNumId w:val="39"/>
   </w:num>
   <w:num w:numId="5" w16cid:durableId="2021854743">
-    <w:abstractNumId w:val="18"/>
+    <w:abstractNumId w:val="19"/>
   </w:num>
   <w:num w:numId="6" w16cid:durableId="1476530431">
-    <w:abstractNumId w:val="24"/>
+    <w:abstractNumId w:val="26"/>
   </w:num>
   <w:num w:numId="7" w16cid:durableId="93327648">
     <w:abstractNumId w:val="12"/>
   </w:num>
   <w:num w:numId="8" w16cid:durableId="626473993">
-    <w:abstractNumId w:val="32"/>
+    <w:abstractNumId w:val="35"/>
   </w:num>
   <w:num w:numId="9" w16cid:durableId="905724271">
     <w:abstractNumId w:val="3"/>
@@ -10104,34 +11647,34 @@
     <w:abstractNumId w:val="10"/>
   </w:num>
   <w:num w:numId="12" w16cid:durableId="273639122">
-    <w:abstractNumId w:val="25"/>
+    <w:abstractNumId w:val="27"/>
   </w:num>
   <w:num w:numId="13" w16cid:durableId="432434078">
     <w:abstractNumId w:val="11"/>
   </w:num>
   <w:num w:numId="14" w16cid:durableId="1418676717">
-    <w:abstractNumId w:val="37"/>
+    <w:abstractNumId w:val="40"/>
   </w:num>
   <w:num w:numId="15" w16cid:durableId="1205364778">
-    <w:abstractNumId w:val="33"/>
+    <w:abstractNumId w:val="36"/>
   </w:num>
   <w:num w:numId="16" w16cid:durableId="764423634">
     <w:abstractNumId w:val="0"/>
   </w:num>
   <w:num w:numId="17" w16cid:durableId="1418135551">
-    <w:abstractNumId w:val="30"/>
+    <w:abstractNumId w:val="32"/>
   </w:num>
   <w:num w:numId="18" w16cid:durableId="1624459743">
-    <w:abstractNumId w:val="42"/>
+    <w:abstractNumId w:val="45"/>
   </w:num>
   <w:num w:numId="19" w16cid:durableId="305010161">
-    <w:abstractNumId w:val="22"/>
+    <w:abstractNumId w:val="24"/>
   </w:num>
   <w:num w:numId="20" w16cid:durableId="471992473">
-    <w:abstractNumId w:val="43"/>
+    <w:abstractNumId w:val="46"/>
   </w:num>
   <w:num w:numId="21" w16cid:durableId="1519660479">
-    <w:abstractNumId w:val="23"/>
+    <w:abstractNumId w:val="25"/>
   </w:num>
   <w:num w:numId="22" w16cid:durableId="1245144216">
     <w:abstractNumId w:val="8"/>
@@ -10143,10 +11686,10 @@
     <w:abstractNumId w:val="17"/>
   </w:num>
   <w:num w:numId="25" w16cid:durableId="2011787519">
-    <w:abstractNumId w:val="20"/>
+    <w:abstractNumId w:val="21"/>
   </w:num>
   <w:num w:numId="26" w16cid:durableId="1980957081">
-    <w:abstractNumId w:val="44"/>
+    <w:abstractNumId w:val="47"/>
   </w:num>
   <w:num w:numId="27" w16cid:durableId="47925916">
     <w:abstractNumId w:val="7"/>
@@ -10155,46 +11698,46 @@
     <w:abstractNumId w:val="9"/>
   </w:num>
   <w:num w:numId="29" w16cid:durableId="526871051">
-    <w:abstractNumId w:val="40"/>
+    <w:abstractNumId w:val="43"/>
   </w:num>
   <w:num w:numId="30" w16cid:durableId="1087924038">
     <w:abstractNumId w:val="1"/>
   </w:num>
   <w:num w:numId="31" w16cid:durableId="258173303">
-    <w:abstractNumId w:val="35"/>
+    <w:abstractNumId w:val="38"/>
   </w:num>
   <w:num w:numId="32" w16cid:durableId="1709649222">
-    <w:abstractNumId w:val="28"/>
+    <w:abstractNumId w:val="30"/>
   </w:num>
   <w:num w:numId="33" w16cid:durableId="1824392770">
     <w:abstractNumId w:val="16"/>
   </w:num>
   <w:num w:numId="34" w16cid:durableId="431317971">
-    <w:abstractNumId w:val="38"/>
+    <w:abstractNumId w:val="41"/>
   </w:num>
   <w:num w:numId="35" w16cid:durableId="1720474588">
-    <w:abstractNumId w:val="27"/>
+    <w:abstractNumId w:val="29"/>
   </w:num>
   <w:num w:numId="36" w16cid:durableId="2100176802">
-    <w:abstractNumId w:val="19"/>
+    <w:abstractNumId w:val="20"/>
   </w:num>
   <w:num w:numId="37" w16cid:durableId="2079936304">
     <w:abstractNumId w:val="15"/>
   </w:num>
   <w:num w:numId="38" w16cid:durableId="897401265">
-    <w:abstractNumId w:val="39"/>
+    <w:abstractNumId w:val="42"/>
   </w:num>
   <w:num w:numId="39" w16cid:durableId="655687708">
-    <w:abstractNumId w:val="26"/>
+    <w:abstractNumId w:val="28"/>
   </w:num>
   <w:num w:numId="40" w16cid:durableId="1568177559">
+    <w:abstractNumId w:val="33"/>
+  </w:num>
+  <w:num w:numId="41" w16cid:durableId="1108431148">
     <w:abstractNumId w:val="31"/>
   </w:num>
-  <w:num w:numId="41" w16cid:durableId="1108431148">
-    <w:abstractNumId w:val="29"/>
-  </w:num>
   <w:num w:numId="42" w16cid:durableId="257255711">
-    <w:abstractNumId w:val="34"/>
+    <w:abstractNumId w:val="37"/>
   </w:num>
   <w:num w:numId="43" w16cid:durableId="247276982">
     <w:abstractNumId w:val="13"/>
@@ -10203,7 +11746,16 @@
     <w:abstractNumId w:val="2"/>
   </w:num>
   <w:num w:numId="45" w16cid:durableId="358703672">
-    <w:abstractNumId w:val="41"/>
+    <w:abstractNumId w:val="44"/>
+  </w:num>
+  <w:num w:numId="46" w16cid:durableId="1770152166">
+    <w:abstractNumId w:val="34"/>
+  </w:num>
+  <w:num w:numId="47" w16cid:durableId="942373732">
+    <w:abstractNumId w:val="18"/>
+  </w:num>
+  <w:num w:numId="48" w16cid:durableId="53358846">
+    <w:abstractNumId w:val="22"/>
   </w:num>
   <w:numIdMacAtCleanup w:val="3"/>
 </w:numbering>

</xml_diff>